<commit_message>
Fix blank table header rows in syllabi
Item/Details header row was empty in several tables in both
CHEM121 and CHEM131 content; regenerated site content and
downloadable docx/pdf syllabi to match.

Co-Authored-By: Claude Sonnet 5 <noreply@anthropic.com>
</commit_message>
<xml_diff>
--- a/downloads/CHEM121_Syllabus_Fall2026.docx
+++ b/downloads/CHEM121_Syllabus_Fall2026.docx
@@ -69,321 +69,6 @@
       </w:pPr>
       <w:r>
         <w:t xml:space="preserve">If you read one part of this syllabus, read this one.</w:t>
-      </w:r>
-    </w:p>
-    <w:tbl>
-      <w:tblPr>
-        <w:tblStyle w:val="Table"/>
-        <w:tblW w:type="pct" w:w="5000"/>
-        <w:tblLook w:firstRow="0" w:lastRow="0" w:firstColumn="0" w:lastColumn="0" w:noHBand="0" w:noVBand="0" w:val="0000"/>
-        <w:jc w:val="start"/>
-      </w:tblPr>
-      <w:tblGrid>
-        <w:gridCol w:w="3960"/>
-        <w:gridCol w:w="3960"/>
-      </w:tblGrid>
-      <w:tr>
-        <w:tc>
-          <w:tcPr/>
-          <w:p>
-            <w:pPr>
-              <w:pStyle w:val="Compact"/>
-              <w:jc w:val="left"/>
-            </w:pPr>
-            <w:r>
-              <w:rPr>
-                <w:bCs/>
-                <w:b/>
-              </w:rPr>
-              <w:t xml:space="preserve">What it costs</w:t>
-            </w:r>
-          </w:p>
-        </w:tc>
-        <w:tc>
-          <w:tcPr/>
-          <w:p>
-            <w:pPr>
-              <w:pStyle w:val="Compact"/>
-              <w:jc w:val="left"/>
-            </w:pPr>
-            <w:r>
-              <w:rPr>
-                <w:bCs/>
-                <w:b/>
-              </w:rPr>
-              <w:t xml:space="preserve">Chemfolio</w:t>
-            </w:r>
-            <w:r>
-              <w:t xml:space="preserve"> </w:t>
-            </w:r>
-            <w:r>
-              <w:rPr>
-                <w:iCs/>
-                <w:i/>
-              </w:rPr>
-              <w:t xml:space="preserve">[price TBD]</w:t>
-            </w:r>
-            <w:r>
-              <w:t xml:space="preserve"> </w:t>
-            </w:r>
-            <w:r>
-              <w:t xml:space="preserve">+</w:t>
-            </w:r>
-            <w:r>
-              <w:t xml:space="preserve"> </w:t>
-            </w:r>
-            <w:r>
-              <w:rPr>
-                <w:bCs/>
-                <w:b/>
-              </w:rPr>
-              <w:t xml:space="preserve">CHEM&amp;121 Lab Manual</w:t>
-            </w:r>
-            <w:r>
-              <w:t xml:space="preserve"> </w:t>
-            </w:r>
-            <w:r>
-              <w:rPr>
-                <w:iCs/>
-                <w:i/>
-              </w:rPr>
-              <w:t xml:space="preserve">[price TBD]</w:t>
-            </w:r>
-            <w:r>
-              <w:t xml:space="preserve"> </w:t>
-            </w:r>
-            <w:r>
-              <w:t xml:space="preserve">(Clark Bookstore) + ALEKS (paid through your course registration).</w:t>
-            </w:r>
-          </w:p>
-        </w:tc>
-      </w:tr>
-      <w:tr>
-        <w:tc>
-          <w:tcPr/>
-          <w:p>
-            <w:pPr>
-              <w:pStyle w:val="Compact"/>
-              <w:jc w:val="left"/>
-            </w:pPr>
-            <w:r>
-              <w:rPr>
-                <w:bCs/>
-                <w:b/>
-              </w:rPr>
-              <w:t xml:space="preserve">When things are due</w:t>
-            </w:r>
-          </w:p>
-        </w:tc>
-        <w:tc>
-          <w:tcPr/>
-          <w:p>
-            <w:pPr>
-              <w:pStyle w:val="Compact"/>
-              <w:jc w:val="left"/>
-            </w:pPr>
-            <w:r>
-              <w:t xml:space="preserve">Tuesday through Sunday each carry something — see Weekly Flow below for the exact rhythm. Once you learn it, it repeats every module.</w:t>
-            </w:r>
-          </w:p>
-        </w:tc>
-      </w:tr>
-      <w:tr>
-        <w:tc>
-          <w:tcPr/>
-          <w:p>
-            <w:pPr>
-              <w:pStyle w:val="Compact"/>
-              <w:jc w:val="left"/>
-            </w:pPr>
-            <w:r>
-              <w:rPr>
-                <w:bCs/>
-                <w:b/>
-              </w:rPr>
-              <w:t xml:space="preserve">Time to budget</w:t>
-            </w:r>
-          </w:p>
-        </w:tc>
-        <w:tc>
-          <w:tcPr/>
-          <w:p>
-            <w:pPr>
-              <w:pStyle w:val="Compact"/>
-              <w:jc w:val="left"/>
-            </w:pPr>
-            <w:r>
-              <w:t xml:space="preserve">About 10–12 hours a week — most of it on Canvas, plus your 4-hour on-campus lab.</w:t>
-            </w:r>
-          </w:p>
-        </w:tc>
-      </w:tr>
-      <w:tr>
-        <w:tc>
-          <w:tcPr/>
-          <w:p>
-            <w:pPr>
-              <w:pStyle w:val="Compact"/>
-              <w:jc w:val="left"/>
-            </w:pPr>
-            <w:r>
-              <w:rPr>
-                <w:bCs/>
-                <w:b/>
-              </w:rPr>
-              <w:t xml:space="preserve">How to reach me</w:t>
-            </w:r>
-          </w:p>
-        </w:tc>
-        <w:tc>
-          <w:tcPr/>
-          <w:p>
-            <w:pPr>
-              <w:pStyle w:val="Compact"/>
-              <w:jc w:val="left"/>
-            </w:pPr>
-            <w:r>
-              <w:t xml:space="preserve">Canvas Inbox only — I don’t use email during the term. I reply within 24 hours on weekdays.</w:t>
-            </w:r>
-          </w:p>
-        </w:tc>
-      </w:tr>
-      <w:tr>
-        <w:tc>
-          <w:tcPr/>
-          <w:p>
-            <w:pPr>
-              <w:pStyle w:val="Compact"/>
-              <w:jc w:val="left"/>
-            </w:pPr>
-            <w:r>
-              <w:rPr>
-                <w:bCs/>
-                <w:b/>
-              </w:rPr>
-              <w:t xml:space="preserve">The two big ones</w:t>
-            </w:r>
-          </w:p>
-        </w:tc>
-        <w:tc>
-          <w:tcPr/>
-          <w:p>
-            <w:pPr>
-              <w:pStyle w:val="Compact"/>
-              <w:jc w:val="left"/>
-            </w:pPr>
-            <w:r>
-              <w:t xml:space="preserve">Weekly lab attendance (required every week, no exceptions) and the Final TYC (Teach Your Community) Project — 10% of your grade, in place of a final exam.</w:t>
-            </w:r>
-          </w:p>
-        </w:tc>
-      </w:tr>
-      <w:tr>
-        <w:tc>
-          <w:tcPr/>
-          <w:p>
-            <w:pPr>
-              <w:pStyle w:val="Compact"/>
-              <w:jc w:val="left"/>
-            </w:pPr>
-            <w:r>
-              <w:rPr>
-                <w:bCs/>
-                <w:b/>
-              </w:rPr>
-              <w:t xml:space="preserve">The AI rule</w:t>
-            </w:r>
-          </w:p>
-        </w:tc>
-        <w:tc>
-          <w:tcPr/>
-          <w:p>
-            <w:pPr>
-              <w:pStyle w:val="Compact"/>
-              <w:jc w:val="left"/>
-            </w:pPr>
-            <w:r>
-              <w:t xml:space="preserve">AI can support your learning — don’t let it do the learning for you. See the AI Agreement below for exactly where the lines are.</w:t>
-            </w:r>
-          </w:p>
-        </w:tc>
-      </w:tr>
-      <w:tr>
-        <w:tc>
-          <w:tcPr/>
-          <w:p>
-            <w:pPr>
-              <w:pStyle w:val="Compact"/>
-              <w:jc w:val="left"/>
-            </w:pPr>
-            <w:r>
-              <w:rPr>
-                <w:bCs/>
-                <w:b/>
-              </w:rPr>
-              <w:t xml:space="preserve">If you fall behind</w:t>
-            </w:r>
-          </w:p>
-        </w:tc>
-        <w:tc>
-          <w:tcPr/>
-          <w:p>
-            <w:pPr>
-              <w:pStyle w:val="Compact"/>
-              <w:jc w:val="left"/>
-            </w:pPr>
-            <w:r>
-              <w:t xml:space="preserve">No explanation needed. Late work loses 1% per hour after the due date, down to zero after about 5 days — then it can still be submitted for zero credit. See Late Work below for the full policy.</w:t>
-            </w:r>
-          </w:p>
-        </w:tc>
-      </w:tr>
-    </w:tbl>
-    <w:p>
-      <w:pPr>
-        <w:pStyle w:val="BodyText"/>
-      </w:pPr>
-      <w:r>
-        <w:rPr>
-          <w:bCs/>
-          <w:b/>
-        </w:rPr>
-        <w:t xml:space="preserve">Your grade in one line:</w:t>
-      </w:r>
-      <w:r>
-        <w:t xml:space="preserve"> </w:t>
-      </w:r>
-      <w:r>
-        <w:t xml:space="preserve">Discussions 30% · Labs 30% · Quizzes 20% · ALEKS Homework 10% · Final TYC Project 10%.</w:t>
-      </w:r>
-    </w:p>
-    <w:p>
-      <w:pPr>
-        <w:pStyle w:val="BodyText"/>
-      </w:pPr>
-      <w:r>
-        <w:rPr>
-          <w:iCs/>
-          <w:i/>
-        </w:rPr>
-        <w:t xml:space="preserve">(Working draft — the teaching team will confirm final category weights before the term begins.)</w:t>
-      </w:r>
-    </w:p>
-    <w:bookmarkStart w:id="21" w:name="course-terms-youll-see"/>
-    <w:p>
-      <w:pPr>
-        <w:pStyle w:val="Heading2"/>
-      </w:pPr>
-      <w:r>
-        <w:t xml:space="preserve">Course Terms You’ll See</w:t>
-      </w:r>
-    </w:p>
-    <w:p>
-      <w:pPr>
-        <w:pStyle w:val="FirstParagraph"/>
-      </w:pPr>
-      <w:r>
-        <w:t xml:space="preserve">A few abbreviations come up constantly in this course. Here’s what they mean, so you’re not guessing the first time you see them:</w:t>
       </w:r>
     </w:p>
     <w:tbl>
@@ -409,310 +94,23 @@
               <w:jc w:val="left"/>
             </w:pPr>
             <w:r>
-              <w:t xml:space="preserve">Term</w:t>
-            </w:r>
-          </w:p>
-        </w:tc>
-        <w:tc>
-          <w:tcPr/>
-          <w:p>
-            <w:pPr>
-              <w:pStyle w:val="Compact"/>
-              <w:jc w:val="left"/>
-            </w:pPr>
-            <w:r>
-              <w:t xml:space="preserve">What it means</w:t>
-            </w:r>
-          </w:p>
-        </w:tc>
-      </w:tr>
-      <w:tr>
-        <w:tc>
-          <w:tcPr/>
-          <w:p>
-            <w:pPr>
-              <w:pStyle w:val="Compact"/>
-              <w:jc w:val="left"/>
-            </w:pPr>
-            <w:r>
-              <w:t xml:space="preserve">3-2-1</w:t>
-            </w:r>
-          </w:p>
-        </w:tc>
-        <w:tc>
-          <w:tcPr/>
-          <w:p>
-            <w:pPr>
-              <w:pStyle w:val="Compact"/>
-              <w:jc w:val="left"/>
-            </w:pPr>
-            <w:r>
-              <w:t xml:space="preserve">Your weekly Team Discussion format — named for its posting structure (three problem areas, two areas of interest, one insight from the video key).</w:t>
-            </w:r>
-          </w:p>
-        </w:tc>
-      </w:tr>
-      <w:tr>
-        <w:tc>
-          <w:tcPr/>
-          <w:p>
-            <w:pPr>
-              <w:pStyle w:val="Compact"/>
-              <w:jc w:val="left"/>
-            </w:pPr>
-            <w:r>
-              <w:t xml:space="preserve">OOL</w:t>
-            </w:r>
-          </w:p>
-        </w:tc>
-        <w:tc>
-          <w:tcPr/>
-          <w:p>
-            <w:pPr>
-              <w:pStyle w:val="Compact"/>
-              <w:jc w:val="left"/>
-            </w:pPr>
-            <w:r>
-              <w:t xml:space="preserve">Outside Of Lecture — a separate weekly class discussion, not the 3-2-1.</w:t>
-            </w:r>
-          </w:p>
-        </w:tc>
-      </w:tr>
-      <w:tr>
-        <w:tc>
-          <w:tcPr/>
-          <w:p>
-            <w:pPr>
-              <w:pStyle w:val="Compact"/>
-              <w:jc w:val="left"/>
-            </w:pPr>
-            <w:r>
-              <w:t xml:space="preserve">TYC</w:t>
-            </w:r>
-          </w:p>
-        </w:tc>
-        <w:tc>
-          <w:tcPr/>
-          <w:p>
-            <w:pPr>
-              <w:pStyle w:val="Compact"/>
-              <w:jc w:val="left"/>
-            </w:pPr>
-            <w:r>
-              <w:t xml:space="preserve">Teach Your Community — your Final Project, replacing a final exam.</w:t>
-            </w:r>
-          </w:p>
-        </w:tc>
-      </w:tr>
-      <w:tr>
-        <w:tc>
-          <w:tcPr/>
-          <w:p>
-            <w:pPr>
-              <w:pStyle w:val="Compact"/>
-              <w:jc w:val="left"/>
-            </w:pPr>
-            <w:r>
-              <w:t xml:space="preserve">ALEKS</w:t>
-            </w:r>
-          </w:p>
-        </w:tc>
-        <w:tc>
-          <w:tcPr/>
-          <w:p>
-            <w:pPr>
-              <w:pStyle w:val="Compact"/>
-              <w:jc w:val="left"/>
-            </w:pPr>
-            <w:r>
-              <w:t xml:space="preserve">Your online adaptive homework and textbook-access platform.</w:t>
-            </w:r>
-          </w:p>
-        </w:tc>
-      </w:tr>
-      <w:tr>
-        <w:tc>
-          <w:tcPr/>
-          <w:p>
-            <w:pPr>
-              <w:pStyle w:val="Compact"/>
-              <w:jc w:val="left"/>
-            </w:pPr>
-            <w:r>
-              <w:t xml:space="preserve">DAC</w:t>
-            </w:r>
-          </w:p>
-        </w:tc>
-        <w:tc>
-          <w:tcPr/>
-          <w:p>
-            <w:pPr>
-              <w:pStyle w:val="Compact"/>
-              <w:jc w:val="left"/>
-            </w:pPr>
-            <w:r>
-              <w:t xml:space="preserve">Disability Access Center — Clark’s office for accommodations.</w:t>
-            </w:r>
-          </w:p>
-        </w:tc>
-      </w:tr>
-      <w:tr>
-        <w:tc>
-          <w:tcPr/>
-          <w:p>
-            <w:pPr>
-              <w:pStyle w:val="Compact"/>
-              <w:jc w:val="left"/>
-            </w:pPr>
-            <w:r>
-              <w:t xml:space="preserve">Chemfolio</w:t>
-            </w:r>
-          </w:p>
-        </w:tc>
-        <w:tc>
-          <w:tcPr/>
-          <w:p>
-            <w:pPr>
-              <w:pStyle w:val="Compact"/>
-              <w:jc w:val="left"/>
-            </w:pPr>
-            <w:r>
-              <w:t xml:space="preserve">Your required lecture/discussion workbook — you buy this!</w:t>
-            </w:r>
-          </w:p>
-        </w:tc>
-      </w:tr>
-      <w:tr>
-        <w:tc>
-          <w:tcPr/>
-          <w:p>
-            <w:pPr>
-              <w:pStyle w:val="Compact"/>
-              <w:jc w:val="left"/>
-            </w:pPr>
-            <w:r>
-              <w:t xml:space="preserve">TL;DR</w:t>
-            </w:r>
-          </w:p>
-        </w:tc>
-        <w:tc>
-          <w:tcPr/>
-          <w:p>
-            <w:pPr>
-              <w:pStyle w:val="Compact"/>
-              <w:jc w:val="left"/>
-            </w:pPr>
-            <w:r>
-              <w:t xml:space="preserve">“</w:t>
-            </w:r>
-            <w:r>
-              <w:t xml:space="preserve">Too long; didn’t read</w:t>
-            </w:r>
-            <w:r>
-              <w:t xml:space="preserve">”</w:t>
-            </w:r>
-            <w:r>
-              <w:t xml:space="preserve"> </w:t>
-            </w:r>
-            <w:r>
-              <w:t xml:space="preserve">— a quick plain-language summary. Wherever you see TL;DR, that line tells you the gist before the official/detailed text below it.</w:t>
-            </w:r>
-          </w:p>
-        </w:tc>
-      </w:tr>
-    </w:tbl>
-    <w:bookmarkEnd w:id="21"/>
-    <w:bookmarkStart w:id="22" w:name="your-first-week"/>
-    <w:p>
-      <w:pPr>
-        <w:pStyle w:val="Heading2"/>
-      </w:pPr>
-      <w:r>
-        <w:t xml:space="preserve">Your First Week</w:t>
-      </w:r>
-    </w:p>
-    <w:p>
-      <w:pPr>
-        <w:numPr>
-          <w:ilvl w:val="0"/>
-          <w:numId w:val="1001"/>
-        </w:numPr>
-        <w:pStyle w:val="Compact"/>
-      </w:pPr>
-      <w:r>
-        <w:t xml:space="preserve">Attend your scheduled lab session. Missing it means being dropped from the course.</w:t>
-      </w:r>
-    </w:p>
-    <w:p>
-      <w:pPr>
-        <w:numPr>
-          <w:ilvl w:val="0"/>
-          <w:numId w:val="1001"/>
-        </w:numPr>
-        <w:pStyle w:val="Compact"/>
-      </w:pPr>
-      <w:r>
-        <w:t xml:space="preserve">Log into Canvas and read the announcements at the top of the course.</w:t>
-      </w:r>
-    </w:p>
-    <w:p>
-      <w:pPr>
-        <w:numPr>
-          <w:ilvl w:val="0"/>
-          <w:numId w:val="1001"/>
-        </w:numPr>
-        <w:pStyle w:val="Compact"/>
-      </w:pPr>
-      <w:r>
-        <w:t xml:space="preserve">Work through Module 0, including the ALEKS/Office/OneDrive setup guide — both need to be done by the end of your first lab, so budget the time.</w:t>
-      </w:r>
-    </w:p>
-    <w:p>
-      <w:pPr>
-        <w:numPr>
-          <w:ilvl w:val="0"/>
-          <w:numId w:val="1001"/>
-        </w:numPr>
-        <w:pStyle w:val="Compact"/>
-      </w:pPr>
-      <w:r>
-        <w:t xml:space="preserve">Read this syllabus, especially the Start Here box and the Course Agreements section.</w:t>
-      </w:r>
-    </w:p>
-    <w:p>
-      <w:pPr>
-        <w:numPr>
-          <w:ilvl w:val="0"/>
-          <w:numId w:val="1001"/>
-        </w:numPr>
-        <w:pStyle w:val="Compact"/>
-      </w:pPr>
-      <w:r>
-        <w:t xml:space="preserve">Confirm you have both your Chemfolio and lab manual from the Clark Bookstore before class — your first 3-2-1 team post is due that Wednesday.</w:t>
-      </w:r>
-    </w:p>
-    <w:bookmarkEnd w:id="22"/>
-    <w:bookmarkEnd w:id="23"/>
-    <w:bookmarkStart w:id="24" w:name="course-information"/>
-    <w:p>
-      <w:pPr>
-        <w:pStyle w:val="Heading1"/>
-      </w:pPr>
-      <w:r>
-        <w:t xml:space="preserve">Course Information</w:t>
-      </w:r>
-    </w:p>
-    <w:tbl>
-      <w:tblPr>
-        <w:tblStyle w:val="Table"/>
-        <w:tblW w:type="pct" w:w="5000"/>
-        <w:tblLook w:firstRow="0" w:lastRow="0" w:firstColumn="0" w:lastColumn="0" w:noHBand="0" w:noVBand="0" w:val="0000"/>
-        <w:jc w:val="start"/>
-      </w:tblPr>
-      <w:tblGrid>
-        <w:gridCol w:w="3960"/>
-        <w:gridCol w:w="3960"/>
-      </w:tblGrid>
+              <w:t xml:space="preserve">Item</w:t>
+            </w:r>
+          </w:p>
+        </w:tc>
+        <w:tc>
+          <w:tcPr/>
+          <w:p>
+            <w:pPr>
+              <w:pStyle w:val="Compact"/>
+              <w:jc w:val="left"/>
+            </w:pPr>
+            <w:r>
+              <w:t xml:space="preserve">Details</w:t>
+            </w:r>
+          </w:p>
+        </w:tc>
+      </w:tr>
       <w:tr>
         <w:tc>
           <w:tcPr/>
@@ -726,24 +124,10 @@
                 <w:bCs/>
                 <w:b/>
               </w:rPr>
-              <w:t xml:space="preserve">Course Title</w:t>
-            </w:r>
-          </w:p>
-        </w:tc>
-        <w:tc>
-          <w:tcPr/>
-          <w:p>
-            <w:pPr>
-              <w:pStyle w:val="Compact"/>
-              <w:jc w:val="left"/>
-            </w:pPr>
-            <w:r>
-              <w:t xml:space="preserve">CHEM&amp;121: Introduction to Chemistry (Pre-Health)</w:t>
-            </w:r>
-          </w:p>
-        </w:tc>
-      </w:tr>
-      <w:tr>
+              <w:t xml:space="preserve">What it costs</w:t>
+            </w:r>
+          </w:p>
+        </w:tc>
         <w:tc>
           <w:tcPr/>
           <w:p>
@@ -756,49 +140,49 @@
                 <w:bCs/>
                 <w:b/>
               </w:rPr>
-              <w:t xml:space="preserve">Course Nbr/Sec</w:t>
-            </w:r>
-          </w:p>
-        </w:tc>
-        <w:tc>
-          <w:tcPr/>
-          <w:p>
-            <w:pPr>
-              <w:pStyle w:val="Compact"/>
-              <w:jc w:val="left"/>
-            </w:pPr>
-            <w:r>
-              <w:t xml:space="preserve">18405/18406, 18407/18408</w:t>
-            </w:r>
-          </w:p>
-        </w:tc>
-      </w:tr>
-      <w:tr>
-        <w:tc>
-          <w:tcPr/>
-          <w:p>
-            <w:pPr>
-              <w:pStyle w:val="Compact"/>
-              <w:jc w:val="left"/>
-            </w:pPr>
+              <w:t xml:space="preserve">Chemfolio</w:t>
+            </w:r>
+            <w:r>
+              <w:t xml:space="preserve"> </w:t>
+            </w:r>
+            <w:r>
+              <w:rPr>
+                <w:iCs/>
+                <w:i/>
+              </w:rPr>
+              <w:t xml:space="preserve">[price TBD]</w:t>
+            </w:r>
+            <w:r>
+              <w:t xml:space="preserve"> </w:t>
+            </w:r>
+            <w:r>
+              <w:t xml:space="preserve">+</w:t>
+            </w:r>
+            <w:r>
+              <w:t xml:space="preserve"> </w:t>
+            </w:r>
             <w:r>
               <w:rPr>
                 <w:bCs/>
                 <w:b/>
               </w:rPr>
-              <w:t xml:space="preserve">Quarter/Year</w:t>
-            </w:r>
-          </w:p>
-        </w:tc>
-        <w:tc>
-          <w:tcPr/>
-          <w:p>
-            <w:pPr>
-              <w:pStyle w:val="Compact"/>
-              <w:jc w:val="left"/>
-            </w:pPr>
-            <w:r>
-              <w:t xml:space="preserve">Fall 2026 (September 21 – December 10, 2026)</w:t>
+              <w:t xml:space="preserve">CHEM&amp;121 Lab Manual</w:t>
+            </w:r>
+            <w:r>
+              <w:t xml:space="preserve"> </w:t>
+            </w:r>
+            <w:r>
+              <w:rPr>
+                <w:iCs/>
+                <w:i/>
+              </w:rPr>
+              <w:t xml:space="preserve">[price TBD]</w:t>
+            </w:r>
+            <w:r>
+              <w:t xml:space="preserve"> </w:t>
+            </w:r>
+            <w:r>
+              <w:t xml:space="preserve">(Clark Bookstore) + ALEKS (paid through your course registration).</w:t>
             </w:r>
           </w:p>
         </w:tc>
@@ -816,19 +200,19 @@
                 <w:bCs/>
                 <w:b/>
               </w:rPr>
-              <w:t xml:space="preserve">Location/Time</w:t>
-            </w:r>
-          </w:p>
-        </w:tc>
-        <w:tc>
-          <w:tcPr/>
-          <w:p>
-            <w:pPr>
-              <w:pStyle w:val="Compact"/>
-              <w:jc w:val="left"/>
-            </w:pPr>
-            <w:r>
-              <w:t xml:space="preserve">Lab: STEM Building 222, Mo/We 2:00–3:50 PM (18405) or Mo/We 5:00–6:50 PM (18407). Lecture/discussion: online, asynchronous.</w:t>
+              <w:t xml:space="preserve">When things are due</w:t>
+            </w:r>
+          </w:p>
+        </w:tc>
+        <w:tc>
+          <w:tcPr/>
+          <w:p>
+            <w:pPr>
+              <w:pStyle w:val="Compact"/>
+              <w:jc w:val="left"/>
+            </w:pPr>
+            <w:r>
+              <w:t xml:space="preserve">Tuesday through Sunday each carry something — see Weekly Flow below for the exact rhythm. Once you learn it, it repeats every module.</w:t>
             </w:r>
           </w:p>
         </w:tc>
@@ -846,19 +230,19 @@
                 <w:bCs/>
                 <w:b/>
               </w:rPr>
-              <w:t xml:space="preserve">Course Site</w:t>
-            </w:r>
-          </w:p>
-        </w:tc>
-        <w:tc>
-          <w:tcPr/>
-          <w:p>
-            <w:pPr>
-              <w:pStyle w:val="Compact"/>
-              <w:jc w:val="left"/>
-            </w:pPr>
-            <w:r>
-              <w:t xml:space="preserve">Canvas Learning Management System (clarkcollege.instructure.com)</w:t>
+              <w:t xml:space="preserve">Time to budget</w:t>
+            </w:r>
+          </w:p>
+        </w:tc>
+        <w:tc>
+          <w:tcPr/>
+          <w:p>
+            <w:pPr>
+              <w:pStyle w:val="Compact"/>
+              <w:jc w:val="left"/>
+            </w:pPr>
+            <w:r>
+              <w:t xml:space="preserve">About 10–12 hours a week — most of it on Canvas, plus your 4-hour on-campus lab.</w:t>
             </w:r>
           </w:p>
         </w:tc>
@@ -876,19 +260,19 @@
                 <w:bCs/>
                 <w:b/>
               </w:rPr>
-              <w:t xml:space="preserve">Course Modality</w:t>
-            </w:r>
-          </w:p>
-        </w:tc>
-        <w:tc>
-          <w:tcPr/>
-          <w:p>
-            <w:pPr>
-              <w:pStyle w:val="Compact"/>
-              <w:jc w:val="left"/>
-            </w:pPr>
-            <w:r>
-              <w:t xml:space="preserve">Hybrid — asynchronous online lecture/discussion + biweekly on-campus lab</w:t>
+              <w:t xml:space="preserve">How to reach me</w:t>
+            </w:r>
+          </w:p>
+        </w:tc>
+        <w:tc>
+          <w:tcPr/>
+          <w:p>
+            <w:pPr>
+              <w:pStyle w:val="Compact"/>
+              <w:jc w:val="left"/>
+            </w:pPr>
+            <w:r>
+              <w:t xml:space="preserve">Canvas Inbox only — I don’t use email during the term. I reply within 24 hours on weekdays.</w:t>
             </w:r>
           </w:p>
         </w:tc>
@@ -906,19 +290,19 @@
                 <w:bCs/>
                 <w:b/>
               </w:rPr>
-              <w:t xml:space="preserve">Credit Hours</w:t>
-            </w:r>
-          </w:p>
-        </w:tc>
-        <w:tc>
-          <w:tcPr/>
-          <w:p>
-            <w:pPr>
-              <w:pStyle w:val="Compact"/>
-              <w:jc w:val="left"/>
-            </w:pPr>
-            <w:r>
-              <w:t xml:space="preserve">5 credits (3.0 hours lecture-equivalent / 4.0 hours lab)</w:t>
+              <w:t xml:space="preserve">The two big ones</w:t>
+            </w:r>
+          </w:p>
+        </w:tc>
+        <w:tc>
+          <w:tcPr/>
+          <w:p>
+            <w:pPr>
+              <w:pStyle w:val="Compact"/>
+              <w:jc w:val="left"/>
+            </w:pPr>
+            <w:r>
+              <w:t xml:space="preserve">Weekly lab attendance (required every week, no exceptions) and the Final TYC (Teach Your Community) Project — 10% of your grade, in place of a final exam.</w:t>
             </w:r>
           </w:p>
         </w:tc>
@@ -936,37 +320,19 @@
                 <w:bCs/>
                 <w:b/>
               </w:rPr>
-              <w:t xml:space="preserve">Prerequisites</w:t>
-            </w:r>
-          </w:p>
-        </w:tc>
-        <w:tc>
-          <w:tcPr/>
-          <w:p>
-            <w:pPr>
-              <w:pStyle w:val="Compact"/>
-              <w:jc w:val="left"/>
-            </w:pPr>
-            <w:r>
-              <w:t xml:space="preserve">MATH 96 (grade of</w:t>
-            </w:r>
-            <w:r>
-              <w:t xml:space="preserve"> </w:t>
-            </w:r>
-            <w:r>
-              <w:t xml:space="preserve">“</w:t>
-            </w:r>
-            <w:r>
-              <w:t xml:space="preserve">C</w:t>
-            </w:r>
-            <w:r>
-              <w:t xml:space="preserve">”</w:t>
-            </w:r>
-            <w:r>
-              <w:t xml:space="preserve"> </w:t>
-            </w:r>
-            <w:r>
-              <w:t xml:space="preserve">or higher), or placement into Math level 45.</w:t>
+              <w:t xml:space="preserve">The AI rule</w:t>
+            </w:r>
+          </w:p>
+        </w:tc>
+        <w:tc>
+          <w:tcPr/>
+          <w:p>
+            <w:pPr>
+              <w:pStyle w:val="Compact"/>
+              <w:jc w:val="left"/>
+            </w:pPr>
+            <w:r>
+              <w:t xml:space="preserve">AI can support your learning — don’t let it do the learning for you. See the AI Agreement below for exactly where the lines are.</w:t>
             </w:r>
           </w:p>
         </w:tc>
@@ -984,97 +350,61 @@
                 <w:bCs/>
                 <w:b/>
               </w:rPr>
-              <w:t xml:space="preserve">Course Description</w:t>
-            </w:r>
-          </w:p>
-        </w:tc>
-        <w:tc>
-          <w:tcPr/>
-          <w:p>
-            <w:pPr>
-              <w:pStyle w:val="Compact"/>
-              <w:jc w:val="left"/>
-            </w:pPr>
-            <w:r>
-              <w:rPr>
-                <w:bCs/>
-                <w:b/>
-              </w:rPr>
-              <w:t xml:space="preserve">What the catalog says:</w:t>
-            </w:r>
-            <w:r>
-              <w:t xml:space="preserve"> </w:t>
-            </w:r>
-            <w:r>
-              <w:t xml:space="preserve">Topics in general chemistry applicable to students seeking a 2-year degree in the health-occupations fields. Unit-factor method is applied to problem solving. Topics covered include units of measurement, atomic structure, chemical bonding, energy, the mole concept, nomenclature of inorganic compounds, writing and balancing equations, properties of gases, solutions and colloids, reaction rates and equilibrium, acids, bases and salts, radiation and health.</w:t>
-            </w:r>
-            <w:r>
-              <w:t xml:space="preserve"> </w:t>
-            </w:r>
-            <w:r>
-              <w:rPr>
-                <w:bCs/>
-                <w:b/>
-              </w:rPr>
-              <w:t xml:space="preserve">What that means in practice:</w:t>
-            </w:r>
-            <w:r>
-              <w:t xml:space="preserve"> </w:t>
-            </w:r>
-            <w:r>
-              <w:t xml:space="preserve">You’ll learn to think like a health professional needs to think about chemistry — using math and unit conversions to solve real clinical-style problems, not just memorizing facts. Expect this course to feel like a math class and a foreign-language class rolled together: we use conversions from day one, every week, in both discussion and lab.</w:t>
+              <w:t xml:space="preserve">If you fall behind</w:t>
+            </w:r>
+          </w:p>
+        </w:tc>
+        <w:tc>
+          <w:tcPr/>
+          <w:p>
+            <w:pPr>
+              <w:pStyle w:val="Compact"/>
+              <w:jc w:val="left"/>
+            </w:pPr>
+            <w:r>
+              <w:t xml:space="preserve">No explanation needed. Late work loses 1% per hour after the due date, down to zero after about 5 days — then it can still be submitted for zero credit. See Late Work below for the full policy.</w:t>
             </w:r>
           </w:p>
         </w:tc>
       </w:tr>
     </w:tbl>
-    <w:bookmarkEnd w:id="24"/>
-    <w:bookmarkStart w:id="29" w:name="welcome-to-class"/>
-    <w:p>
-      <w:pPr>
-        <w:pStyle w:val="Heading1"/>
-      </w:pPr>
-      <w:r>
-        <w:t xml:space="preserve">Welcome to Class!</w:t>
-      </w:r>
-    </w:p>
-    <w:p>
-      <w:pPr>
-        <w:pStyle w:val="FirstParagraph"/>
-      </w:pPr>
-      <w:r>
-        <w:t xml:space="preserve">Welcome, welcome, welcome! I’m Dr. B (Dr. Karl Bailey, he/him), and I’m so glad to be your Chemistry instructor this term. However you landed in this course, I’m glad you’re here — let’s get into how it actually runs, week to week.</w:t>
-      </w:r>
-    </w:p>
-    <w:p>
-      <w:pPr>
-        <w:pStyle w:val="BlockText"/>
+    <w:p>
+      <w:pPr>
+        <w:pStyle w:val="BodyText"/>
       </w:pPr>
       <w:r>
         <w:rPr>
           <w:bCs/>
           <w:b/>
         </w:rPr>
-        <w:t xml:space="preserve">Dr. B’s Note:</w:t>
+        <w:t xml:space="preserve">Your grade in one line:</w:t>
       </w:r>
       <w:r>
         <w:t xml:space="preserve"> </w:t>
       </w:r>
+      <w:r>
+        <w:t xml:space="preserve">Discussions 30% · Labs 30% · Quizzes 20% · ALEKS Homework 10% · Final TYC Project 10%.</w:t>
+      </w:r>
+    </w:p>
+    <w:p>
+      <w:pPr>
+        <w:pStyle w:val="BodyText"/>
+      </w:pPr>
       <w:r>
         <w:rPr>
           <w:iCs/>
           <w:i/>
         </w:rPr>
-        <w:t xml:space="preserve">Most students who stick with the weekly rhythm and stay engaged do well. The difference isn’t talent, it’s showing up consistently. Give yourself a fighting chance.</w:t>
-      </w:r>
-    </w:p>
-    <w:bookmarkStart w:id="25" w:name="Xe66c6beb7eb2ec0e95c71e590f49bdb9df56704"/>
+        <w:t xml:space="preserve">(Working draft — the teaching team will confirm final category weights before the term begins.)</w:t>
+      </w:r>
+    </w:p>
+    <w:bookmarkStart w:id="21" w:name="course-terms-youll-see"/>
     <w:p>
       <w:pPr>
         <w:pStyle w:val="Heading2"/>
       </w:pPr>
       <w:r>
-        <w:t xml:space="preserve">What preparation/skills do I need for this class?</w:t>
+        <w:t xml:space="preserve">Course Terms You’ll See</w:t>
       </w:r>
     </w:p>
     <w:p>
@@ -1082,83 +412,7 @@
         <w:pStyle w:val="FirstParagraph"/>
       </w:pPr>
       <w:r>
-        <w:t xml:space="preserve">CHEM is a math class combined with a foreign language course, and we move fast. We use math conversions from day one and keep using them every week, in both discussion and lab. If your math skills need more than a light dusting-off, consider brushing up before or alongside this course — most students taking CHEM&amp;121 find the math the hardest part, not the chemistry itself.</w:t>
-      </w:r>
-    </w:p>
-    <w:bookmarkEnd w:id="25"/>
-    <w:bookmarkStart w:id="26" w:name="what-can-i-expect-in-class"/>
-    <w:p>
-      <w:pPr>
-        <w:pStyle w:val="Heading2"/>
-      </w:pPr>
-      <w:r>
-        <w:t xml:space="preserve">What can I expect in class?</w:t>
-      </w:r>
-    </w:p>
-    <w:p>
-      <w:pPr>
-        <w:pStyle w:val="FirstParagraph"/>
-      </w:pPr>
-      <w:r>
-        <w:t xml:space="preserve">This course is entirely discussion-based online — there are no traditional lectures. Instead, you’ll work through weekly Activities from your Chemfolio in a 3-2-1 Team Discussion format and apply what you’re learning hands-on in your required weekly on-campus labs. Labs involve real data collection and analysis, not cookbook steps — more on exactly how in Weekly Flow and the Grading section below.</w:t>
-      </w:r>
-    </w:p>
-    <w:p>
-      <w:pPr>
-        <w:pStyle w:val="BlockText"/>
-      </w:pPr>
-      <w:r>
-        <w:rPr>
-          <w:bCs/>
-          <w:b/>
-        </w:rPr>
-        <w:t xml:space="preserve">Dr. B’s Note:</w:t>
-      </w:r>
-      <w:r>
-        <w:t xml:space="preserve"> </w:t>
-      </w:r>
-      <w:r>
-        <w:rPr>
-          <w:iCs/>
-          <w:i/>
-        </w:rPr>
-        <w:t xml:space="preserve">If you’ve taken a science course before, don’t assume this one works the same way: there are no traditional lectures, quizzes happen in person during lab, and labs are real science, not a recipe to follow. More on exactly how below.</w:t>
-      </w:r>
-    </w:p>
-    <w:bookmarkEnd w:id="26"/>
-    <w:bookmarkStart w:id="27" w:name="what-if-i-need-an-accommodation"/>
-    <w:p>
-      <w:pPr>
-        <w:pStyle w:val="Heading2"/>
-      </w:pPr>
-      <w:r>
-        <w:t xml:space="preserve">What if I need an accommodation?</w:t>
-      </w:r>
-    </w:p>
-    <w:p>
-      <w:pPr>
-        <w:pStyle w:val="FirstParagraph"/>
-      </w:pPr>
-      <w:r>
-        <w:t xml:space="preserve">Clark College and the Disability Access Center (DAC) office assist students with disabilities in pursuing their educational goals. DAC can provide classroom accommodations, as well as serve as a resource to the campus community in striving to make Clark College both an accessible and hospitable place for students with disabilities. Interested in getting accommodations? Begin with viewing the steps for requesting accommodations at clark.edu/dac.</w:t>
-      </w:r>
-    </w:p>
-    <w:bookmarkEnd w:id="27"/>
-    <w:bookmarkStart w:id="28" w:name="weekly-flow"/>
-    <w:p>
-      <w:pPr>
-        <w:pStyle w:val="Heading2"/>
-      </w:pPr>
-      <w:r>
-        <w:t xml:space="preserve">Weekly Flow</w:t>
-      </w:r>
-    </w:p>
-    <w:p>
-      <w:pPr>
-        <w:pStyle w:val="FirstParagraph"/>
-      </w:pPr>
-      <w:r>
-        <w:t xml:space="preserve">Canvas Modules are your home base. This rhythm repeats every module — once you know this table, you know the whole term.</w:t>
+        <w:t xml:space="preserve">A few abbreviations come up constantly in this course. Here’s what they mean, so you’re not guessing the first time you see them:</w:t>
       </w:r>
     </w:p>
     <w:tbl>
@@ -1184,234 +438,304 @@
               <w:jc w:val="left"/>
             </w:pPr>
             <w:r>
-              <w:t xml:space="preserve">Day</w:t>
-            </w:r>
-          </w:p>
-        </w:tc>
-        <w:tc>
-          <w:tcPr/>
-          <w:p>
-            <w:pPr>
-              <w:pStyle w:val="Compact"/>
-              <w:jc w:val="left"/>
-            </w:pPr>
-            <w:r>
-              <w:t xml:space="preserve">What’s due</w:t>
-            </w:r>
-          </w:p>
-        </w:tc>
-      </w:tr>
-      <w:tr>
-        <w:tc>
-          <w:tcPr/>
-          <w:p>
-            <w:pPr>
-              <w:pStyle w:val="Compact"/>
-              <w:jc w:val="left"/>
-            </w:pPr>
-            <w:r>
-              <w:t xml:space="preserve">Monday</w:t>
-            </w:r>
-          </w:p>
-        </w:tc>
-        <w:tc>
-          <w:tcPr/>
-          <w:p>
-            <w:pPr>
-              <w:pStyle w:val="Compact"/>
-              <w:jc w:val="left"/>
-            </w:pPr>
-            <w:r>
-              <w:t xml:space="preserve">New module opens</w:t>
-            </w:r>
-          </w:p>
-        </w:tc>
-      </w:tr>
-      <w:tr>
-        <w:tc>
-          <w:tcPr/>
-          <w:p>
-            <w:pPr>
-              <w:pStyle w:val="Compact"/>
-              <w:jc w:val="left"/>
-            </w:pPr>
-            <w:r>
-              <w:t xml:space="preserve">Tuesday</w:t>
-            </w:r>
-          </w:p>
-        </w:tc>
-        <w:tc>
-          <w:tcPr/>
-          <w:p>
-            <w:pPr>
-              <w:pStyle w:val="Compact"/>
-              <w:jc w:val="left"/>
-            </w:pPr>
-            <w:r>
-              <w:t xml:space="preserve">OOL (Outside Of Lecture) discussion post due</w:t>
-            </w:r>
-          </w:p>
-        </w:tc>
-      </w:tr>
-      <w:tr>
-        <w:tc>
-          <w:tcPr/>
-          <w:p>
-            <w:pPr>
-              <w:pStyle w:val="Compact"/>
-              <w:jc w:val="left"/>
-            </w:pPr>
-            <w:r>
-              <w:t xml:space="preserve">Wednesday</w:t>
-            </w:r>
-          </w:p>
-        </w:tc>
-        <w:tc>
-          <w:tcPr/>
-          <w:p>
-            <w:pPr>
-              <w:pStyle w:val="Compact"/>
-              <w:jc w:val="left"/>
-            </w:pPr>
-            <w:r>
-              <w:t xml:space="preserve">First 3-2-1 Team discussion post due</w:t>
-            </w:r>
-          </w:p>
-        </w:tc>
-      </w:tr>
-      <w:tr>
-        <w:tc>
-          <w:tcPr/>
-          <w:p>
-            <w:pPr>
-              <w:pStyle w:val="Compact"/>
-              <w:jc w:val="left"/>
-            </w:pPr>
-            <w:r>
-              <w:t xml:space="preserve">Thursday</w:t>
-            </w:r>
-          </w:p>
-        </w:tc>
-        <w:tc>
-          <w:tcPr/>
-          <w:p>
-            <w:pPr>
-              <w:pStyle w:val="Compact"/>
-              <w:jc w:val="left"/>
-            </w:pPr>
-            <w:r>
-              <w:t xml:space="preserve">OOL replies due</w:t>
-            </w:r>
-          </w:p>
-        </w:tc>
-      </w:tr>
-      <w:tr>
-        <w:tc>
-          <w:tcPr/>
-          <w:p>
-            <w:pPr>
-              <w:pStyle w:val="Compact"/>
-              <w:jc w:val="left"/>
-            </w:pPr>
-            <w:r>
-              <w:t xml:space="preserve">Friday</w:t>
-            </w:r>
-          </w:p>
-        </w:tc>
-        <w:tc>
-          <w:tcPr/>
-          <w:p>
-            <w:pPr>
-              <w:pStyle w:val="Compact"/>
-              <w:jc w:val="left"/>
-            </w:pPr>
-            <w:r>
-              <w:t xml:space="preserve">Lab Intro upload due</w:t>
-            </w:r>
-          </w:p>
-        </w:tc>
-      </w:tr>
-      <w:tr>
-        <w:tc>
-          <w:tcPr/>
-          <w:p>
-            <w:pPr>
-              <w:pStyle w:val="Compact"/>
-              <w:jc w:val="left"/>
-            </w:pPr>
-            <w:r>
-              <w:t xml:space="preserve">Sunday</w:t>
-            </w:r>
-          </w:p>
-        </w:tc>
-        <w:tc>
-          <w:tcPr/>
-          <w:p>
-            <w:pPr>
-              <w:pStyle w:val="Compact"/>
-              <w:jc w:val="left"/>
-            </w:pPr>
-            <w:r>
-              <w:t xml:space="preserve">Second 3-2-1 Team post + replies to all 3 teammates, ALEKS homework, OOL template upload, Lab Results &amp; Analysis, and Lab Discussion &amp; Conclusions template upload — all due</w:t>
+              <w:t xml:space="preserve">Term</w:t>
+            </w:r>
+          </w:p>
+        </w:tc>
+        <w:tc>
+          <w:tcPr/>
+          <w:p>
+            <w:pPr>
+              <w:pStyle w:val="Compact"/>
+              <w:jc w:val="left"/>
+            </w:pPr>
+            <w:r>
+              <w:t xml:space="preserve">What it means</w:t>
+            </w:r>
+          </w:p>
+        </w:tc>
+      </w:tr>
+      <w:tr>
+        <w:tc>
+          <w:tcPr/>
+          <w:p>
+            <w:pPr>
+              <w:pStyle w:val="Compact"/>
+              <w:jc w:val="left"/>
+            </w:pPr>
+            <w:r>
+              <w:t xml:space="preserve">3-2-1</w:t>
+            </w:r>
+          </w:p>
+        </w:tc>
+        <w:tc>
+          <w:tcPr/>
+          <w:p>
+            <w:pPr>
+              <w:pStyle w:val="Compact"/>
+              <w:jc w:val="left"/>
+            </w:pPr>
+            <w:r>
+              <w:t xml:space="preserve">Your weekly Team Discussion format — named for its posting structure (three problem areas, two areas of interest, one insight from the video key).</w:t>
+            </w:r>
+          </w:p>
+        </w:tc>
+      </w:tr>
+      <w:tr>
+        <w:tc>
+          <w:tcPr/>
+          <w:p>
+            <w:pPr>
+              <w:pStyle w:val="Compact"/>
+              <w:jc w:val="left"/>
+            </w:pPr>
+            <w:r>
+              <w:t xml:space="preserve">OOL</w:t>
+            </w:r>
+          </w:p>
+        </w:tc>
+        <w:tc>
+          <w:tcPr/>
+          <w:p>
+            <w:pPr>
+              <w:pStyle w:val="Compact"/>
+              <w:jc w:val="left"/>
+            </w:pPr>
+            <w:r>
+              <w:t xml:space="preserve">Outside Of Lecture — a separate weekly class discussion, not the 3-2-1.</w:t>
+            </w:r>
+          </w:p>
+        </w:tc>
+      </w:tr>
+      <w:tr>
+        <w:tc>
+          <w:tcPr/>
+          <w:p>
+            <w:pPr>
+              <w:pStyle w:val="Compact"/>
+              <w:jc w:val="left"/>
+            </w:pPr>
+            <w:r>
+              <w:t xml:space="preserve">TYC</w:t>
+            </w:r>
+          </w:p>
+        </w:tc>
+        <w:tc>
+          <w:tcPr/>
+          <w:p>
+            <w:pPr>
+              <w:pStyle w:val="Compact"/>
+              <w:jc w:val="left"/>
+            </w:pPr>
+            <w:r>
+              <w:t xml:space="preserve">Teach Your Community — your Final Project, replacing a final exam.</w:t>
+            </w:r>
+          </w:p>
+        </w:tc>
+      </w:tr>
+      <w:tr>
+        <w:tc>
+          <w:tcPr/>
+          <w:p>
+            <w:pPr>
+              <w:pStyle w:val="Compact"/>
+              <w:jc w:val="left"/>
+            </w:pPr>
+            <w:r>
+              <w:t xml:space="preserve">ALEKS</w:t>
+            </w:r>
+          </w:p>
+        </w:tc>
+        <w:tc>
+          <w:tcPr/>
+          <w:p>
+            <w:pPr>
+              <w:pStyle w:val="Compact"/>
+              <w:jc w:val="left"/>
+            </w:pPr>
+            <w:r>
+              <w:t xml:space="preserve">Your online adaptive homework and textbook-access platform.</w:t>
+            </w:r>
+          </w:p>
+        </w:tc>
+      </w:tr>
+      <w:tr>
+        <w:tc>
+          <w:tcPr/>
+          <w:p>
+            <w:pPr>
+              <w:pStyle w:val="Compact"/>
+              <w:jc w:val="left"/>
+            </w:pPr>
+            <w:r>
+              <w:t xml:space="preserve">DAC</w:t>
+            </w:r>
+          </w:p>
+        </w:tc>
+        <w:tc>
+          <w:tcPr/>
+          <w:p>
+            <w:pPr>
+              <w:pStyle w:val="Compact"/>
+              <w:jc w:val="left"/>
+            </w:pPr>
+            <w:r>
+              <w:t xml:space="preserve">Disability Access Center — Clark’s office for accommodations.</w:t>
+            </w:r>
+          </w:p>
+        </w:tc>
+      </w:tr>
+      <w:tr>
+        <w:tc>
+          <w:tcPr/>
+          <w:p>
+            <w:pPr>
+              <w:pStyle w:val="Compact"/>
+              <w:jc w:val="left"/>
+            </w:pPr>
+            <w:r>
+              <w:t xml:space="preserve">Chemfolio</w:t>
+            </w:r>
+          </w:p>
+        </w:tc>
+        <w:tc>
+          <w:tcPr/>
+          <w:p>
+            <w:pPr>
+              <w:pStyle w:val="Compact"/>
+              <w:jc w:val="left"/>
+            </w:pPr>
+            <w:r>
+              <w:t xml:space="preserve">Your required lecture/discussion workbook — you buy this!</w:t>
+            </w:r>
+          </w:p>
+        </w:tc>
+      </w:tr>
+      <w:tr>
+        <w:tc>
+          <w:tcPr/>
+          <w:p>
+            <w:pPr>
+              <w:pStyle w:val="Compact"/>
+              <w:jc w:val="left"/>
+            </w:pPr>
+            <w:r>
+              <w:t xml:space="preserve">TL;DR</w:t>
+            </w:r>
+          </w:p>
+        </w:tc>
+        <w:tc>
+          <w:tcPr/>
+          <w:p>
+            <w:pPr>
+              <w:pStyle w:val="Compact"/>
+              <w:jc w:val="left"/>
+            </w:pPr>
+            <w:r>
+              <w:t xml:space="preserve">“</w:t>
+            </w:r>
+            <w:r>
+              <w:t xml:space="preserve">Too long; didn’t read</w:t>
+            </w:r>
+            <w:r>
+              <w:t xml:space="preserve">”</w:t>
+            </w:r>
+            <w:r>
+              <w:t xml:space="preserve"> </w:t>
+            </w:r>
+            <w:r>
+              <w:t xml:space="preserve">— a quick plain-language summary. Wherever you see TL;DR, that line tells you the gist before the official/detailed text below it.</w:t>
             </w:r>
           </w:p>
         </w:tc>
       </w:tr>
     </w:tbl>
-    <w:p>
-      <w:pPr>
-        <w:pStyle w:val="BodyText"/>
-      </w:pPr>
-      <w:r>
-        <w:t xml:space="preserve">Attend lab both days assigned in your schedule.</w:t>
-      </w:r>
-    </w:p>
-    <w:p>
-      <w:pPr>
-        <w:pStyle w:val="BodyText"/>
-      </w:pPr>
-      <w:r>
-        <w:t xml:space="preserve">Quizzes are the one exception to this weekly pattern — they’re in-person during lab, tentatively Weeks 3, 5, 6, 9, and 11 only.</w:t>
-      </w:r>
-    </w:p>
-    <w:p>
-      <w:pPr>
-        <w:pStyle w:val="BlockText"/>
-      </w:pPr>
-      <w:r>
-        <w:rPr>
-          <w:bCs/>
-          <w:b/>
-        </w:rPr>
-        <w:t xml:space="preserve">Dr. B’s Note:</w:t>
-      </w:r>
-      <w:r>
-        <w:t xml:space="preserve"> </w:t>
-      </w:r>
-      <w:r>
-        <w:rPr>
-          <w:iCs/>
-          <w:i/>
-        </w:rPr>
-        <w:t xml:space="preserve">Prioritize content learning in your Chemfolio with your team first. Labs are based on the assigned content from the module.</w:t>
-      </w:r>
-    </w:p>
-    <w:bookmarkEnd w:id="28"/>
-    <w:bookmarkEnd w:id="29"/>
-    <w:bookmarkStart w:id="31" w:name="about-your-instructor"/>
+    <w:bookmarkEnd w:id="21"/>
+    <w:bookmarkStart w:id="22" w:name="your-first-week"/>
+    <w:p>
+      <w:pPr>
+        <w:pStyle w:val="Heading2"/>
+      </w:pPr>
+      <w:r>
+        <w:t xml:space="preserve">Your First Week</w:t>
+      </w:r>
+    </w:p>
+    <w:p>
+      <w:pPr>
+        <w:numPr>
+          <w:ilvl w:val="0"/>
+          <w:numId w:val="1001"/>
+        </w:numPr>
+        <w:pStyle w:val="Compact"/>
+      </w:pPr>
+      <w:r>
+        <w:t xml:space="preserve">Attend your scheduled lab session. Missing it means being dropped from the course.</w:t>
+      </w:r>
+    </w:p>
+    <w:p>
+      <w:pPr>
+        <w:numPr>
+          <w:ilvl w:val="0"/>
+          <w:numId w:val="1001"/>
+        </w:numPr>
+        <w:pStyle w:val="Compact"/>
+      </w:pPr>
+      <w:r>
+        <w:t xml:space="preserve">Log into Canvas and read the announcements at the top of the course.</w:t>
+      </w:r>
+    </w:p>
+    <w:p>
+      <w:pPr>
+        <w:numPr>
+          <w:ilvl w:val="0"/>
+          <w:numId w:val="1001"/>
+        </w:numPr>
+        <w:pStyle w:val="Compact"/>
+      </w:pPr>
+      <w:r>
+        <w:t xml:space="preserve">Work through Module 0, including the ALEKS/Office/OneDrive setup guide — both need to be done by the end of your first lab, so budget the time.</w:t>
+      </w:r>
+    </w:p>
+    <w:p>
+      <w:pPr>
+        <w:numPr>
+          <w:ilvl w:val="0"/>
+          <w:numId w:val="1001"/>
+        </w:numPr>
+        <w:pStyle w:val="Compact"/>
+      </w:pPr>
+      <w:r>
+        <w:t xml:space="preserve">Read this syllabus, especially the Start Here box and the Course Agreements section.</w:t>
+      </w:r>
+    </w:p>
+    <w:p>
+      <w:pPr>
+        <w:numPr>
+          <w:ilvl w:val="0"/>
+          <w:numId w:val="1001"/>
+        </w:numPr>
+        <w:pStyle w:val="Compact"/>
+      </w:pPr>
+      <w:r>
+        <w:t xml:space="preserve">Confirm you have both your Chemfolio and lab manual from the Clark Bookstore before class — your first 3-2-1 team post is due that Wednesday.</w:t>
+      </w:r>
+    </w:p>
+    <w:bookmarkEnd w:id="22"/>
+    <w:bookmarkEnd w:id="23"/>
+    <w:bookmarkStart w:id="24" w:name="course-information"/>
     <w:p>
       <w:pPr>
         <w:pStyle w:val="Heading1"/>
       </w:pPr>
       <w:r>
-        <w:t xml:space="preserve">About Your Instructor</w:t>
+        <w:t xml:space="preserve">Course Information</w:t>
       </w:r>
     </w:p>
     <w:tbl>
       <w:tblPr>
         <w:tblStyle w:val="Table"/>
         <w:tblW w:type="pct" w:w="5000"/>
-        <w:tblLook w:firstRow="0" w:lastRow="0" w:firstColumn="0" w:lastColumn="0" w:noHBand="0" w:noVBand="0" w:val="0000"/>
+        <w:tblLook w:firstRow="1" w:lastRow="0" w:firstColumn="0" w:lastColumn="0" w:noHBand="0" w:noVBand="0" w:val="0020"/>
         <w:jc w:val="start"/>
       </w:tblPr>
       <w:tblGrid>
@@ -1419,6 +743,35 @@
         <w:gridCol w:w="3960"/>
       </w:tblGrid>
       <w:tr>
+        <w:trPr>
+          <w:tblHeader w:val="true"/>
+        </w:trPr>
+        <w:tc>
+          <w:tcPr/>
+          <w:p>
+            <w:pPr>
+              <w:pStyle w:val="Compact"/>
+              <w:jc w:val="left"/>
+            </w:pPr>
+            <w:r>
+              <w:t xml:space="preserve">Item</w:t>
+            </w:r>
+          </w:p>
+        </w:tc>
+        <w:tc>
+          <w:tcPr/>
+          <w:p>
+            <w:pPr>
+              <w:pStyle w:val="Compact"/>
+              <w:jc w:val="left"/>
+            </w:pPr>
+            <w:r>
+              <w:t xml:space="preserve">Details</w:t>
+            </w:r>
+          </w:p>
+        </w:tc>
+      </w:tr>
+      <w:tr>
         <w:tc>
           <w:tcPr/>
           <w:p>
@@ -1431,19 +784,19 @@
                 <w:bCs/>
                 <w:b/>
               </w:rPr>
-              <w:t xml:space="preserve">Instructor Name and pronouns</w:t>
-            </w:r>
-          </w:p>
-        </w:tc>
-        <w:tc>
-          <w:tcPr/>
-          <w:p>
-            <w:pPr>
-              <w:pStyle w:val="Compact"/>
-              <w:jc w:val="left"/>
-            </w:pPr>
-            <w:r>
-              <w:t xml:space="preserve">Dr. Karl Bailey, Ph.D. (he/him)</w:t>
+              <w:t xml:space="preserve">Course Title</w:t>
+            </w:r>
+          </w:p>
+        </w:tc>
+        <w:tc>
+          <w:tcPr/>
+          <w:p>
+            <w:pPr>
+              <w:pStyle w:val="Compact"/>
+              <w:jc w:val="left"/>
+            </w:pPr>
+            <w:r>
+              <w:t xml:space="preserve">CHEM&amp;121: Introduction to Chemistry (Pre-Health)</w:t>
             </w:r>
           </w:p>
         </w:tc>
@@ -1461,19 +814,19 @@
                 <w:bCs/>
                 <w:b/>
               </w:rPr>
-              <w:t xml:space="preserve">How I like to be addressed</w:t>
-            </w:r>
-          </w:p>
-        </w:tc>
-        <w:tc>
-          <w:tcPr/>
-          <w:p>
-            <w:pPr>
-              <w:pStyle w:val="Compact"/>
-              <w:jc w:val="left"/>
-            </w:pPr>
-            <w:r>
-              <w:t xml:space="preserve">Dr. B</w:t>
+              <w:t xml:space="preserve">Course Nbr/Sec</w:t>
+            </w:r>
+          </w:p>
+        </w:tc>
+        <w:tc>
+          <w:tcPr/>
+          <w:p>
+            <w:pPr>
+              <w:pStyle w:val="Compact"/>
+              <w:jc w:val="left"/>
+            </w:pPr>
+            <w:r>
+              <w:t xml:space="preserve">18405/18406, 18407/18408</w:t>
             </w:r>
           </w:p>
         </w:tc>
@@ -1491,19 +844,19 @@
                 <w:bCs/>
                 <w:b/>
               </w:rPr>
-              <w:t xml:space="preserve">Communication</w:t>
-            </w:r>
-          </w:p>
-        </w:tc>
-        <w:tc>
-          <w:tcPr/>
-          <w:p>
-            <w:pPr>
-              <w:pStyle w:val="Compact"/>
-              <w:jc w:val="left"/>
-            </w:pPr>
-            <w:r>
-              <w:t xml:space="preserve">Canvas Inbox only — I do not use email during the term. Not a current student? Reach me at kbailey@clark.edu or 360-992-2313.</w:t>
+              <w:t xml:space="preserve">Quarter/Year</w:t>
+            </w:r>
+          </w:p>
+        </w:tc>
+        <w:tc>
+          <w:tcPr/>
+          <w:p>
+            <w:pPr>
+              <w:pStyle w:val="Compact"/>
+              <w:jc w:val="left"/>
+            </w:pPr>
+            <w:r>
+              <w:t xml:space="preserve">Fall 2026 (September 21 – December 10, 2026)</w:t>
             </w:r>
           </w:p>
         </w:tc>
@@ -1521,19 +874,19 @@
                 <w:bCs/>
                 <w:b/>
               </w:rPr>
-              <w:t xml:space="preserve">Student Hours</w:t>
-            </w:r>
-          </w:p>
-        </w:tc>
-        <w:tc>
-          <w:tcPr/>
-          <w:p>
-            <w:pPr>
-              <w:pStyle w:val="Compact"/>
-              <w:jc w:val="left"/>
-            </w:pPr>
-            <w:r>
-              <w:t xml:space="preserve">Monday &amp; Wednesday, 1:00–2:00 PM and 4:00–5:00 PM (1 hour before each lab section)</w:t>
+              <w:t xml:space="preserve">Location/Time</w:t>
+            </w:r>
+          </w:p>
+        </w:tc>
+        <w:tc>
+          <w:tcPr/>
+          <w:p>
+            <w:pPr>
+              <w:pStyle w:val="Compact"/>
+              <w:jc w:val="left"/>
+            </w:pPr>
+            <w:r>
+              <w:t xml:space="preserve">Lab: STEM Building 222, Mo/We 2:00–3:50 PM (18405) or Mo/We 5:00–6:50 PM (18407). Lecture/discussion: online, asynchronous.</w:t>
             </w:r>
           </w:p>
         </w:tc>
@@ -1551,31 +904,196 @@
                 <w:bCs/>
                 <w:b/>
               </w:rPr>
-              <w:t xml:space="preserve">Preferred Mode of Communication</w:t>
-            </w:r>
-          </w:p>
-        </w:tc>
-        <w:tc>
-          <w:tcPr/>
-          <w:p>
-            <w:pPr>
-              <w:pStyle w:val="Compact"/>
-              <w:jc w:val="left"/>
-            </w:pPr>
-            <w:r>
-              <w:t xml:space="preserve">Canvas Inbox — I reply within 24 hours on weekdays.</w:t>
+              <w:t xml:space="preserve">Course Site</w:t>
+            </w:r>
+          </w:p>
+        </w:tc>
+        <w:tc>
+          <w:tcPr/>
+          <w:p>
+            <w:pPr>
+              <w:pStyle w:val="Compact"/>
+              <w:jc w:val="left"/>
+            </w:pPr>
+            <w:r>
+              <w:t xml:space="preserve">Canvas Learning Management System (clarkcollege.instructure.com)</w:t>
+            </w:r>
+          </w:p>
+        </w:tc>
+      </w:tr>
+      <w:tr>
+        <w:tc>
+          <w:tcPr/>
+          <w:p>
+            <w:pPr>
+              <w:pStyle w:val="Compact"/>
+              <w:jc w:val="left"/>
+            </w:pPr>
+            <w:r>
+              <w:rPr>
+                <w:bCs/>
+                <w:b/>
+              </w:rPr>
+              <w:t xml:space="preserve">Course Modality</w:t>
+            </w:r>
+          </w:p>
+        </w:tc>
+        <w:tc>
+          <w:tcPr/>
+          <w:p>
+            <w:pPr>
+              <w:pStyle w:val="Compact"/>
+              <w:jc w:val="left"/>
+            </w:pPr>
+            <w:r>
+              <w:t xml:space="preserve">Hybrid — asynchronous online lecture/discussion + biweekly on-campus lab</w:t>
+            </w:r>
+          </w:p>
+        </w:tc>
+      </w:tr>
+      <w:tr>
+        <w:tc>
+          <w:tcPr/>
+          <w:p>
+            <w:pPr>
+              <w:pStyle w:val="Compact"/>
+              <w:jc w:val="left"/>
+            </w:pPr>
+            <w:r>
+              <w:rPr>
+                <w:bCs/>
+                <w:b/>
+              </w:rPr>
+              <w:t xml:space="preserve">Credit Hours</w:t>
+            </w:r>
+          </w:p>
+        </w:tc>
+        <w:tc>
+          <w:tcPr/>
+          <w:p>
+            <w:pPr>
+              <w:pStyle w:val="Compact"/>
+              <w:jc w:val="left"/>
+            </w:pPr>
+            <w:r>
+              <w:t xml:space="preserve">5 credits (3.0 hours lecture-equivalent / 4.0 hours lab)</w:t>
+            </w:r>
+          </w:p>
+        </w:tc>
+      </w:tr>
+      <w:tr>
+        <w:tc>
+          <w:tcPr/>
+          <w:p>
+            <w:pPr>
+              <w:pStyle w:val="Compact"/>
+              <w:jc w:val="left"/>
+            </w:pPr>
+            <w:r>
+              <w:rPr>
+                <w:bCs/>
+                <w:b/>
+              </w:rPr>
+              <w:t xml:space="preserve">Prerequisites</w:t>
+            </w:r>
+          </w:p>
+        </w:tc>
+        <w:tc>
+          <w:tcPr/>
+          <w:p>
+            <w:pPr>
+              <w:pStyle w:val="Compact"/>
+              <w:jc w:val="left"/>
+            </w:pPr>
+            <w:r>
+              <w:t xml:space="preserve">MATH 96 (grade of</w:t>
+            </w:r>
+            <w:r>
+              <w:t xml:space="preserve"> </w:t>
+            </w:r>
+            <w:r>
+              <w:t xml:space="preserve">“</w:t>
+            </w:r>
+            <w:r>
+              <w:t xml:space="preserve">C</w:t>
+            </w:r>
+            <w:r>
+              <w:t xml:space="preserve">”</w:t>
+            </w:r>
+            <w:r>
+              <w:t xml:space="preserve"> </w:t>
+            </w:r>
+            <w:r>
+              <w:t xml:space="preserve">or higher), or placement into Math level 45.</w:t>
+            </w:r>
+          </w:p>
+        </w:tc>
+      </w:tr>
+      <w:tr>
+        <w:tc>
+          <w:tcPr/>
+          <w:p>
+            <w:pPr>
+              <w:pStyle w:val="Compact"/>
+              <w:jc w:val="left"/>
+            </w:pPr>
+            <w:r>
+              <w:rPr>
+                <w:bCs/>
+                <w:b/>
+              </w:rPr>
+              <w:t xml:space="preserve">Course Description</w:t>
+            </w:r>
+          </w:p>
+        </w:tc>
+        <w:tc>
+          <w:tcPr/>
+          <w:p>
+            <w:pPr>
+              <w:pStyle w:val="Compact"/>
+              <w:jc w:val="left"/>
+            </w:pPr>
+            <w:r>
+              <w:rPr>
+                <w:bCs/>
+                <w:b/>
+              </w:rPr>
+              <w:t xml:space="preserve">What the catalog says:</w:t>
+            </w:r>
+            <w:r>
+              <w:t xml:space="preserve"> </w:t>
+            </w:r>
+            <w:r>
+              <w:t xml:space="preserve">Topics in general chemistry applicable to students seeking a 2-year degree in the health-occupations fields. Unit-factor method is applied to problem solving. Topics covered include units of measurement, atomic structure, chemical bonding, energy, the mole concept, nomenclature of inorganic compounds, writing and balancing equations, properties of gases, solutions and colloids, reaction rates and equilibrium, acids, bases and salts, radiation and health.</w:t>
+            </w:r>
+            <w:r>
+              <w:t xml:space="preserve"> </w:t>
+            </w:r>
+            <w:r>
+              <w:rPr>
+                <w:bCs/>
+                <w:b/>
+              </w:rPr>
+              <w:t xml:space="preserve">What that means in practice:</w:t>
+            </w:r>
+            <w:r>
+              <w:t xml:space="preserve"> </w:t>
+            </w:r>
+            <w:r>
+              <w:t xml:space="preserve">You’ll learn to think like a health professional needs to think about chemistry — using math and unit conversions to solve real clinical-style problems, not just memorizing facts. Expect this course to feel like a math class and a foreign-language class rolled together: we use conversions from day one, every week, in both discussion and lab.</w:t>
             </w:r>
           </w:p>
         </w:tc>
       </w:tr>
     </w:tbl>
-    <w:bookmarkStart w:id="30" w:name="what-can-you-expect-from-me"/>
-    <w:p>
-      <w:pPr>
-        <w:pStyle w:val="Heading2"/>
-      </w:pPr>
-      <w:r>
-        <w:t xml:space="preserve">What can you expect from me?</w:t>
+    <w:bookmarkEnd w:id="24"/>
+    <w:bookmarkStart w:id="29" w:name="welcome-to-class"/>
+    <w:p>
+      <w:pPr>
+        <w:pStyle w:val="Heading1"/>
+      </w:pPr>
+      <w:r>
+        <w:t xml:space="preserve">Welcome to Class!</w:t>
       </w:r>
     </w:p>
     <w:p>
@@ -1583,63 +1101,661 @@
         <w:pStyle w:val="FirstParagraph"/>
       </w:pPr>
       <w:r>
-        <w:t xml:space="preserve">I’ve spent more than 25 years building and refining active-learning chemistry courses — including pioneering asynchronous online POGIL (Process Oriented Guided Inquiry Learning) before it was common practice. Struggling at first is normal; stick with it, ask questions, and you’ll find your footing. I’ve designed everything with you in mind, and I respond to Canvas messages within 24 hours on weekdays.</w:t>
-      </w:r>
-    </w:p>
-    <w:p>
-      <w:pPr>
-        <w:pStyle w:val="BodyText"/>
-      </w:pPr>
+        <w:t xml:space="preserve">Welcome, welcome, welcome! I’m Dr. B (Dr. Karl Bailey, he/him), and I’m so glad to be your Chemistry instructor this term. However you landed in this course, I’m glad you’re here — let’s get into how it actually runs, week to week.</w:t>
+      </w:r>
+    </w:p>
+    <w:p>
+      <w:pPr>
+        <w:pStyle w:val="BlockText"/>
+      </w:pPr>
+      <w:r>
+        <w:rPr>
+          <w:bCs/>
+          <w:b/>
+        </w:rPr>
+        <w:t xml:space="preserve">Dr. B’s Note:</w:t>
+      </w:r>
+      <w:r>
+        <w:t xml:space="preserve"> </w:t>
+      </w:r>
       <w:r>
         <w:rPr>
           <w:iCs/>
           <w:i/>
         </w:rPr>
-        <w:t xml:space="preserve">“</w:t>
+        <w:t xml:space="preserve">Most students who stick with the weekly rhythm and stay engaged do well. The difference isn’t talent, it’s showing up consistently. Give yourself a fighting chance.</w:t>
+      </w:r>
+    </w:p>
+    <w:bookmarkStart w:id="25" w:name="Xe66c6beb7eb2ec0e95c71e590f49bdb9df56704"/>
+    <w:p>
+      <w:pPr>
+        <w:pStyle w:val="Heading2"/>
+      </w:pPr>
+      <w:r>
+        <w:t xml:space="preserve">What preparation/skills do I need for this class?</w:t>
+      </w:r>
+    </w:p>
+    <w:p>
+      <w:pPr>
+        <w:pStyle w:val="FirstParagraph"/>
+      </w:pPr>
+      <w:r>
+        <w:t xml:space="preserve">CHEM is a math class combined with a foreign language course, and we move fast. We use math conversions from day one and keep using them every week, in both discussion and lab. If your math skills need more than a light dusting-off, consider brushing up before or alongside this course — most students taking CHEM&amp;121 find the math the hardest part, not the chemistry itself.</w:t>
+      </w:r>
+    </w:p>
+    <w:bookmarkEnd w:id="25"/>
+    <w:bookmarkStart w:id="26" w:name="what-can-i-expect-in-class"/>
+    <w:p>
+      <w:pPr>
+        <w:pStyle w:val="Heading2"/>
+      </w:pPr>
+      <w:r>
+        <w:t xml:space="preserve">What can I expect in class?</w:t>
+      </w:r>
+    </w:p>
+    <w:p>
+      <w:pPr>
+        <w:pStyle w:val="FirstParagraph"/>
+      </w:pPr>
+      <w:r>
+        <w:t xml:space="preserve">This course is entirely discussion-based online — there are no traditional lectures. Instead, you’ll work through weekly Activities from your Chemfolio in a 3-2-1 Team Discussion format and apply what you’re learning hands-on in your required weekly on-campus labs. Labs involve real data collection and analysis, not cookbook steps — more on exactly how in Weekly Flow and the Grading section below.</w:t>
+      </w:r>
+    </w:p>
+    <w:p>
+      <w:pPr>
+        <w:pStyle w:val="BlockText"/>
+      </w:pPr>
+      <w:r>
+        <w:rPr>
+          <w:bCs/>
+          <w:b/>
+        </w:rPr>
+        <w:t xml:space="preserve">Dr. B’s Note:</w:t>
+      </w:r>
+      <w:r>
+        <w:t xml:space="preserve"> </w:t>
       </w:r>
       <w:r>
         <w:rPr>
           <w:iCs/>
           <w:i/>
         </w:rPr>
-        <w:t xml:space="preserve">Our job as educators is not to prepare you for the real world. You already live in the real world.</w:t>
-      </w:r>
-      <w:r>
-        <w:rPr>
-          <w:iCs/>
-          <w:i/>
-        </w:rPr>
-        <w:t xml:space="preserve">”</w:t>
-      </w:r>
-      <w:r>
-        <w:t xml:space="preserve"> </w:t>
-      </w:r>
-      <w:r>
-        <w:t xml:space="preserve">— Dr. B</w:t>
-      </w:r>
-    </w:p>
-    <w:bookmarkEnd w:id="30"/>
-    <w:bookmarkEnd w:id="31"/>
-    <w:bookmarkStart w:id="32" w:name="what-course-materials-will-i-need"/>
-    <w:p>
-      <w:pPr>
-        <w:pStyle w:val="Heading1"/>
-      </w:pPr>
-      <w:r>
-        <w:t xml:space="preserve">What Course Materials Will I Need?</w:t>
+        <w:t xml:space="preserve">If you’ve taken a science course before, don’t assume this one works the same way: there are no traditional lectures, quizzes happen in person during lab, and labs are real science, not a recipe to follow. More on exactly how below.</w:t>
+      </w:r>
+    </w:p>
+    <w:bookmarkEnd w:id="26"/>
+    <w:bookmarkStart w:id="27" w:name="what-if-i-need-an-accommodation"/>
+    <w:p>
+      <w:pPr>
+        <w:pStyle w:val="Heading2"/>
+      </w:pPr>
+      <w:r>
+        <w:t xml:space="preserve">What if I need an accommodation?</w:t>
+      </w:r>
+    </w:p>
+    <w:p>
+      <w:pPr>
+        <w:pStyle w:val="FirstParagraph"/>
+      </w:pPr>
+      <w:r>
+        <w:t xml:space="preserve">Clark College and the Disability Access Center (DAC) office assist students with disabilities in pursuing their educational goals. DAC can provide classroom accommodations, as well as serve as a resource to the campus community in striving to make Clark College both an accessible and hospitable place for students with disabilities. Interested in getting accommodations? Begin with viewing the steps for requesting accommodations at clark.edu/dac.</w:t>
+      </w:r>
+    </w:p>
+    <w:bookmarkEnd w:id="27"/>
+    <w:bookmarkStart w:id="28" w:name="weekly-flow"/>
+    <w:p>
+      <w:pPr>
+        <w:pStyle w:val="Heading2"/>
+      </w:pPr>
+      <w:r>
+        <w:t xml:space="preserve">Weekly Flow</w:t>
+      </w:r>
+    </w:p>
+    <w:p>
+      <w:pPr>
+        <w:pStyle w:val="FirstParagraph"/>
+      </w:pPr>
+      <w:r>
+        <w:t xml:space="preserve">Canvas Modules are your home base. This rhythm repeats every module — once you know this table, you know the whole term.</w:t>
       </w:r>
     </w:p>
     <w:tbl>
       <w:tblPr>
         <w:tblStyle w:val="Table"/>
         <w:tblW w:type="pct" w:w="5000"/>
-        <w:tblLook w:firstRow="0" w:lastRow="0" w:firstColumn="0" w:lastColumn="0" w:noHBand="0" w:noVBand="0" w:val="0000"/>
+        <w:tblLook w:firstRow="1" w:lastRow="0" w:firstColumn="0" w:lastColumn="0" w:noHBand="0" w:noVBand="0" w:val="0020"/>
         <w:jc w:val="start"/>
       </w:tblPr>
       <w:tblGrid>
         <w:gridCol w:w="3960"/>
         <w:gridCol w:w="3960"/>
       </w:tblGrid>
+      <w:tr>
+        <w:trPr>
+          <w:tblHeader w:val="true"/>
+        </w:trPr>
+        <w:tc>
+          <w:tcPr/>
+          <w:p>
+            <w:pPr>
+              <w:pStyle w:val="Compact"/>
+              <w:jc w:val="left"/>
+            </w:pPr>
+            <w:r>
+              <w:t xml:space="preserve">Day</w:t>
+            </w:r>
+          </w:p>
+        </w:tc>
+        <w:tc>
+          <w:tcPr/>
+          <w:p>
+            <w:pPr>
+              <w:pStyle w:val="Compact"/>
+              <w:jc w:val="left"/>
+            </w:pPr>
+            <w:r>
+              <w:t xml:space="preserve">What’s due</w:t>
+            </w:r>
+          </w:p>
+        </w:tc>
+      </w:tr>
+      <w:tr>
+        <w:tc>
+          <w:tcPr/>
+          <w:p>
+            <w:pPr>
+              <w:pStyle w:val="Compact"/>
+              <w:jc w:val="left"/>
+            </w:pPr>
+            <w:r>
+              <w:t xml:space="preserve">Monday</w:t>
+            </w:r>
+          </w:p>
+        </w:tc>
+        <w:tc>
+          <w:tcPr/>
+          <w:p>
+            <w:pPr>
+              <w:pStyle w:val="Compact"/>
+              <w:jc w:val="left"/>
+            </w:pPr>
+            <w:r>
+              <w:t xml:space="preserve">New module opens</w:t>
+            </w:r>
+          </w:p>
+        </w:tc>
+      </w:tr>
+      <w:tr>
+        <w:tc>
+          <w:tcPr/>
+          <w:p>
+            <w:pPr>
+              <w:pStyle w:val="Compact"/>
+              <w:jc w:val="left"/>
+            </w:pPr>
+            <w:r>
+              <w:t xml:space="preserve">Tuesday</w:t>
+            </w:r>
+          </w:p>
+        </w:tc>
+        <w:tc>
+          <w:tcPr/>
+          <w:p>
+            <w:pPr>
+              <w:pStyle w:val="Compact"/>
+              <w:jc w:val="left"/>
+            </w:pPr>
+            <w:r>
+              <w:t xml:space="preserve">OOL (Outside Of Lecture) discussion post due</w:t>
+            </w:r>
+          </w:p>
+        </w:tc>
+      </w:tr>
+      <w:tr>
+        <w:tc>
+          <w:tcPr/>
+          <w:p>
+            <w:pPr>
+              <w:pStyle w:val="Compact"/>
+              <w:jc w:val="left"/>
+            </w:pPr>
+            <w:r>
+              <w:t xml:space="preserve">Wednesday</w:t>
+            </w:r>
+          </w:p>
+        </w:tc>
+        <w:tc>
+          <w:tcPr/>
+          <w:p>
+            <w:pPr>
+              <w:pStyle w:val="Compact"/>
+              <w:jc w:val="left"/>
+            </w:pPr>
+            <w:r>
+              <w:t xml:space="preserve">First 3-2-1 Team discussion post due</w:t>
+            </w:r>
+          </w:p>
+        </w:tc>
+      </w:tr>
+      <w:tr>
+        <w:tc>
+          <w:tcPr/>
+          <w:p>
+            <w:pPr>
+              <w:pStyle w:val="Compact"/>
+              <w:jc w:val="left"/>
+            </w:pPr>
+            <w:r>
+              <w:t xml:space="preserve">Thursday</w:t>
+            </w:r>
+          </w:p>
+        </w:tc>
+        <w:tc>
+          <w:tcPr/>
+          <w:p>
+            <w:pPr>
+              <w:pStyle w:val="Compact"/>
+              <w:jc w:val="left"/>
+            </w:pPr>
+            <w:r>
+              <w:t xml:space="preserve">OOL replies due</w:t>
+            </w:r>
+          </w:p>
+        </w:tc>
+      </w:tr>
+      <w:tr>
+        <w:tc>
+          <w:tcPr/>
+          <w:p>
+            <w:pPr>
+              <w:pStyle w:val="Compact"/>
+              <w:jc w:val="left"/>
+            </w:pPr>
+            <w:r>
+              <w:t xml:space="preserve">Friday</w:t>
+            </w:r>
+          </w:p>
+        </w:tc>
+        <w:tc>
+          <w:tcPr/>
+          <w:p>
+            <w:pPr>
+              <w:pStyle w:val="Compact"/>
+              <w:jc w:val="left"/>
+            </w:pPr>
+            <w:r>
+              <w:t xml:space="preserve">Lab Intro upload due</w:t>
+            </w:r>
+          </w:p>
+        </w:tc>
+      </w:tr>
+      <w:tr>
+        <w:tc>
+          <w:tcPr/>
+          <w:p>
+            <w:pPr>
+              <w:pStyle w:val="Compact"/>
+              <w:jc w:val="left"/>
+            </w:pPr>
+            <w:r>
+              <w:t xml:space="preserve">Sunday</w:t>
+            </w:r>
+          </w:p>
+        </w:tc>
+        <w:tc>
+          <w:tcPr/>
+          <w:p>
+            <w:pPr>
+              <w:pStyle w:val="Compact"/>
+              <w:jc w:val="left"/>
+            </w:pPr>
+            <w:r>
+              <w:t xml:space="preserve">Second 3-2-1 Team post + replies to all 3 teammates, ALEKS homework, OOL template upload, Lab Results &amp; Analysis, and Lab Discussion &amp; Conclusions template upload — all due</w:t>
+            </w:r>
+          </w:p>
+        </w:tc>
+      </w:tr>
+    </w:tbl>
+    <w:p>
+      <w:pPr>
+        <w:pStyle w:val="BodyText"/>
+      </w:pPr>
+      <w:r>
+        <w:t xml:space="preserve">Attend lab both days assigned in your schedule.</w:t>
+      </w:r>
+    </w:p>
+    <w:p>
+      <w:pPr>
+        <w:pStyle w:val="BodyText"/>
+      </w:pPr>
+      <w:r>
+        <w:t xml:space="preserve">Quizzes are the one exception to this weekly pattern — they’re in-person during lab, tentatively Weeks 3, 5, 6, 9, and 11 only.</w:t>
+      </w:r>
+    </w:p>
+    <w:p>
+      <w:pPr>
+        <w:pStyle w:val="BlockText"/>
+      </w:pPr>
+      <w:r>
+        <w:rPr>
+          <w:bCs/>
+          <w:b/>
+        </w:rPr>
+        <w:t xml:space="preserve">Dr. B’s Note:</w:t>
+      </w:r>
+      <w:r>
+        <w:t xml:space="preserve"> </w:t>
+      </w:r>
+      <w:r>
+        <w:rPr>
+          <w:iCs/>
+          <w:i/>
+        </w:rPr>
+        <w:t xml:space="preserve">Prioritize content learning in your Chemfolio with your team first. Labs are based on the assigned content from the module.</w:t>
+      </w:r>
+    </w:p>
+    <w:bookmarkEnd w:id="28"/>
+    <w:bookmarkEnd w:id="29"/>
+    <w:bookmarkStart w:id="31" w:name="about-your-instructor"/>
+    <w:p>
+      <w:pPr>
+        <w:pStyle w:val="Heading1"/>
+      </w:pPr>
+      <w:r>
+        <w:t xml:space="preserve">About Your Instructor</w:t>
+      </w:r>
+    </w:p>
+    <w:tbl>
+      <w:tblPr>
+        <w:tblStyle w:val="Table"/>
+        <w:tblW w:type="pct" w:w="5000"/>
+        <w:tblLook w:firstRow="1" w:lastRow="0" w:firstColumn="0" w:lastColumn="0" w:noHBand="0" w:noVBand="0" w:val="0020"/>
+        <w:jc w:val="start"/>
+      </w:tblPr>
+      <w:tblGrid>
+        <w:gridCol w:w="3960"/>
+        <w:gridCol w:w="3960"/>
+      </w:tblGrid>
+      <w:tr>
+        <w:trPr>
+          <w:tblHeader w:val="true"/>
+        </w:trPr>
+        <w:tc>
+          <w:tcPr/>
+          <w:p>
+            <w:pPr>
+              <w:pStyle w:val="Compact"/>
+              <w:jc w:val="left"/>
+            </w:pPr>
+            <w:r>
+              <w:t xml:space="preserve">Item</w:t>
+            </w:r>
+          </w:p>
+        </w:tc>
+        <w:tc>
+          <w:tcPr/>
+          <w:p>
+            <w:pPr>
+              <w:pStyle w:val="Compact"/>
+              <w:jc w:val="left"/>
+            </w:pPr>
+            <w:r>
+              <w:t xml:space="preserve">Details</w:t>
+            </w:r>
+          </w:p>
+        </w:tc>
+      </w:tr>
+      <w:tr>
+        <w:tc>
+          <w:tcPr/>
+          <w:p>
+            <w:pPr>
+              <w:pStyle w:val="Compact"/>
+              <w:jc w:val="left"/>
+            </w:pPr>
+            <w:r>
+              <w:rPr>
+                <w:bCs/>
+                <w:b/>
+              </w:rPr>
+              <w:t xml:space="preserve">Instructor Name and pronouns</w:t>
+            </w:r>
+          </w:p>
+        </w:tc>
+        <w:tc>
+          <w:tcPr/>
+          <w:p>
+            <w:pPr>
+              <w:pStyle w:val="Compact"/>
+              <w:jc w:val="left"/>
+            </w:pPr>
+            <w:r>
+              <w:t xml:space="preserve">Dr. Karl Bailey, Ph.D. (he/him)</w:t>
+            </w:r>
+          </w:p>
+        </w:tc>
+      </w:tr>
+      <w:tr>
+        <w:tc>
+          <w:tcPr/>
+          <w:p>
+            <w:pPr>
+              <w:pStyle w:val="Compact"/>
+              <w:jc w:val="left"/>
+            </w:pPr>
+            <w:r>
+              <w:rPr>
+                <w:bCs/>
+                <w:b/>
+              </w:rPr>
+              <w:t xml:space="preserve">How I like to be addressed</w:t>
+            </w:r>
+          </w:p>
+        </w:tc>
+        <w:tc>
+          <w:tcPr/>
+          <w:p>
+            <w:pPr>
+              <w:pStyle w:val="Compact"/>
+              <w:jc w:val="left"/>
+            </w:pPr>
+            <w:r>
+              <w:t xml:space="preserve">Dr. B</w:t>
+            </w:r>
+          </w:p>
+        </w:tc>
+      </w:tr>
+      <w:tr>
+        <w:tc>
+          <w:tcPr/>
+          <w:p>
+            <w:pPr>
+              <w:pStyle w:val="Compact"/>
+              <w:jc w:val="left"/>
+            </w:pPr>
+            <w:r>
+              <w:rPr>
+                <w:bCs/>
+                <w:b/>
+              </w:rPr>
+              <w:t xml:space="preserve">Communication</w:t>
+            </w:r>
+          </w:p>
+        </w:tc>
+        <w:tc>
+          <w:tcPr/>
+          <w:p>
+            <w:pPr>
+              <w:pStyle w:val="Compact"/>
+              <w:jc w:val="left"/>
+            </w:pPr>
+            <w:r>
+              <w:t xml:space="preserve">Canvas Inbox only — I do not use email during the term. Not a current student? Reach me at kbailey@clark.edu or 360-992-2313.</w:t>
+            </w:r>
+          </w:p>
+        </w:tc>
+      </w:tr>
+      <w:tr>
+        <w:tc>
+          <w:tcPr/>
+          <w:p>
+            <w:pPr>
+              <w:pStyle w:val="Compact"/>
+              <w:jc w:val="left"/>
+            </w:pPr>
+            <w:r>
+              <w:rPr>
+                <w:bCs/>
+                <w:b/>
+              </w:rPr>
+              <w:t xml:space="preserve">Student Hours</w:t>
+            </w:r>
+          </w:p>
+        </w:tc>
+        <w:tc>
+          <w:tcPr/>
+          <w:p>
+            <w:pPr>
+              <w:pStyle w:val="Compact"/>
+              <w:jc w:val="left"/>
+            </w:pPr>
+            <w:r>
+              <w:t xml:space="preserve">Monday &amp; Wednesday, 1:00–2:00 PM and 4:00–5:00 PM (1 hour before each lab section)</w:t>
+            </w:r>
+          </w:p>
+        </w:tc>
+      </w:tr>
+      <w:tr>
+        <w:tc>
+          <w:tcPr/>
+          <w:p>
+            <w:pPr>
+              <w:pStyle w:val="Compact"/>
+              <w:jc w:val="left"/>
+            </w:pPr>
+            <w:r>
+              <w:rPr>
+                <w:bCs/>
+                <w:b/>
+              </w:rPr>
+              <w:t xml:space="preserve">Preferred Mode of Communication</w:t>
+            </w:r>
+          </w:p>
+        </w:tc>
+        <w:tc>
+          <w:tcPr/>
+          <w:p>
+            <w:pPr>
+              <w:pStyle w:val="Compact"/>
+              <w:jc w:val="left"/>
+            </w:pPr>
+            <w:r>
+              <w:t xml:space="preserve">Canvas Inbox — I reply within 24 hours on weekdays.</w:t>
+            </w:r>
+          </w:p>
+        </w:tc>
+      </w:tr>
+    </w:tbl>
+    <w:bookmarkStart w:id="30" w:name="what-can-you-expect-from-me"/>
+    <w:p>
+      <w:pPr>
+        <w:pStyle w:val="Heading2"/>
+      </w:pPr>
+      <w:r>
+        <w:t xml:space="preserve">What can you expect from me?</w:t>
+      </w:r>
+    </w:p>
+    <w:p>
+      <w:pPr>
+        <w:pStyle w:val="FirstParagraph"/>
+      </w:pPr>
+      <w:r>
+        <w:t xml:space="preserve">I’ve spent more than 25 years building and refining active-learning chemistry courses — including pioneering asynchronous online POGIL (Process Oriented Guided Inquiry Learning) before it was common practice. Struggling at first is normal; stick with it, ask questions, and you’ll find your footing. I’ve designed everything with you in mind, and I respond to Canvas messages within 24 hours on weekdays.</w:t>
+      </w:r>
+    </w:p>
+    <w:p>
+      <w:pPr>
+        <w:pStyle w:val="BodyText"/>
+      </w:pPr>
+      <w:r>
+        <w:rPr>
+          <w:iCs/>
+          <w:i/>
+        </w:rPr>
+        <w:t xml:space="preserve">“</w:t>
+      </w:r>
+      <w:r>
+        <w:rPr>
+          <w:iCs/>
+          <w:i/>
+        </w:rPr>
+        <w:t xml:space="preserve">Our job as educators is not to prepare you for the real world. You already live in the real world.</w:t>
+      </w:r>
+      <w:r>
+        <w:rPr>
+          <w:iCs/>
+          <w:i/>
+        </w:rPr>
+        <w:t xml:space="preserve">”</w:t>
+      </w:r>
+      <w:r>
+        <w:t xml:space="preserve"> </w:t>
+      </w:r>
+      <w:r>
+        <w:t xml:space="preserve">— Dr. B</w:t>
+      </w:r>
+    </w:p>
+    <w:bookmarkEnd w:id="30"/>
+    <w:bookmarkEnd w:id="31"/>
+    <w:bookmarkStart w:id="32" w:name="what-course-materials-will-i-need"/>
+    <w:p>
+      <w:pPr>
+        <w:pStyle w:val="Heading1"/>
+      </w:pPr>
+      <w:r>
+        <w:t xml:space="preserve">What Course Materials Will I Need?</w:t>
+      </w:r>
+    </w:p>
+    <w:tbl>
+      <w:tblPr>
+        <w:tblStyle w:val="Table"/>
+        <w:tblW w:type="pct" w:w="5000"/>
+        <w:tblLook w:firstRow="1" w:lastRow="0" w:firstColumn="0" w:lastColumn="0" w:noHBand="0" w:noVBand="0" w:val="0020"/>
+        <w:jc w:val="start"/>
+      </w:tblPr>
+      <w:tblGrid>
+        <w:gridCol w:w="3960"/>
+        <w:gridCol w:w="3960"/>
+      </w:tblGrid>
+      <w:tr>
+        <w:trPr>
+          <w:tblHeader w:val="true"/>
+        </w:trPr>
+        <w:tc>
+          <w:tcPr/>
+          <w:p>
+            <w:pPr>
+              <w:pStyle w:val="Compact"/>
+              <w:jc w:val="left"/>
+            </w:pPr>
+            <w:r>
+              <w:t xml:space="preserve">Item</w:t>
+            </w:r>
+          </w:p>
+        </w:tc>
+        <w:tc>
+          <w:tcPr/>
+          <w:p>
+            <w:pPr>
+              <w:pStyle w:val="Compact"/>
+              <w:jc w:val="left"/>
+            </w:pPr>
+            <w:r>
+              <w:t xml:space="preserve">Details</w:t>
+            </w:r>
+          </w:p>
+        </w:tc>
+      </w:tr>
       <w:tr>
         <w:tc>
           <w:tcPr/>
@@ -3332,7 +3448,7 @@
       <w:tblPr>
         <w:tblStyle w:val="Table"/>
         <w:tblW w:type="pct" w:w="5000"/>
-        <w:tblLook w:firstRow="0" w:lastRow="0" w:firstColumn="0" w:lastColumn="0" w:noHBand="0" w:noVBand="0" w:val="0000"/>
+        <w:tblLook w:firstRow="1" w:lastRow="0" w:firstColumn="0" w:lastColumn="0" w:noHBand="0" w:noVBand="0" w:val="0020"/>
         <w:jc w:val="start"/>
       </w:tblPr>
       <w:tblGrid>
@@ -3340,6 +3456,35 @@
         <w:gridCol w:w="3960"/>
       </w:tblGrid>
       <w:tr>
+        <w:trPr>
+          <w:tblHeader w:val="true"/>
+        </w:trPr>
+        <w:tc>
+          <w:tcPr/>
+          <w:p>
+            <w:pPr>
+              <w:pStyle w:val="Compact"/>
+              <w:jc w:val="left"/>
+            </w:pPr>
+            <w:r>
+              <w:t xml:space="preserve">Item</w:t>
+            </w:r>
+          </w:p>
+        </w:tc>
+        <w:tc>
+          <w:tcPr/>
+          <w:p>
+            <w:pPr>
+              <w:pStyle w:val="Compact"/>
+              <w:jc w:val="left"/>
+            </w:pPr>
+            <w:r>
+              <w:t xml:space="preserve">Details</w:t>
+            </w:r>
+          </w:p>
+        </w:tc>
+      </w:tr>
+      <w:tr>
         <w:tc>
           <w:tcPr/>
           <w:p>
@@ -3462,7 +3607,7 @@
       <w:tblPr>
         <w:tblStyle w:val="Table"/>
         <w:tblW w:type="pct" w:w="5000"/>
-        <w:tblLook w:firstRow="0" w:lastRow="0" w:firstColumn="0" w:lastColumn="0" w:noHBand="0" w:noVBand="0" w:val="0000"/>
+        <w:tblLook w:firstRow="1" w:lastRow="0" w:firstColumn="0" w:lastColumn="0" w:noHBand="0" w:noVBand="0" w:val="0020"/>
         <w:jc w:val="start"/>
       </w:tblPr>
       <w:tblGrid>
@@ -3470,6 +3615,35 @@
         <w:gridCol w:w="3960"/>
       </w:tblGrid>
       <w:tr>
+        <w:trPr>
+          <w:tblHeader w:val="true"/>
+        </w:trPr>
+        <w:tc>
+          <w:tcPr/>
+          <w:p>
+            <w:pPr>
+              <w:pStyle w:val="Compact"/>
+              <w:jc w:val="left"/>
+            </w:pPr>
+            <w:r>
+              <w:t xml:space="preserve">Item</w:t>
+            </w:r>
+          </w:p>
+        </w:tc>
+        <w:tc>
+          <w:tcPr/>
+          <w:p>
+            <w:pPr>
+              <w:pStyle w:val="Compact"/>
+              <w:jc w:val="left"/>
+            </w:pPr>
+            <w:r>
+              <w:t xml:space="preserve">Details</w:t>
+            </w:r>
+          </w:p>
+        </w:tc>
+      </w:tr>
+      <w:tr>
         <w:tc>
           <w:tcPr/>
           <w:p>
@@ -3574,13 +3748,42 @@
       <w:tblPr>
         <w:tblStyle w:val="Table"/>
         <w:tblW w:type="pct" w:w="5000"/>
-        <w:tblLook w:firstRow="0" w:lastRow="0" w:firstColumn="0" w:lastColumn="0" w:noHBand="0" w:noVBand="0" w:val="0000"/>
+        <w:tblLook w:firstRow="1" w:lastRow="0" w:firstColumn="0" w:lastColumn="0" w:noHBand="0" w:noVBand="0" w:val="0020"/>
         <w:jc w:val="start"/>
       </w:tblPr>
       <w:tblGrid>
         <w:gridCol w:w="3960"/>
         <w:gridCol w:w="3960"/>
       </w:tblGrid>
+      <w:tr>
+        <w:trPr>
+          <w:tblHeader w:val="true"/>
+        </w:trPr>
+        <w:tc>
+          <w:tcPr/>
+          <w:p>
+            <w:pPr>
+              <w:pStyle w:val="Compact"/>
+              <w:jc w:val="left"/>
+            </w:pPr>
+            <w:r>
+              <w:t xml:space="preserve">Item</w:t>
+            </w:r>
+          </w:p>
+        </w:tc>
+        <w:tc>
+          <w:tcPr/>
+          <w:p>
+            <w:pPr>
+              <w:pStyle w:val="Compact"/>
+              <w:jc w:val="left"/>
+            </w:pPr>
+            <w:r>
+              <w:t xml:space="preserve">Details</w:t>
+            </w:r>
+          </w:p>
+        </w:tc>
+      </w:tr>
       <w:tr>
         <w:tc>
           <w:tcPr/>

</xml_diff>

<commit_message>
Revise syllabus content and fix header copy buttons
- Add TL;DR summaries throughout CHEM121/131 content
- Revise AI-use policy language, tone, and communication sections
- Fix D grade cutoff (63-70 -> 63-71)
- app.js: populate both header and body copy-button groups
  (previously only the body one was wired up)

Co-Authored-By: Claude Sonnet 5 <noreply@anthropic.com>
</commit_message>
<xml_diff>
--- a/downloads/CHEM121_Syllabus_Fall2026.docx
+++ b/downloads/CHEM121_Syllabus_Fall2026.docx
@@ -1067,9 +1067,6 @@
               <w:t xml:space="preserve">Topics in general chemistry applicable to students seeking a 2-year degree in the health-occupations fields. Unit-factor method is applied to problem solving. Topics covered include units of measurement, atomic structure, chemical bonding, energy, the mole concept, nomenclature of inorganic compounds, writing and balancing equations, properties of gases, solutions and colloids, reaction rates and equilibrium, acids, bases and salts, radiation and health.</w:t>
             </w:r>
             <w:r>
-              <w:t xml:space="preserve"> </w:t>
-            </w:r>
-            <w:r>
               <w:rPr>
                 <w:bCs/>
                 <w:b/>
@@ -1101,6 +1098,24 @@
         <w:pStyle w:val="FirstParagraph"/>
       </w:pPr>
       <w:r>
+        <w:rPr>
+          <w:bCs/>
+          <w:b/>
+        </w:rPr>
+        <w:t xml:space="preserve">TL;DR:</w:t>
+      </w:r>
+      <w:r>
+        <w:t xml:space="preserve"> </w:t>
+      </w:r>
+      <w:r>
+        <w:t xml:space="preserve">No lectures — everything happens through weekly team discussions and hands-on labs. Show up, stay engaged, and ask for help before you’re stuck.</w:t>
+      </w:r>
+    </w:p>
+    <w:p>
+      <w:pPr>
+        <w:pStyle w:val="BodyText"/>
+      </w:pPr>
+      <w:r>
         <w:t xml:space="preserve">Welcome, welcome, welcome! I’m Dr. B (Dr. Karl Bailey, he/him), and I’m so glad to be your Chemistry instructor this term. However you landed in this course, I’m glad you’re here — let’s get into how it actually runs, week to week.</w:t>
       </w:r>
     </w:p>
@@ -1214,6 +1229,24 @@
     <w:p>
       <w:pPr>
         <w:pStyle w:val="FirstParagraph"/>
+      </w:pPr>
+      <w:r>
+        <w:rPr>
+          <w:bCs/>
+          <w:b/>
+        </w:rPr>
+        <w:t xml:space="preserve">TL;DR:</w:t>
+      </w:r>
+      <w:r>
+        <w:t xml:space="preserve"> </w:t>
+      </w:r>
+      <w:r>
+        <w:t xml:space="preserve">Something is due nearly every day, Tuesday through Sunday — same pattern every week once you learn it.</w:t>
+      </w:r>
+    </w:p>
+    <w:p>
+      <w:pPr>
+        <w:pStyle w:val="BodyText"/>
       </w:pPr>
       <w:r>
         <w:t xml:space="preserve">Canvas Modules are your home base. This rhythm repeats every module — once you know this table, you know the whole term.</w:t>
@@ -1465,6 +1498,24 @@
         <w:t xml:space="preserve">About Your Instructor</w:t>
       </w:r>
     </w:p>
+    <w:p>
+      <w:pPr>
+        <w:pStyle w:val="FirstParagraph"/>
+      </w:pPr>
+      <w:r>
+        <w:rPr>
+          <w:bCs/>
+          <w:b/>
+        </w:rPr>
+        <w:t xml:space="preserve">TL;DR:</w:t>
+      </w:r>
+      <w:r>
+        <w:t xml:space="preserve"> </w:t>
+      </w:r>
+      <w:r>
+        <w:t xml:space="preserve">Canvas Inbox only, no email — I reply within 24 hours on weekdays.</w:t>
+      </w:r>
+    </w:p>
     <w:tbl>
       <w:tblPr>
         <w:tblStyle w:val="Table"/>
@@ -1590,7 +1641,10 @@
               <w:jc w:val="left"/>
             </w:pPr>
             <w:r>
-              <w:t xml:space="preserve">Canvas Inbox only — I do not use email during the term. Not a current student? Reach me at kbailey@clark.edu or 360-992-2313.</w:t>
+              <w:t xml:space="preserve">Canvas Inbox only — I do not use email during the term.</w:t>
+            </w:r>
+            <w:r>
+              <w:t xml:space="preserve">Not a current student? Reach me at kbailey@clark.edu or 360-992-2313.</w:t>
             </w:r>
           </w:p>
         </w:tc>
@@ -1670,7 +1724,7 @@
         <w:pStyle w:val="FirstParagraph"/>
       </w:pPr>
       <w:r>
-        <w:t xml:space="preserve">I’ve spent more than 25 years building and refining active-learning chemistry courses — including pioneering asynchronous online POGIL (Process Oriented Guided Inquiry Learning) before it was common practice. Struggling at first is normal; stick with it, ask questions, and you’ll find your footing. I’ve designed everything with you in mind, and I respond to Canvas messages within 24 hours on weekdays.</w:t>
+        <w:t xml:space="preserve">I’ve spent more than 25 years building and refining active-learning chemistry courses putting students and their learning at the center of my teaching whether in person or online. I’ve designed everything in this course with you in mind based on what my students tell me works. The first big part of that is learning to struggle when learning anything new. It’s normal. So stick with it and you’ll find your footing and confidence with it. Reach out for help directly before things get away from you. I respond to Canvas messages within 24 hours on weekdays.</w:t>
       </w:r>
     </w:p>
     <w:p>
@@ -1689,7 +1743,7 @@
           <w:iCs/>
           <w:i/>
         </w:rPr>
-        <w:t xml:space="preserve">Our job as educators is not to prepare you for the real world. You already live in the real world.</w:t>
+        <w:t xml:space="preserve">Our job as educators is not to prepare you for the real world. You already live in the real world. Our job is to empower you to change it.</w:t>
       </w:r>
       <w:r>
         <w:rPr>
@@ -1714,6 +1768,24 @@
       </w:pPr>
       <w:r>
         <w:t xml:space="preserve">What Course Materials Will I Need?</w:t>
+      </w:r>
+    </w:p>
+    <w:p>
+      <w:pPr>
+        <w:pStyle w:val="FirstParagraph"/>
+      </w:pPr>
+      <w:r>
+        <w:rPr>
+          <w:bCs/>
+          <w:b/>
+        </w:rPr>
+        <w:t xml:space="preserve">TL;DR:</w:t>
+      </w:r>
+      <w:r>
+        <w:t xml:space="preserve"> </w:t>
+      </w:r>
+      <w:r>
+        <w:t xml:space="preserve">Chemfolio + your lab manual (Clark Bookstore) + ALEKS (set up automatically in Canvas).</w:t>
       </w:r>
     </w:p>
     <w:tbl>
@@ -1804,15 +1876,6 @@
               <w:t xml:space="preserve">[edition/ISBN/price TBD]</w:t>
             </w:r>
             <w:r>
-              <w:t xml:space="preserve"> </w:t>
-            </w:r>
-            <w:r>
-              <w:t xml:space="preserve">/</w:t>
-            </w:r>
-            <w:r>
-              <w:t xml:space="preserve"> </w:t>
-            </w:r>
-            <w:r>
               <w:rPr>
                 <w:bCs/>
                 <w:b/>
@@ -1836,15 +1899,6 @@
               <w:t xml:space="preserve">[edition/ISBN/price TBD]</w:t>
             </w:r>
             <w:r>
-              <w:t xml:space="preserve"> </w:t>
-            </w:r>
-            <w:r>
-              <w:t xml:space="preserve">/</w:t>
-            </w:r>
-            <w:r>
-              <w:t xml:space="preserve"> </w:t>
-            </w:r>
-            <w:r>
               <w:rPr>
                 <w:bCs/>
                 <w:b/>
@@ -1945,7 +1999,10 @@
               <w:jc w:val="left"/>
             </w:pPr>
             <w:r>
-              <w:t xml:space="preserve">Canvas Learning Management System, with Microsoft OneDrive linked directly through Canvas’s built-in Microsoft Education integration (no separate office.com setup needed). A heads up: this embedded Office/OneDrive connection tripped up a number of students last term. Module 0 has a step-by-step setup guide — work through it in week one, and if you hit an error, contact Tech Hub (techhub@clark.edu · 360-992-2010) rather than troubleshooting alone.</w:t>
+              <w:t xml:space="preserve">Canvas Learning Management System, with Microsoft OneDrive linked directly through Canvas’s built-in Microsoft Education integration (no separate office.com setup needed).</w:t>
+            </w:r>
+            <w:r>
+              <w:t xml:space="preserve">A heads up: this embedded Office/OneDrive connection tripped up a number of students last term. Module 0 has a step-by-step setup guide — work through it in week one, and if you hit an error, contact Tech Hub (techhub@clark.edu · 360-992-2010) rather than troubleshooting alone.</w:t>
             </w:r>
           </w:p>
         </w:tc>
@@ -2048,7 +2105,10 @@
               <w:t xml:space="preserve">[bookstore link pending]</w:t>
             </w:r>
             <w:r>
-              <w:t xml:space="preserve">. ALEKS: access is set up automatically in Canvas once your registration is processed.</w:t>
+              <w:t xml:space="preserve">.</w:t>
+            </w:r>
+            <w:r>
+              <w:t xml:space="preserve">ALEKS: access is set up automatically in Canvas once your registration is processed.</w:t>
             </w:r>
           </w:p>
         </w:tc>
@@ -2064,75 +2124,111 @@
         <w:t xml:space="preserve">What Are the Course Agreements?</w:t>
       </w:r>
     </w:p>
-    <w:bookmarkStart w:id="33" w:name="communication"/>
-    <w:p>
-      <w:pPr>
-        <w:pStyle w:val="Heading2"/>
-      </w:pPr>
-      <w:r>
-        <w:t xml:space="preserve">Communication</w:t>
-      </w:r>
-    </w:p>
     <w:p>
       <w:pPr>
         <w:pStyle w:val="FirstParagraph"/>
-      </w:pPr>
-      <w:r>
-        <w:t xml:space="preserve">Canvas Inbox is our channel — for everything. I don’t use email during the term, so if you send a Clark email, expect it to go unanswered; message me through Canvas Inbox instead. I respond within 24 hours on weekdays.</w:t>
-      </w:r>
-    </w:p>
-    <w:bookmarkEnd w:id="33"/>
-    <w:bookmarkStart w:id="34" w:name="citing-your-sources"/>
-    <w:p>
-      <w:pPr>
-        <w:pStyle w:val="Heading2"/>
-      </w:pPr>
-      <w:r>
-        <w:t xml:space="preserve">Citing Your Sources</w:t>
-      </w:r>
-    </w:p>
-    <w:p>
-      <w:pPr>
-        <w:pStyle w:val="FirstParagraph"/>
-      </w:pPr>
-      <w:r>
-        <w:t xml:space="preserve">A citation is when you give credit to another source of information that you are using in your work. This course has specific expectations about how you cite your sources when you are referring to work that is not your own. To avoid plagiarism (when you intentionally or unintentionally present someone else’s work as your own), you will need to signal that you are referencing outside material and give credit. Clark College Libraries’ plagiarism guide is a handy resource for learning about what plagiarism is and how to avoid it. I am here if you have questions about how to correctly cite outside information in your work.</w:t>
-      </w:r>
-    </w:p>
-    <w:bookmarkEnd w:id="34"/>
-    <w:bookmarkStart w:id="38" w:name="X557e592dac108a6d1044d97136f1b079f25201c"/>
-    <w:p>
-      <w:pPr>
-        <w:pStyle w:val="Heading2"/>
-      </w:pPr>
-      <w:r>
-        <w:t xml:space="preserve">AI (Artificial Intelligence) Guidelines — Community AI Agreement</w:t>
-      </w:r>
-    </w:p>
-    <w:p>
-      <w:pPr>
-        <w:pStyle w:val="FirstParagraph"/>
-      </w:pPr>
-      <w:r>
-        <w:t xml:space="preserve">This agreement is a community commitment built on honesty, growth, and professionalism. AI is a more powerful tool than simply an advanced Google search. Learn to leverage it wisely, use it responsibly, and declare it when submitting your work. By enrolling in this course you are agreeing to abide by this agreement.</w:t>
-      </w:r>
-    </w:p>
-    <w:p>
-      <w:pPr>
-        <w:pStyle w:val="BodyText"/>
       </w:pPr>
       <w:r>
         <w:rPr>
           <w:bCs/>
           <w:b/>
         </w:rPr>
-        <w:t xml:space="preserve">AI-generated discussion posts and replies do not demonstrate your learning and will not receive credit.</w:t>
+        <w:t xml:space="preserve">TL;DR:</w:t>
       </w:r>
       <w:r>
         <w:t xml:space="preserve"> </w:t>
       </w:r>
       <w:r>
-        <w:t xml:space="preserve">The 3-2-1 format requires your specific workbook attempts, your reasoning, and your questions — none of which AI can provide on your behalf.</w:t>
+        <w:t xml:space="preserve">Message me in Canvas Inbox, cite anything that isn’t yours, never let AI write your discussion posts, and show up ready to work.</w:t>
+      </w:r>
+    </w:p>
+    <w:bookmarkStart w:id="33" w:name="communication"/>
+    <w:p>
+      <w:pPr>
+        <w:pStyle w:val="Heading2"/>
+      </w:pPr>
+      <w:r>
+        <w:t xml:space="preserve">Communication</w:t>
+      </w:r>
+    </w:p>
+    <w:p>
+      <w:pPr>
+        <w:pStyle w:val="FirstParagraph"/>
+      </w:pPr>
+      <w:r>
+        <w:t xml:space="preserve">Canvas Inbox is our channel — for everything. I don’t use email during the term, so if you send a Clark email, expect it to go unanswered; message me through Canvas Inbox instead. I respond within 24 hours on weekdays.</w:t>
+      </w:r>
+    </w:p>
+    <w:bookmarkEnd w:id="33"/>
+    <w:bookmarkStart w:id="34" w:name="citing-your-sources"/>
+    <w:p>
+      <w:pPr>
+        <w:pStyle w:val="Heading2"/>
+      </w:pPr>
+      <w:r>
+        <w:t xml:space="preserve">Citing Your Sources</w:t>
+      </w:r>
+    </w:p>
+    <w:p>
+      <w:pPr>
+        <w:pStyle w:val="FirstParagraph"/>
+      </w:pPr>
+      <w:r>
+        <w:t xml:space="preserve">Use a citation to credit ANY source of information used in your work, be it a website, image, or content that YOU did not come up with. Yes, it’s a pain, but it helps when posting content for others who need to trust and rely on it. To avoid plagiarism (when you intentionally or unintentionally present someone else’s work as your own), you will need to signal that you are referencing outside material and give credit. Clark College Libraries’ plagiarism guide is a handy resource for learning about what plagiarism is and how to avoid it. I am here if you have questions about how to correctly cite outside information in your work.</w:t>
+      </w:r>
+    </w:p>
+    <w:bookmarkEnd w:id="34"/>
+    <w:bookmarkStart w:id="38" w:name="X557e592dac108a6d1044d97136f1b079f25201c"/>
+    <w:p>
+      <w:pPr>
+        <w:pStyle w:val="Heading2"/>
+      </w:pPr>
+      <w:r>
+        <w:t xml:space="preserve">AI (Artificial Intelligence) Guidelines — Community AI Agreement</w:t>
+      </w:r>
+    </w:p>
+    <w:p>
+      <w:pPr>
+        <w:pStyle w:val="FirstParagraph"/>
+      </w:pPr>
+      <w:r>
+        <w:rPr>
+          <w:bCs/>
+          <w:b/>
+        </w:rPr>
+        <w:t xml:space="preserve">TL;DR:</w:t>
+      </w:r>
+      <w:r>
+        <w:t xml:space="preserve"> </w:t>
+      </w:r>
+      <w:r>
+        <w:t xml:space="preserve">Never use AI to write anything you submit in discussions — no exceptions. AI can help you double-check your own lab/ALEKS work if you declare it. Quizzes and the Final Project: no AI, period.</w:t>
+      </w:r>
+    </w:p>
+    <w:p>
+      <w:pPr>
+        <w:pStyle w:val="BodyText"/>
+      </w:pPr>
+      <w:r>
+        <w:t xml:space="preserve">This agreement is a community commitment built on honesty, growth, and professionalism. AI is a more powerful tool than simply an advanced Google search. Learn to leverage it wisely, use it responsibly, and declare it when submitting your work. By enrolling in this course you are agreeing to abide by this agreement.</w:t>
+      </w:r>
+    </w:p>
+    <w:p>
+      <w:pPr>
+        <w:pStyle w:val="BodyText"/>
+      </w:pPr>
+      <w:r>
+        <w:rPr>
+          <w:bCs/>
+          <w:b/>
+        </w:rPr>
+        <w:t xml:space="preserve">For discussions specifically: no AI-generated content is ever allowed in anything you submit — no exceptions, and declaring it doesn’t change that.</w:t>
+      </w:r>
+      <w:r>
+        <w:t xml:space="preserve"> </w:t>
+      </w:r>
+      <w:r>
+        <w:t xml:space="preserve">The 3-2-1 format, OOL posts, and Team Lead summaries all require your own reasoning, in your own words. AI-generated discussion content will not receive credit, whether declared or not.</w:t>
       </w:r>
     </w:p>
     <w:bookmarkStart w:id="35" w:name="four-principles"/>
@@ -2247,7 +2343,7 @@
         <w:t xml:space="preserve"> </w:t>
       </w:r>
       <w:r>
-        <w:t xml:space="preserve">at the end of your post, reply, or lab answer.</w:t>
+        <w:t xml:space="preserve">at the end of your lab answer or ALEKS work.</w:t>
       </w:r>
     </w:p>
     <w:bookmarkEnd w:id="35"/>
@@ -2279,7 +2375,7 @@
         <w:t xml:space="preserve"> </w:t>
       </w:r>
       <w:r>
-        <w:t xml:space="preserve">— Declare any AI use in posts (context, clarification, or examples only). Your 3-2-1 post must reflect your own engagement with the assigned Activity and video keys. AI cannot watch a video for you, work through an Activity’s objectives for you, or learn for you. Team Leads may use AI to draft the AI Summary portion of the LEADER CHECK IN reply — the MY READ section must be written by the student, with AI use declared. AI is never permitted, declared or not, to generate your THREE/TWO/ONE content by feeding course materials into an AI tool.</w:t>
+        <w:t xml:space="preserve">— No AI-generated content anywhere in your posts, replies, and includes the LEADER CHECK IN reply. All posts and replies must be written by the student, with no exception. AI cannot watch a video for you, work through an activity’s objectives, or learn for you. AI cannot produce reflective thoughts for a human being.</w:t>
       </w:r>
     </w:p>
     <w:p>
@@ -2367,7 +2463,17 @@
         <w:pStyle w:val="Compact"/>
       </w:pPr>
       <w:r>
-        <w:t xml:space="preserve">First time in discussions — friendly reminder to declare. AI in replies without declaration = zero credit.</w:t>
+        <w:rPr>
+          <w:bCs/>
+          <w:b/>
+        </w:rPr>
+        <w:t xml:space="preserve">Discussions</w:t>
+      </w:r>
+      <w:r>
+        <w:t xml:space="preserve"> </w:t>
+      </w:r>
+      <w:r>
+        <w:t xml:space="preserve">— AI-generated content in any post, reply, or Team Lead summary = zero credit for that submission, regardless of declaration. Repeated instances = academic integrity referral.</w:t>
       </w:r>
     </w:p>
     <w:p>
@@ -2379,7 +2485,17 @@
         <w:pStyle w:val="Compact"/>
       </w:pPr>
       <w:r>
-        <w:t xml:space="preserve">Repeated or pattern-based — zero points on affected posts. Systematic AI-generated content across multiple submissions constitutes academic dishonesty and an academic integrity referral.</w:t>
+        <w:rPr>
+          <w:bCs/>
+          <w:b/>
+        </w:rPr>
+        <w:t xml:space="preserve">Labs</w:t>
+      </w:r>
+      <w:r>
+        <w:t xml:space="preserve"> </w:t>
+      </w:r>
+      <w:r>
+        <w:t xml:space="preserve">— fake data = zero for the lab. AI answer without declaration = zero for the question. No regrades.</w:t>
       </w:r>
     </w:p>
     <w:p>
@@ -2391,19 +2507,17 @@
         <w:pStyle w:val="Compact"/>
       </w:pPr>
       <w:r>
-        <w:t xml:space="preserve">Labs — fake data = zero for the lab. AI answer without declaration = zero for the question. No regrades.</w:t>
-      </w:r>
-    </w:p>
-    <w:p>
-      <w:pPr>
-        <w:numPr>
-          <w:ilvl w:val="0"/>
-          <w:numId w:val="1004"/>
-        </w:numPr>
-        <w:pStyle w:val="Compact"/>
-      </w:pPr>
-      <w:r>
-        <w:t xml:space="preserve">Quizzes/Final Project — suspected use = zero points and academic integrity referral.</w:t>
+        <w:rPr>
+          <w:bCs/>
+          <w:b/>
+        </w:rPr>
+        <w:t xml:space="preserve">Quizzes/Final Project</w:t>
+      </w:r>
+      <w:r>
+        <w:t xml:space="preserve"> </w:t>
+      </w:r>
+      <w:r>
+        <w:t xml:space="preserve">— suspected use = zero points and academic integrity referral.</w:t>
       </w:r>
     </w:p>
     <w:p>
@@ -2549,6 +2663,24 @@
         <w:pStyle w:val="FirstParagraph"/>
       </w:pPr>
       <w:r>
+        <w:rPr>
+          <w:bCs/>
+          <w:b/>
+        </w:rPr>
+        <w:t xml:space="preserve">TL;DR:</w:t>
+      </w:r>
+      <w:r>
+        <w:t xml:space="preserve"> </w:t>
+      </w:r>
+      <w:r>
+        <w:t xml:space="preserve">By the end, you can apply chemistry reasoning to real health-career problems — not just recall facts.</w:t>
+      </w:r>
+    </w:p>
+    <w:p>
+      <w:pPr>
+        <w:pStyle w:val="BodyText"/>
+      </w:pPr>
+      <w:r>
         <w:t xml:space="preserve">Student learning outcomes are the skills and abilities that you are working to acquire, practice, and apply in class. They represent the learning goals for the term.</w:t>
       </w:r>
     </w:p>
@@ -2653,7 +2785,37 @@
         <w:pStyle w:val="FirstParagraph"/>
       </w:pPr>
       <w:r>
-        <w:t xml:space="preserve">These weights aren’t arbitrary. Labs and Discussions carry the most weight because that’s where the real learning happens — applying what you know, not just recognizing it. ALEKS is weighted lightly because it’s practice, not proof of understanding. The Final TYC Project replaces a comprehensive exam because teaching a concept to someone else is a better test of whether you actually understand it than a timed exam is.</w:t>
+        <w:rPr>
+          <w:bCs/>
+          <w:b/>
+        </w:rPr>
+        <w:t xml:space="preserve">TL;DR:</w:t>
+      </w:r>
+      <w:r>
+        <w:t xml:space="preserve"> </w:t>
+      </w:r>
+      <w:r>
+        <w:t xml:space="preserve">Discussions 30% · Labs 30% · Quizzes 20% · ALEKS 10% · Final TYC Project 10%. Here’s why those weights, and the full breakdown.</w:t>
+      </w:r>
+    </w:p>
+    <w:p>
+      <w:pPr>
+        <w:pStyle w:val="BodyText"/>
+      </w:pPr>
+      <w:r>
+        <w:t xml:space="preserve">These weights aren’t arbitrary. Labs and Discussions carry the most weight because that’s where the real demonstration of your learning happens — applying what you know, not just recognizing it. ALEKS is weighted lightly because it’s practice, not proof of understanding. The Final TYC Project replaces a comprehensive exam because teaching a concept to someone else is a better test of whether you actually understand it than a timed exam is (e.g. </w:t>
+      </w:r>
+      <w:r>
+        <w:t xml:space="preserve">“</w:t>
+      </w:r>
+      <w:r>
+        <w:t xml:space="preserve">Learn on, do one, teach on.</w:t>
+      </w:r>
+      <w:r>
+        <w:t xml:space="preserve">”</w:t>
+      </w:r>
+      <w:r>
+        <w:t xml:space="preserve">)</w:t>
       </w:r>
     </w:p>
     <w:bookmarkStart w:id="42" w:name="Xdd0719f115f2bfe56e3e892841df085ef5ba506"/>
@@ -3230,7 +3392,7 @@
               <w:jc w:val="left"/>
             </w:pPr>
             <w:r>
-              <w:t xml:space="preserve">63 up to 70</w:t>
+              <w:t xml:space="preserve">63 up to 71</w:t>
             </w:r>
           </w:p>
         </w:tc>
@@ -3433,6 +3595,24 @@
       </w:pPr>
       <w:r>
         <w:t xml:space="preserve">What Resources and Support Services Are Available to Me?</w:t>
+      </w:r>
+    </w:p>
+    <w:p>
+      <w:pPr>
+        <w:pStyle w:val="FirstParagraph"/>
+      </w:pPr>
+      <w:r>
+        <w:rPr>
+          <w:bCs/>
+          <w:b/>
+        </w:rPr>
+        <w:t xml:space="preserve">TL;DR:</w:t>
+      </w:r>
+      <w:r>
+        <w:t xml:space="preserve"> </w:t>
+      </w:r>
+      <w:r>
+        <w:t xml:space="preserve">Tech Hub for Canvas/software problems, Tutoring or Librarians for coursework help, Basic Needs Hub if life is making this term hard.</w:t>
       </w:r>
     </w:p>
     <w:bookmarkStart w:id="49" w:name="technical-support"/>

</xml_diff>

<commit_message>
Restore stripped hyperlinks in resource/policy sections
Plain-text URLs and bare domain mentions across DAC, Tech Hub,
tutoring, HR, Title IX, and other resource entries in both syllabi
had lost their hyperlinks in a prior pass. Restored as proper
Markdown links and regenerated the site content and downloads.

Co-Authored-By: Claude Sonnet 5 <noreply@anthropic.com>
</commit_message>
<xml_diff>
--- a/downloads/CHEM121_Syllabus_Fall2026.docx
+++ b/downloads/CHEM121_Syllabus_Fall2026.docx
@@ -722,7 +722,7 @@
     </w:p>
     <w:bookmarkEnd w:id="22"/>
     <w:bookmarkEnd w:id="23"/>
-    <w:bookmarkStart w:id="24" w:name="course-information"/>
+    <w:bookmarkStart w:id="25" w:name="course-information"/>
     <w:p>
       <w:pPr>
         <w:pStyle w:val="Heading1"/>
@@ -915,9 +915,14 @@
               <w:pStyle w:val="Compact"/>
               <w:jc w:val="left"/>
             </w:pPr>
-            <w:r>
-              <w:t xml:space="preserve">Canvas Learning Management System (clarkcollege.instructure.com)</w:t>
-            </w:r>
+            <w:hyperlink r:id="rId24">
+              <w:r>
+                <w:rPr>
+                  <w:rStyle w:val="Hyperlink"/>
+                </w:rPr>
+                <w:t xml:space="preserve">Canvas Learning Management System</w:t>
+              </w:r>
+            </w:hyperlink>
           </w:p>
         </w:tc>
       </w:tr>
@@ -1083,8 +1088,8 @@
         </w:tc>
       </w:tr>
     </w:tbl>
-    <w:bookmarkEnd w:id="24"/>
-    <w:bookmarkStart w:id="29" w:name="welcome-to-class"/>
+    <w:bookmarkEnd w:id="25"/>
+    <w:bookmarkStart w:id="31" w:name="welcome-to-class"/>
     <w:p>
       <w:pPr>
         <w:pStyle w:val="Heading1"/>
@@ -1141,7 +1146,7 @@
         <w:t xml:space="preserve">Most students who stick with the weekly rhythm and stay engaged do well. The difference isn’t talent, it’s showing up consistently. Give yourself a fighting chance.</w:t>
       </w:r>
     </w:p>
-    <w:bookmarkStart w:id="25" w:name="Xe66c6beb7eb2ec0e95c71e590f49bdb9df56704"/>
+    <w:bookmarkStart w:id="26" w:name="Xe66c6beb7eb2ec0e95c71e590f49bdb9df56704"/>
     <w:p>
       <w:pPr>
         <w:pStyle w:val="Heading2"/>
@@ -1158,8 +1163,8 @@
         <w:t xml:space="preserve">CHEM is a math class combined with a foreign language course, and we move fast. We use math conversions from day one and keep using them every week, in both discussion and lab. If your math skills need more than a light dusting-off, consider brushing up before or alongside this course — most students taking CHEM&amp;121 find the math the hardest part, not the chemistry itself.</w:t>
       </w:r>
     </w:p>
-    <w:bookmarkEnd w:id="25"/>
-    <w:bookmarkStart w:id="26" w:name="what-can-i-expect-in-class"/>
+    <w:bookmarkEnd w:id="26"/>
+    <w:bookmarkStart w:id="27" w:name="what-can-i-expect-in-class"/>
     <w:p>
       <w:pPr>
         <w:pStyle w:val="Heading2"/>
@@ -1198,8 +1203,8 @@
         <w:t xml:space="preserve">If you’ve taken a science course before, don’t assume this one works the same way: there are no traditional lectures, quizzes happen in person during lab, and labs are real science, not a recipe to follow. More on exactly how below.</w:t>
       </w:r>
     </w:p>
-    <w:bookmarkEnd w:id="26"/>
-    <w:bookmarkStart w:id="27" w:name="what-if-i-need-an-accommodation"/>
+    <w:bookmarkEnd w:id="27"/>
+    <w:bookmarkStart w:id="29" w:name="what-if-i-need-an-accommodation"/>
     <w:p>
       <w:pPr>
         <w:pStyle w:val="Heading2"/>
@@ -1213,11 +1218,25 @@
         <w:pStyle w:val="FirstParagraph"/>
       </w:pPr>
       <w:r>
-        <w:t xml:space="preserve">Clark College and the Disability Access Center (DAC) office assist students with disabilities in pursuing their educational goals. DAC can provide classroom accommodations, as well as serve as a resource to the campus community in striving to make Clark College both an accessible and hospitable place for students with disabilities. Interested in getting accommodations? Begin with viewing the steps for requesting accommodations at clark.edu/dac.</w:t>
-      </w:r>
-    </w:p>
-    <w:bookmarkEnd w:id="27"/>
-    <w:bookmarkStart w:id="28" w:name="weekly-flow"/>
+        <w:t xml:space="preserve">Clark College and the Disability Access Center (DAC) office assist students with disabilities in pursuing their educational goals. DAC can provide classroom accommodations, as well as serve as a resource to the campus community in striving to make Clark College both an accessible and hospitable place for students with disabilities. Interested in getting accommodations? Begin with</w:t>
+      </w:r>
+      <w:r>
+        <w:t xml:space="preserve"> </w:t>
+      </w:r>
+      <w:hyperlink r:id="rId28">
+        <w:r>
+          <w:rPr>
+            <w:rStyle w:val="Hyperlink"/>
+          </w:rPr>
+          <w:t xml:space="preserve">viewing the steps for requesting accommodations</w:t>
+        </w:r>
+      </w:hyperlink>
+      <w:r>
+        <w:t xml:space="preserve">.</w:t>
+      </w:r>
+    </w:p>
+    <w:bookmarkEnd w:id="29"/>
+    <w:bookmarkStart w:id="30" w:name="weekly-flow"/>
     <w:p>
       <w:pPr>
         <w:pStyle w:val="Heading2"/>
@@ -1487,9 +1506,9 @@
         <w:t xml:space="preserve">Prioritize content learning in your Chemfolio with your team first. Labs are based on the assigned content from the module.</w:t>
       </w:r>
     </w:p>
-    <w:bookmarkEnd w:id="28"/>
-    <w:bookmarkEnd w:id="29"/>
-    <w:bookmarkStart w:id="31" w:name="about-your-instructor"/>
+    <w:bookmarkEnd w:id="30"/>
+    <w:bookmarkEnd w:id="31"/>
+    <w:bookmarkStart w:id="33" w:name="about-your-instructor"/>
     <w:p>
       <w:pPr>
         <w:pStyle w:val="Heading1"/>
@@ -1710,7 +1729,7 @@
         </w:tc>
       </w:tr>
     </w:tbl>
-    <w:bookmarkStart w:id="30" w:name="what-can-you-expect-from-me"/>
+    <w:bookmarkStart w:id="32" w:name="what-can-you-expect-from-me"/>
     <w:p>
       <w:pPr>
         <w:pStyle w:val="Heading2"/>
@@ -1759,9 +1778,9 @@
         <w:t xml:space="preserve">— Dr. B</w:t>
       </w:r>
     </w:p>
-    <w:bookmarkEnd w:id="30"/>
-    <w:bookmarkEnd w:id="31"/>
-    <w:bookmarkStart w:id="32" w:name="what-course-materials-will-i-need"/>
+    <w:bookmarkEnd w:id="32"/>
+    <w:bookmarkEnd w:id="33"/>
+    <w:bookmarkStart w:id="36" w:name="what-course-materials-will-i-need"/>
     <w:p>
       <w:pPr>
         <w:pStyle w:val="Heading1"/>
@@ -2032,7 +2051,24 @@
               <w:jc w:val="left"/>
             </w:pPr>
             <w:r>
-              <w:t xml:space="preserve">See Clark’s eLearning accessibility and privacy policies page (clark.edu/academics/eLearning) for Canvas, ALEKS, and other tools used in this course.</w:t>
+              <w:t xml:space="preserve">See Clark’s</w:t>
+            </w:r>
+            <w:r>
+              <w:t xml:space="preserve"> </w:t>
+            </w:r>
+            <w:hyperlink r:id="rId34">
+              <w:r>
+                <w:rPr>
+                  <w:rStyle w:val="Hyperlink"/>
+                </w:rPr>
+                <w:t xml:space="preserve">eLearning accessibility and privacy policies page</w:t>
+              </w:r>
+            </w:hyperlink>
+            <w:r>
+              <w:t xml:space="preserve"> </w:t>
+            </w:r>
+            <w:r>
+              <w:t xml:space="preserve">for Canvas, ALEKS, and other tools used in this course.</w:t>
             </w:r>
           </w:p>
         </w:tc>
@@ -2062,7 +2098,24 @@
               <w:jc w:val="left"/>
             </w:pPr>
             <w:r>
-              <w:t xml:space="preserve">See Clark’s eLearning accessibility and privacy policies page (clark.edu/academics/eLearning) for accessibility statements on Canvas, ALEKS, and other course tools.</w:t>
+              <w:t xml:space="preserve">See Clark’s</w:t>
+            </w:r>
+            <w:r>
+              <w:t xml:space="preserve"> </w:t>
+            </w:r>
+            <w:hyperlink r:id="rId34">
+              <w:r>
+                <w:rPr>
+                  <w:rStyle w:val="Hyperlink"/>
+                </w:rPr>
+                <w:t xml:space="preserve">eLearning accessibility and privacy policies page</w:t>
+              </w:r>
+            </w:hyperlink>
+            <w:r>
+              <w:t xml:space="preserve"> </w:t>
+            </w:r>
+            <w:r>
+              <w:t xml:space="preserve">for accessibility statements on Canvas, ALEKS, and other course tools.</w:t>
             </w:r>
           </w:p>
         </w:tc>
@@ -2092,18 +2145,19 @@
               <w:jc w:val="left"/>
             </w:pPr>
             <w:r>
-              <w:t xml:space="preserve">Chemfolio and your lab manual: Clark College Bookstore,</w:t>
+              <w:t xml:space="preserve">Chemfolio and your lab manual:</w:t>
             </w:r>
             <w:r>
               <w:t xml:space="preserve"> </w:t>
             </w:r>
-            <w:r>
-              <w:rPr>
-                <w:iCs/>
-                <w:i/>
-              </w:rPr>
-              <w:t xml:space="preserve">[bookstore link pending]</w:t>
-            </w:r>
+            <w:hyperlink r:id="rId35">
+              <w:r>
+                <w:rPr>
+                  <w:rStyle w:val="Hyperlink"/>
+                </w:rPr>
+                <w:t xml:space="preserve">Clark College Bookstore</w:t>
+              </w:r>
+            </w:hyperlink>
             <w:r>
               <w:t xml:space="preserve">.</w:t>
             </w:r>
@@ -2114,8 +2168,8 @@
         </w:tc>
       </w:tr>
     </w:tbl>
-    <w:bookmarkEnd w:id="32"/>
-    <w:bookmarkStart w:id="40" w:name="what-are-the-course-agreements"/>
+    <w:bookmarkEnd w:id="36"/>
+    <w:bookmarkStart w:id="44" w:name="what-are-the-course-agreements"/>
     <w:p>
       <w:pPr>
         <w:pStyle w:val="Heading1"/>
@@ -2142,7 +2196,7 @@
         <w:t xml:space="preserve">Message me in Canvas Inbox, cite anything that isn’t yours, never let AI write your discussion posts, and show up ready to work.</w:t>
       </w:r>
     </w:p>
-    <w:bookmarkStart w:id="33" w:name="communication"/>
+    <w:bookmarkStart w:id="37" w:name="communication"/>
     <w:p>
       <w:pPr>
         <w:pStyle w:val="Heading2"/>
@@ -2159,8 +2213,8 @@
         <w:t xml:space="preserve">Canvas Inbox is our channel — for everything. I don’t use email during the term, so if you send a Clark email, expect it to go unanswered; message me through Canvas Inbox instead. I respond within 24 hours on weekdays.</w:t>
       </w:r>
     </w:p>
-    <w:bookmarkEnd w:id="33"/>
-    <w:bookmarkStart w:id="34" w:name="citing-your-sources"/>
+    <w:bookmarkEnd w:id="37"/>
+    <w:bookmarkStart w:id="38" w:name="citing-your-sources"/>
     <w:p>
       <w:pPr>
         <w:pStyle w:val="Heading2"/>
@@ -2177,8 +2231,8 @@
         <w:t xml:space="preserve">Use a citation to credit ANY source of information used in your work, be it a website, image, or content that YOU did not come up with. Yes, it’s a pain, but it helps when posting content for others who need to trust and rely on it. To avoid plagiarism (when you intentionally or unintentionally present someone else’s work as your own), you will need to signal that you are referencing outside material and give credit. Clark College Libraries’ plagiarism guide is a handy resource for learning about what plagiarism is and how to avoid it. I am here if you have questions about how to correctly cite outside information in your work.</w:t>
       </w:r>
     </w:p>
-    <w:bookmarkEnd w:id="34"/>
-    <w:bookmarkStart w:id="38" w:name="X557e592dac108a6d1044d97136f1b079f25201c"/>
+    <w:bookmarkEnd w:id="38"/>
+    <w:bookmarkStart w:id="42" w:name="X557e592dac108a6d1044d97136f1b079f25201c"/>
     <w:p>
       <w:pPr>
         <w:pStyle w:val="Heading2"/>
@@ -2231,7 +2285,7 @@
         <w:t xml:space="preserve">The 3-2-1 format, OOL posts, and Team Lead summaries all require your own reasoning, in your own words. AI-generated discussion content will not receive credit, whether declared or not.</w:t>
       </w:r>
     </w:p>
-    <w:bookmarkStart w:id="35" w:name="four-principles"/>
+    <w:bookmarkStart w:id="39" w:name="four-principles"/>
     <w:p>
       <w:pPr>
         <w:pStyle w:val="Heading3"/>
@@ -2346,8 +2400,8 @@
         <w:t xml:space="preserve">at the end of your lab answer or ALEKS work.</w:t>
       </w:r>
     </w:p>
-    <w:bookmarkEnd w:id="35"/>
-    <w:bookmarkStart w:id="36" w:name="by-assignment"/>
+    <w:bookmarkEnd w:id="39"/>
+    <w:bookmarkStart w:id="40" w:name="by-assignment"/>
     <w:p>
       <w:pPr>
         <w:pStyle w:val="Heading3"/>
@@ -2444,8 +2498,8 @@
         <w:t xml:space="preserve">— No AI allowed, at any level.</w:t>
       </w:r>
     </w:p>
-    <w:bookmarkEnd w:id="36"/>
-    <w:bookmarkStart w:id="37" w:name="follow-up"/>
+    <w:bookmarkEnd w:id="40"/>
+    <w:bookmarkStart w:id="41" w:name="follow-up"/>
     <w:p>
       <w:pPr>
         <w:pStyle w:val="Heading3"/>
@@ -2550,9 +2604,9 @@
         <w:t xml:space="preserve">You’re entering health careers where accuracy and integrity matter. AI is here to stay — but how you use it says everything about your professionalism. Own it, declare it, and use it to grow.</w:t>
       </w:r>
     </w:p>
-    <w:bookmarkEnd w:id="37"/>
-    <w:bookmarkEnd w:id="38"/>
-    <w:bookmarkStart w:id="39" w:name="classroom-norms"/>
+    <w:bookmarkEnd w:id="41"/>
+    <w:bookmarkEnd w:id="42"/>
+    <w:bookmarkStart w:id="43" w:name="classroom-norms"/>
     <w:p>
       <w:pPr>
         <w:pStyle w:val="Heading2"/>
@@ -2647,9 +2701,9 @@
         <w:t xml:space="preserve">”</w:t>
       </w:r>
     </w:p>
-    <w:bookmarkEnd w:id="39"/>
-    <w:bookmarkEnd w:id="40"/>
-    <w:bookmarkStart w:id="41" w:name="X762e0c562ca86535819c7c15adbe8dbe270c6b6"/>
+    <w:bookmarkEnd w:id="43"/>
+    <w:bookmarkEnd w:id="44"/>
+    <w:bookmarkStart w:id="45" w:name="X762e0c562ca86535819c7c15adbe8dbe270c6b6"/>
     <w:p>
       <w:pPr>
         <w:pStyle w:val="Heading1"/>
@@ -2770,8 +2824,8 @@
         <w:t xml:space="preserve">These outcomes are measured through your weekly 3-2-1 Team Discussions, lab reports (Results &amp; Analysis and Discussion &amp; Conclusions), in-lab quizzes, and the Final TYC Project. Rubrics for each are posted in the relevant Canvas module.</w:t>
       </w:r>
     </w:p>
-    <w:bookmarkEnd w:id="41"/>
-    <w:bookmarkStart w:id="48" w:name="how-will-i-be-graded-and-why"/>
+    <w:bookmarkEnd w:id="45"/>
+    <w:bookmarkStart w:id="52" w:name="how-will-i-be-graded-and-why"/>
     <w:p>
       <w:pPr>
         <w:pStyle w:val="Heading1"/>
@@ -2818,7 +2872,7 @@
         <w:t xml:space="preserve">)</w:t>
       </w:r>
     </w:p>
-    <w:bookmarkStart w:id="42" w:name="Xdd0719f115f2bfe56e3e892841df085ef5ba506"/>
+    <w:bookmarkStart w:id="46" w:name="Xdd0719f115f2bfe56e3e892841df085ef5ba506"/>
     <w:p>
       <w:pPr>
         <w:pStyle w:val="Heading2"/>
@@ -3079,8 +3133,8 @@
         </w:tc>
       </w:tr>
     </w:tbl>
-    <w:bookmarkEnd w:id="42"/>
-    <w:bookmarkStart w:id="43" w:name="about-the-lab-requirement"/>
+    <w:bookmarkEnd w:id="46"/>
+    <w:bookmarkStart w:id="47" w:name="about-the-lab-requirement"/>
     <w:p>
       <w:pPr>
         <w:pStyle w:val="Heading2"/>
@@ -3151,8 +3205,8 @@
         <w:t xml:space="preserve">toward your credit-hour requirement if you don’t attend/submit it, or if it scores below 60%. You cannot miss more than about two labs and still earn the lab credit for this course.</w:t>
       </w:r>
     </w:p>
-    <w:bookmarkEnd w:id="43"/>
-    <w:bookmarkStart w:id="44" w:name="grading-scale"/>
+    <w:bookmarkEnd w:id="47"/>
+    <w:bookmarkStart w:id="48" w:name="grading-scale"/>
     <w:p>
       <w:pPr>
         <w:pStyle w:val="Heading2"/>
@@ -3484,8 +3538,8 @@
         </w:tc>
       </w:tr>
     </w:tbl>
-    <w:bookmarkEnd w:id="44"/>
-    <w:bookmarkStart w:id="45" w:name="late-work"/>
+    <w:bookmarkEnd w:id="48"/>
+    <w:bookmarkStart w:id="49" w:name="late-work"/>
     <w:p>
       <w:pPr>
         <w:pStyle w:val="Heading2"/>
@@ -3550,8 +3604,8 @@
         <w:t xml:space="preserve">If something requiring a prolonged absence occurs, contact me via Canvas Inbox and let’s see what solutions are possible.</w:t>
       </w:r>
     </w:p>
-    <w:bookmarkEnd w:id="45"/>
-    <w:bookmarkStart w:id="46" w:name="feedback"/>
+    <w:bookmarkEnd w:id="49"/>
+    <w:bookmarkStart w:id="50" w:name="feedback"/>
     <w:p>
       <w:pPr>
         <w:pStyle w:val="Heading2"/>
@@ -3568,8 +3622,8 @@
         <w:t xml:space="preserve">Discussions and other work are graded within 48 hours of each due date.</w:t>
       </w:r>
     </w:p>
-    <w:bookmarkEnd w:id="46"/>
-    <w:bookmarkStart w:id="47" w:name="revision"/>
+    <w:bookmarkEnd w:id="50"/>
+    <w:bookmarkStart w:id="51" w:name="revision"/>
     <w:p>
       <w:pPr>
         <w:pStyle w:val="Heading2"/>
@@ -3586,9 +3640,9 @@
         <w:t xml:space="preserve">There is no separate revision or regrade policy at this time — the late-work window above functions as the built-in opportunity to catch up before work is scored.</w:t>
       </w:r>
     </w:p>
-    <w:bookmarkEnd w:id="47"/>
-    <w:bookmarkEnd w:id="48"/>
-    <w:bookmarkStart w:id="52" w:name="Xc43a7a922298ad0f9db64bde08ef36f42168a56"/>
+    <w:bookmarkEnd w:id="51"/>
+    <w:bookmarkEnd w:id="52"/>
+    <w:bookmarkStart w:id="80" w:name="Xc43a7a922298ad0f9db64bde08ef36f42168a56"/>
     <w:p>
       <w:pPr>
         <w:pStyle w:val="Heading1"/>
@@ -3615,7 +3669,7 @@
         <w:t xml:space="preserve">Tech Hub for Canvas/software problems, Tutoring or Librarians for coursework help, Basic Needs Hub if life is making this term hard.</w:t>
       </w:r>
     </w:p>
-    <w:bookmarkStart w:id="49" w:name="technical-support"/>
+    <w:bookmarkStart w:id="56" w:name="technical-support"/>
     <w:p>
       <w:pPr>
         <w:pStyle w:val="Heading2"/>
@@ -3672,24 +3726,44 @@
               <w:pStyle w:val="Compact"/>
               <w:jc w:val="left"/>
             </w:pPr>
-            <w:r>
-              <w:rPr>
-                <w:bCs/>
-                <w:b/>
-              </w:rPr>
-              <w:t xml:space="preserve">Tech Hub</w:t>
-            </w:r>
-          </w:p>
-        </w:tc>
-        <w:tc>
-          <w:tcPr/>
-          <w:p>
-            <w:pPr>
-              <w:pStyle w:val="Compact"/>
-              <w:jc w:val="left"/>
-            </w:pPr>
-            <w:r>
-              <w:t xml:space="preserve">Canvas, software, or account trouble — Scarpelli Hall 135 · techhub@clark.edu · 360-992-2010</w:t>
+            <w:hyperlink r:id="rId53">
+              <w:r>
+                <w:rPr>
+                  <w:rStyle w:val="Hyperlink"/>
+                  <w:bCs/>
+                  <w:b/>
+                </w:rPr>
+                <w:t xml:space="preserve">Tech Hub</w:t>
+              </w:r>
+            </w:hyperlink>
+          </w:p>
+        </w:tc>
+        <w:tc>
+          <w:tcPr/>
+          <w:p>
+            <w:pPr>
+              <w:pStyle w:val="Compact"/>
+              <w:jc w:val="left"/>
+            </w:pPr>
+            <w:r>
+              <w:t xml:space="preserve">Canvas, software, or account trouble — Scarpelli Hall 135 ·</w:t>
+            </w:r>
+            <w:r>
+              <w:t xml:space="preserve"> </w:t>
+            </w:r>
+            <w:hyperlink r:id="rId54">
+              <w:r>
+                <w:rPr>
+                  <w:rStyle w:val="Hyperlink"/>
+                </w:rPr>
+                <w:t xml:space="preserve">techhub@clark.edu</w:t>
+              </w:r>
+            </w:hyperlink>
+            <w:r>
+              <w:t xml:space="preserve"> </w:t>
+            </w:r>
+            <w:r>
+              <w:t xml:space="preserve">· 360-992-2010</w:t>
             </w:r>
           </w:p>
         </w:tc>
@@ -3737,8 +3811,19 @@
               <w:t xml:space="preserve"> </w:t>
             </w:r>
             <w:r>
-              <w:t xml:space="preserve">(replies come to your Clark Gmail)</w:t>
-            </w:r>
+              <w:t xml:space="preserve">(replies come to your Clark Gmail) ·</w:t>
+            </w:r>
+            <w:r>
+              <w:t xml:space="preserve"> </w:t>
+            </w:r>
+            <w:hyperlink r:id="rId55">
+              <w:r>
+                <w:rPr>
+                  <w:rStyle w:val="Hyperlink"/>
+                </w:rPr>
+                <w:t xml:space="preserve">Canvas Student Guide</w:t>
+              </w:r>
+            </w:hyperlink>
           </w:p>
         </w:tc>
       </w:tr>
@@ -3773,8 +3858,8 @@
         </w:tc>
       </w:tr>
     </w:tbl>
-    <w:bookmarkEnd w:id="49"/>
-    <w:bookmarkStart w:id="50" w:name="academic-support"/>
+    <w:bookmarkEnd w:id="56"/>
+    <w:bookmarkStart w:id="62" w:name="academic-support"/>
     <w:p>
       <w:pPr>
         <w:pStyle w:val="Heading2"/>
@@ -3831,13 +3916,16 @@
               <w:pStyle w:val="Compact"/>
               <w:jc w:val="left"/>
             </w:pPr>
-            <w:r>
-              <w:rPr>
-                <w:bCs/>
-                <w:b/>
-              </w:rPr>
-              <w:t xml:space="preserve">Student Success Coaches</w:t>
-            </w:r>
+            <w:hyperlink r:id="rId57">
+              <w:r>
+                <w:rPr>
+                  <w:rStyle w:val="Hyperlink"/>
+                  <w:bCs/>
+                  <w:b/>
+                </w:rPr>
+                <w:t xml:space="preserve">Student Success Coaches</w:t>
+              </w:r>
+            </w:hyperlink>
           </w:p>
         </w:tc>
         <w:tc>
@@ -3861,61 +3949,98 @@
               <w:pStyle w:val="Compact"/>
               <w:jc w:val="left"/>
             </w:pPr>
-            <w:r>
-              <w:rPr>
-                <w:bCs/>
-                <w:b/>
-              </w:rPr>
-              <w:t xml:space="preserve">Clark College Tutoring Services</w:t>
-            </w:r>
-          </w:p>
-        </w:tc>
-        <w:tc>
-          <w:tcPr/>
-          <w:p>
-            <w:pPr>
-              <w:pStyle w:val="Compact"/>
-              <w:jc w:val="left"/>
-            </w:pPr>
-            <w:r>
-              <w:t xml:space="preserve">In-person and virtual tutoring via Zoom; eTutoringOnline.org for additional online writing lab support.</w:t>
-            </w:r>
-          </w:p>
-        </w:tc>
-      </w:tr>
-      <w:tr>
-        <w:tc>
-          <w:tcPr/>
-          <w:p>
-            <w:pPr>
-              <w:pStyle w:val="Compact"/>
-              <w:jc w:val="left"/>
-            </w:pPr>
-            <w:r>
-              <w:rPr>
-                <w:bCs/>
-                <w:b/>
-              </w:rPr>
-              <w:t xml:space="preserve">Clark College Librarians</w:t>
-            </w:r>
-          </w:p>
-        </w:tc>
-        <w:tc>
-          <w:tcPr/>
-          <w:p>
-            <w:pPr>
-              <w:pStyle w:val="Compact"/>
-              <w:jc w:val="left"/>
-            </w:pPr>
-            <w:r>
-              <w:t xml:space="preserve">One-on-one help with research projects and source citations, in person or by chat.</w:t>
+            <w:hyperlink r:id="rId58">
+              <w:r>
+                <w:rPr>
+                  <w:rStyle w:val="Hyperlink"/>
+                  <w:bCs/>
+                  <w:b/>
+                </w:rPr>
+                <w:t xml:space="preserve">Clark College Tutoring Services</w:t>
+              </w:r>
+            </w:hyperlink>
+          </w:p>
+        </w:tc>
+        <w:tc>
+          <w:tcPr/>
+          <w:p>
+            <w:pPr>
+              <w:pStyle w:val="Compact"/>
+              <w:jc w:val="left"/>
+            </w:pPr>
+            <w:r>
+              <w:t xml:space="preserve">In-person and virtual tutoring via Zoom;</w:t>
+            </w:r>
+            <w:r>
+              <w:t xml:space="preserve"> </w:t>
+            </w:r>
+            <w:hyperlink r:id="rId59">
+              <w:r>
+                <w:rPr>
+                  <w:rStyle w:val="Hyperlink"/>
+                </w:rPr>
+                <w:t xml:space="preserve">eTutoringOnline.org</w:t>
+              </w:r>
+            </w:hyperlink>
+            <w:r>
+              <w:t xml:space="preserve"> </w:t>
+            </w:r>
+            <w:r>
+              <w:t xml:space="preserve">for additional online writing lab support.</w:t>
+            </w:r>
+          </w:p>
+        </w:tc>
+      </w:tr>
+      <w:tr>
+        <w:tc>
+          <w:tcPr/>
+          <w:p>
+            <w:pPr>
+              <w:pStyle w:val="Compact"/>
+              <w:jc w:val="left"/>
+            </w:pPr>
+            <w:hyperlink r:id="rId60">
+              <w:r>
+                <w:rPr>
+                  <w:rStyle w:val="Hyperlink"/>
+                  <w:bCs/>
+                  <w:b/>
+                </w:rPr>
+                <w:t xml:space="preserve">Clark College Librarians</w:t>
+              </w:r>
+            </w:hyperlink>
+          </w:p>
+        </w:tc>
+        <w:tc>
+          <w:tcPr/>
+          <w:p>
+            <w:pPr>
+              <w:pStyle w:val="Compact"/>
+              <w:jc w:val="left"/>
+            </w:pPr>
+            <w:r>
+              <w:t xml:space="preserve">One-on-one help with research projects and source citations, in person or by</w:t>
+            </w:r>
+            <w:r>
+              <w:t xml:space="preserve"> </w:t>
+            </w:r>
+            <w:hyperlink r:id="rId61">
+              <w:r>
+                <w:rPr>
+                  <w:rStyle w:val="Hyperlink"/>
+                </w:rPr>
+                <w:t xml:space="preserve">chat</w:t>
+              </w:r>
+            </w:hyperlink>
+            <w:r>
+              <w:t xml:space="preserve">.</w:t>
             </w:r>
           </w:p>
         </w:tc>
       </w:tr>
     </w:tbl>
-    <w:bookmarkEnd w:id="50"/>
-    <w:bookmarkStart w:id="51" w:name="student-support"/>
+    <w:bookmarkEnd w:id="62"/>
+    <w:bookmarkStart w:id="79" w:name="student-support"/>
     <w:p>
       <w:pPr>
         <w:pStyle w:val="Heading2"/>
@@ -3972,13 +4097,16 @@
               <w:pStyle w:val="Compact"/>
               <w:jc w:val="left"/>
             </w:pPr>
-            <w:r>
-              <w:rPr>
-                <w:bCs/>
-                <w:b/>
-              </w:rPr>
-              <w:t xml:space="preserve">Counseling and Health Center</w:t>
-            </w:r>
+            <w:hyperlink r:id="rId63">
+              <w:r>
+                <w:rPr>
+                  <w:rStyle w:val="Hyperlink"/>
+                  <w:bCs/>
+                  <w:b/>
+                </w:rPr>
+                <w:t xml:space="preserve">Counseling and Health Center</w:t>
+              </w:r>
+            </w:hyperlink>
           </w:p>
         </w:tc>
         <w:tc>
@@ -4002,175 +4130,271 @@
               <w:pStyle w:val="Compact"/>
               <w:jc w:val="left"/>
             </w:pPr>
-            <w:r>
-              <w:rPr>
-                <w:bCs/>
-                <w:b/>
-              </w:rPr>
-              <w:t xml:space="preserve">Office of People and Culture (OPC)</w:t>
-            </w:r>
-          </w:p>
-        </w:tc>
-        <w:tc>
-          <w:tcPr/>
-          <w:p>
-            <w:pPr>
-              <w:pStyle w:val="Compact"/>
-              <w:jc w:val="left"/>
-            </w:pPr>
-            <w:r>
-              <w:t xml:space="preserve">Supports systemically non-dominant groups navigating Clark College; the Diversity Center is a great place to visit between classes.</w:t>
-            </w:r>
-          </w:p>
-        </w:tc>
-      </w:tr>
-      <w:tr>
-        <w:tc>
-          <w:tcPr/>
-          <w:p>
-            <w:pPr>
-              <w:pStyle w:val="Compact"/>
-              <w:jc w:val="left"/>
-            </w:pPr>
-            <w:r>
-              <w:rPr>
-                <w:bCs/>
-                <w:b/>
-              </w:rPr>
-              <w:t xml:space="preserve">Penguin Pantry</w:t>
-            </w:r>
-          </w:p>
-        </w:tc>
-        <w:tc>
-          <w:tcPr/>
-          <w:p>
-            <w:pPr>
-              <w:pStyle w:val="Compact"/>
-              <w:jc w:val="left"/>
-            </w:pPr>
-            <w:r>
-              <w:t xml:space="preserve">Monthly pre-packaged food boxes. Contact Cath Busha, Dean of Student Engagement (cbusha@clark.edu).</w:t>
-            </w:r>
-          </w:p>
-        </w:tc>
-      </w:tr>
-      <w:tr>
-        <w:tc>
-          <w:tcPr/>
-          <w:p>
-            <w:pPr>
-              <w:pStyle w:val="Compact"/>
-              <w:jc w:val="left"/>
-            </w:pPr>
-            <w:r>
-              <w:rPr>
-                <w:bCs/>
-                <w:b/>
-              </w:rPr>
-              <w:t xml:space="preserve">Basic Needs Hub</w:t>
-            </w:r>
-          </w:p>
-        </w:tc>
-        <w:tc>
-          <w:tcPr/>
-          <w:p>
-            <w:pPr>
-              <w:pStyle w:val="Compact"/>
-              <w:jc w:val="left"/>
-            </w:pPr>
-            <w:r>
-              <w:t xml:space="preserve">Help with food, housing, and financial challenges. basicneeds@clark.edu · 360-992-2766 · Gaiser Hall (GHL) 216.</w:t>
-            </w:r>
-          </w:p>
-        </w:tc>
-      </w:tr>
-      <w:tr>
-        <w:tc>
-          <w:tcPr/>
-          <w:p>
-            <w:pPr>
-              <w:pStyle w:val="Compact"/>
-              <w:jc w:val="left"/>
-            </w:pPr>
-            <w:r>
-              <w:rPr>
-                <w:bCs/>
-                <w:b/>
-              </w:rPr>
-              <w:t xml:space="preserve">Advising Services</w:t>
-            </w:r>
-          </w:p>
-        </w:tc>
-        <w:tc>
-          <w:tcPr/>
-          <w:p>
-            <w:pPr>
-              <w:pStyle w:val="Compact"/>
-              <w:jc w:val="left"/>
-            </w:pPr>
-            <w:r>
-              <w:t xml:space="preserve">Co-create academic plans aligned with your career and personal goals.</w:t>
-            </w:r>
-          </w:p>
-        </w:tc>
-      </w:tr>
-      <w:tr>
-        <w:tc>
-          <w:tcPr/>
-          <w:p>
-            <w:pPr>
-              <w:pStyle w:val="Compact"/>
-              <w:jc w:val="left"/>
-            </w:pPr>
-            <w:r>
-              <w:rPr>
-                <w:bCs/>
-                <w:b/>
-              </w:rPr>
-              <w:t xml:space="preserve">Career Services</w:t>
-            </w:r>
-          </w:p>
-        </w:tc>
-        <w:tc>
-          <w:tcPr/>
-          <w:p>
-            <w:pPr>
-              <w:pStyle w:val="Compact"/>
-              <w:jc w:val="left"/>
-            </w:pPr>
-            <w:r>
-              <w:t xml:space="preserve">Resources and strategies for career and employment goals. 360-992-2902 · careerservices@clark.edu</w:t>
-            </w:r>
-          </w:p>
-        </w:tc>
-      </w:tr>
-      <w:tr>
-        <w:tc>
-          <w:tcPr/>
-          <w:p>
-            <w:pPr>
-              <w:pStyle w:val="Compact"/>
-              <w:jc w:val="left"/>
-            </w:pPr>
-            <w:r>
-              <w:rPr>
-                <w:bCs/>
-                <w:b/>
-              </w:rPr>
-              <w:t xml:space="preserve">Veterans Center of Excellence</w:t>
-            </w:r>
-          </w:p>
-        </w:tc>
-        <w:tc>
-          <w:tcPr/>
-          <w:p>
-            <w:pPr>
-              <w:pStyle w:val="Compact"/>
-              <w:jc w:val="left"/>
-            </w:pPr>
-            <w:r>
-              <w:t xml:space="preserve">Resources, community, and support for U.S. military service members. PUB 015 · 360-992-2073 · Vetresources@clark.edu</w:t>
-            </w:r>
+            <w:hyperlink r:id="rId64">
+              <w:r>
+                <w:rPr>
+                  <w:rStyle w:val="Hyperlink"/>
+                  <w:bCs/>
+                  <w:b/>
+                </w:rPr>
+                <w:t xml:space="preserve">Office of People and Culture (OPC)</w:t>
+              </w:r>
+            </w:hyperlink>
+          </w:p>
+        </w:tc>
+        <w:tc>
+          <w:tcPr/>
+          <w:p>
+            <w:pPr>
+              <w:pStyle w:val="Compact"/>
+              <w:jc w:val="left"/>
+            </w:pPr>
+            <w:r>
+              <w:t xml:space="preserve">Supports systemically non-dominant groups navigating Clark College; the</w:t>
+            </w:r>
+            <w:r>
+              <w:t xml:space="preserve"> </w:t>
+            </w:r>
+            <w:hyperlink r:id="rId65">
+              <w:r>
+                <w:rPr>
+                  <w:rStyle w:val="Hyperlink"/>
+                </w:rPr>
+                <w:t xml:space="preserve">Diversity Center</w:t>
+              </w:r>
+            </w:hyperlink>
+            <w:r>
+              <w:t xml:space="preserve"> </w:t>
+            </w:r>
+            <w:r>
+              <w:t xml:space="preserve">is a great place to visit between classes.</w:t>
+            </w:r>
+          </w:p>
+        </w:tc>
+      </w:tr>
+      <w:tr>
+        <w:tc>
+          <w:tcPr/>
+          <w:p>
+            <w:pPr>
+              <w:pStyle w:val="Compact"/>
+              <w:jc w:val="left"/>
+            </w:pPr>
+            <w:hyperlink r:id="rId66">
+              <w:r>
+                <w:rPr>
+                  <w:rStyle w:val="Hyperlink"/>
+                  <w:bCs/>
+                  <w:b/>
+                </w:rPr>
+                <w:t xml:space="preserve">Penguin Pantry</w:t>
+              </w:r>
+            </w:hyperlink>
+          </w:p>
+        </w:tc>
+        <w:tc>
+          <w:tcPr/>
+          <w:p>
+            <w:pPr>
+              <w:pStyle w:val="Compact"/>
+              <w:jc w:val="left"/>
+            </w:pPr>
+            <w:r>
+              <w:t xml:space="preserve">Monthly pre-packaged food boxes. Contact Cath Busha, Dean of Student Engagement (</w:t>
+            </w:r>
+            <w:hyperlink r:id="rId67">
+              <w:r>
+                <w:rPr>
+                  <w:rStyle w:val="Hyperlink"/>
+                </w:rPr>
+                <w:t xml:space="preserve">cbusha@clark.edu</w:t>
+              </w:r>
+            </w:hyperlink>
+            <w:r>
+              <w:t xml:space="preserve">).</w:t>
+            </w:r>
+          </w:p>
+        </w:tc>
+      </w:tr>
+      <w:tr>
+        <w:tc>
+          <w:tcPr/>
+          <w:p>
+            <w:pPr>
+              <w:pStyle w:val="Compact"/>
+              <w:jc w:val="left"/>
+            </w:pPr>
+            <w:hyperlink r:id="rId68">
+              <w:r>
+                <w:rPr>
+                  <w:rStyle w:val="Hyperlink"/>
+                  <w:bCs/>
+                  <w:b/>
+                </w:rPr>
+                <w:t xml:space="preserve">Basic Needs Hub</w:t>
+              </w:r>
+            </w:hyperlink>
+          </w:p>
+        </w:tc>
+        <w:tc>
+          <w:tcPr/>
+          <w:p>
+            <w:pPr>
+              <w:pStyle w:val="Compact"/>
+              <w:jc w:val="left"/>
+            </w:pPr>
+            <w:r>
+              <w:t xml:space="preserve">Help with food, housing, and financial challenges —</w:t>
+            </w:r>
+            <w:r>
+              <w:t xml:space="preserve"> </w:t>
+            </w:r>
+            <w:hyperlink r:id="rId69">
+              <w:r>
+                <w:rPr>
+                  <w:rStyle w:val="Hyperlink"/>
+                </w:rPr>
+                <w:t xml:space="preserve">intake form</w:t>
+              </w:r>
+            </w:hyperlink>
+            <w:r>
+              <w:t xml:space="preserve">. basicneeds@clark.edu · 360-992-2766 · Gaiser Hall (GHL) 216.</w:t>
+            </w:r>
+          </w:p>
+        </w:tc>
+      </w:tr>
+      <w:tr>
+        <w:tc>
+          <w:tcPr/>
+          <w:p>
+            <w:pPr>
+              <w:pStyle w:val="Compact"/>
+              <w:jc w:val="left"/>
+            </w:pPr>
+            <w:hyperlink r:id="rId70">
+              <w:r>
+                <w:rPr>
+                  <w:rStyle w:val="Hyperlink"/>
+                  <w:bCs/>
+                  <w:b/>
+                </w:rPr>
+                <w:t xml:space="preserve">Advising Services</w:t>
+              </w:r>
+            </w:hyperlink>
+          </w:p>
+        </w:tc>
+        <w:tc>
+          <w:tcPr/>
+          <w:p>
+            <w:pPr>
+              <w:pStyle w:val="Compact"/>
+              <w:jc w:val="left"/>
+            </w:pPr>
+            <w:r>
+              <w:t xml:space="preserve">Co-create academic plans aligned with your career and personal goals —</w:t>
+            </w:r>
+            <w:r>
+              <w:t xml:space="preserve"> </w:t>
+            </w:r>
+            <w:hyperlink r:id="rId71">
+              <w:r>
+                <w:rPr>
+                  <w:rStyle w:val="Hyperlink"/>
+                </w:rPr>
+                <w:t xml:space="preserve">schedule an appointment</w:t>
+              </w:r>
+            </w:hyperlink>
+            <w:r>
+              <w:t xml:space="preserve">.</w:t>
+            </w:r>
+          </w:p>
+        </w:tc>
+      </w:tr>
+      <w:tr>
+        <w:tc>
+          <w:tcPr/>
+          <w:p>
+            <w:pPr>
+              <w:pStyle w:val="Compact"/>
+              <w:jc w:val="left"/>
+            </w:pPr>
+            <w:hyperlink r:id="rId72">
+              <w:r>
+                <w:rPr>
+                  <w:rStyle w:val="Hyperlink"/>
+                  <w:bCs/>
+                  <w:b/>
+                </w:rPr>
+                <w:t xml:space="preserve">Career Services</w:t>
+              </w:r>
+            </w:hyperlink>
+          </w:p>
+        </w:tc>
+        <w:tc>
+          <w:tcPr/>
+          <w:p>
+            <w:pPr>
+              <w:pStyle w:val="Compact"/>
+              <w:jc w:val="left"/>
+            </w:pPr>
+            <w:r>
+              <w:t xml:space="preserve">Resources and strategies for career and employment goals. 360-992-2902 ·</w:t>
+            </w:r>
+            <w:r>
+              <w:t xml:space="preserve"> </w:t>
+            </w:r>
+            <w:hyperlink r:id="rId73">
+              <w:r>
+                <w:rPr>
+                  <w:rStyle w:val="Hyperlink"/>
+                </w:rPr>
+                <w:t xml:space="preserve">careerservices@clark.edu</w:t>
+              </w:r>
+            </w:hyperlink>
+          </w:p>
+        </w:tc>
+      </w:tr>
+      <w:tr>
+        <w:tc>
+          <w:tcPr/>
+          <w:p>
+            <w:pPr>
+              <w:pStyle w:val="Compact"/>
+              <w:jc w:val="left"/>
+            </w:pPr>
+            <w:hyperlink r:id="rId74">
+              <w:r>
+                <w:rPr>
+                  <w:rStyle w:val="Hyperlink"/>
+                  <w:bCs/>
+                  <w:b/>
+                </w:rPr>
+                <w:t xml:space="preserve">Veterans Center of Excellence</w:t>
+              </w:r>
+            </w:hyperlink>
+          </w:p>
+        </w:tc>
+        <w:tc>
+          <w:tcPr/>
+          <w:p>
+            <w:pPr>
+              <w:pStyle w:val="Compact"/>
+              <w:jc w:val="left"/>
+            </w:pPr>
+            <w:r>
+              <w:t xml:space="preserve">Resources, community, and support for U.S. military service members. PUB 015 · 360-992-2073 ·</w:t>
+            </w:r>
+            <w:r>
+              <w:t xml:space="preserve"> </w:t>
+            </w:r>
+            <w:hyperlink r:id="rId75">
+              <w:r>
+                <w:rPr>
+                  <w:rStyle w:val="Hyperlink"/>
+                </w:rPr>
+                <w:t xml:space="preserve">Vetresources@clark.edu</w:t>
+              </w:r>
+            </w:hyperlink>
           </w:p>
         </w:tc>
       </w:tr>
@@ -4180,12 +4404,68 @@
         <w:pStyle w:val="BodyText"/>
       </w:pPr>
       <w:r>
-        <w:t xml:space="preserve">You can find all these resources as well as links to the Clark bookstore, C-Tran, campus maps, and campus life and activities at the Clark Students website.</w:t>
-      </w:r>
-    </w:p>
-    <w:bookmarkEnd w:id="51"/>
-    <w:bookmarkEnd w:id="52"/>
-    <w:bookmarkStart w:id="53" w:name="how-should-i-get-started-in-class"/>
+        <w:t xml:space="preserve">You can find all these resources as well as links to the</w:t>
+      </w:r>
+      <w:r>
+        <w:t xml:space="preserve"> </w:t>
+      </w:r>
+      <w:hyperlink r:id="rId35">
+        <w:r>
+          <w:rPr>
+            <w:rStyle w:val="Hyperlink"/>
+          </w:rPr>
+          <w:t xml:space="preserve">Clark bookstore</w:t>
+        </w:r>
+      </w:hyperlink>
+      <w:r>
+        <w:t xml:space="preserve">,</w:t>
+      </w:r>
+      <w:r>
+        <w:t xml:space="preserve"> </w:t>
+      </w:r>
+      <w:hyperlink r:id="rId76">
+        <w:r>
+          <w:rPr>
+            <w:rStyle w:val="Hyperlink"/>
+          </w:rPr>
+          <w:t xml:space="preserve">C-Tran</w:t>
+        </w:r>
+      </w:hyperlink>
+      <w:r>
+        <w:t xml:space="preserve">,</w:t>
+      </w:r>
+      <w:r>
+        <w:t xml:space="preserve"> </w:t>
+      </w:r>
+      <w:hyperlink r:id="rId77">
+        <w:r>
+          <w:rPr>
+            <w:rStyle w:val="Hyperlink"/>
+          </w:rPr>
+          <w:t xml:space="preserve">campus maps</w:t>
+        </w:r>
+      </w:hyperlink>
+      <w:r>
+        <w:t xml:space="preserve">, and campus life and activities at the</w:t>
+      </w:r>
+      <w:r>
+        <w:t xml:space="preserve"> </w:t>
+      </w:r>
+      <w:hyperlink r:id="rId78">
+        <w:r>
+          <w:rPr>
+            <w:rStyle w:val="Hyperlink"/>
+          </w:rPr>
+          <w:t xml:space="preserve">Clark Students website</w:t>
+        </w:r>
+      </w:hyperlink>
+      <w:r>
+        <w:t xml:space="preserve">.</w:t>
+      </w:r>
+    </w:p>
+    <w:bookmarkEnd w:id="79"/>
+    <w:bookmarkEnd w:id="80"/>
+    <w:bookmarkStart w:id="81" w:name="how-should-i-get-started-in-class"/>
     <w:p>
       <w:pPr>
         <w:pStyle w:val="Heading1"/>
@@ -4202,8 +4482,8 @@
         <w:t xml:space="preserve">See Your First Week, near the top of this syllabus, for the exact five things to do before anything else.</w:t>
       </w:r>
     </w:p>
-    <w:bookmarkEnd w:id="53"/>
-    <w:bookmarkStart w:id="58" w:name="appendix-official-college-policies"/>
+    <w:bookmarkEnd w:id="81"/>
+    <w:bookmarkStart w:id="95" w:name="appendix-official-college-policies"/>
     <w:p>
       <w:pPr>
         <w:pStyle w:val="Heading1"/>
@@ -4220,7 +4500,7 @@
         <w:t xml:space="preserve">Everything below is required Clark College policy language, included in full because it has to be — not because it’s what this course is about. A TL;DR sits above each one so you can get the gist and move on, or dig into the full text if it applies to you.</w:t>
       </w:r>
     </w:p>
-    <w:bookmarkStart w:id="54" w:name="ada-accommodations"/>
+    <w:bookmarkStart w:id="85" w:name="ada-accommodations"/>
     <w:p>
       <w:pPr>
         <w:pStyle w:val="Heading2"/>
@@ -4252,7 +4532,21 @@
         <w:pStyle w:val="BodyText"/>
       </w:pPr>
       <w:r>
-        <w:t xml:space="preserve">Clark College and Disability Access Center (DAC) assist students with disabilities in pursuing their educational goals. Clark College is committed to assuring that its services are accessible to individuals with disabilities. Disability Access Center (DAC) coordinates accommodations for students with disabilities and/or temporary health conditions (could include a temporary injury or pregnancy). DAC approves and provides student disability accommodations for classes in partnership with faculty. Students with disabilities who believe that they may need accommodations in this class are encouraged to contact DAC as soon as possible to better ensure that accommodations are implemented in a timely manner. All accommodations must first be approved through Disability Access Center. Interested in getting accommodations? You can request accommodations by following steps on the DAC website www.clark.edu/dac. Or contact DAC one of these ways:</w:t>
+        <w:t xml:space="preserve">Clark College and Disability Access Center (DAC) assist students with disabilities in pursuing their educational goals. Clark College is committed to assuring that its services are accessible to individuals with disabilities. Disability Access Center (DAC) coordinates accommodations for students with disabilities and/or temporary health conditions (could include a temporary injury or pregnancy). DAC approves and provides student disability accommodations for classes in partnership with faculty. Students with disabilities who believe that they may need accommodations in this class are encouraged to contact DAC as soon as possible to better ensure that accommodations are implemented in a timely manner. All accommodations must first be approved through Disability Access Center. Interested in getting accommodations? You can request accommodations by following the</w:t>
+      </w:r>
+      <w:r>
+        <w:t xml:space="preserve"> </w:t>
+      </w:r>
+      <w:hyperlink r:id="rId28">
+        <w:r>
+          <w:rPr>
+            <w:rStyle w:val="Hyperlink"/>
+          </w:rPr>
+          <w:t xml:space="preserve">steps on the DAC website</w:t>
+        </w:r>
+      </w:hyperlink>
+      <w:r>
+        <w:t xml:space="preserve">. Or contact DAC one of these ways:</w:t>
       </w:r>
     </w:p>
     <w:p>
@@ -4276,7 +4570,21 @@
         <w:pStyle w:val="Compact"/>
       </w:pPr>
       <w:r>
-        <w:t xml:space="preserve">Email: dac@clark.edu. Fax: (360) 992-2879.</w:t>
+        <w:t xml:space="preserve">Email:</w:t>
+      </w:r>
+      <w:r>
+        <w:t xml:space="preserve"> </w:t>
+      </w:r>
+      <w:hyperlink r:id="rId82">
+        <w:r>
+          <w:rPr>
+            <w:rStyle w:val="Hyperlink"/>
+          </w:rPr>
+          <w:t xml:space="preserve">dac@clark.edu</w:t>
+        </w:r>
+      </w:hyperlink>
+      <w:r>
+        <w:t xml:space="preserve">. Fax: (360) 992-2879.</w:t>
       </w:r>
     </w:p>
     <w:p>
@@ -4296,7 +4604,55 @@
         <w:pStyle w:val="FirstParagraph"/>
       </w:pPr>
       <w:r>
-        <w:t xml:space="preserve">If you have already been approved for accommodations, don’t forget to request them every term in myAccess. Students who need to test at DAC also need to schedule their own exams in myAccess or by contacting DAC. Exams should be scheduled with DAC with at least 5 business days’ notice. Please reach out to DACtesting@clark.edu if you have any questions about your testing accommodations.</w:t>
+        <w:t xml:space="preserve">If you have already been approved for accommodations, don’t forget to</w:t>
+      </w:r>
+      <w:r>
+        <w:t xml:space="preserve"> </w:t>
+      </w:r>
+      <w:hyperlink r:id="rId83">
+        <w:r>
+          <w:rPr>
+            <w:rStyle w:val="Hyperlink"/>
+          </w:rPr>
+          <w:t xml:space="preserve">request them every term in myAccess</w:t>
+        </w:r>
+      </w:hyperlink>
+      <w:r>
+        <w:t xml:space="preserve">. Students who need to test at DAC also need to</w:t>
+      </w:r>
+      <w:r>
+        <w:t xml:space="preserve"> </w:t>
+      </w:r>
+      <w:hyperlink r:id="rId83">
+        <w:r>
+          <w:rPr>
+            <w:rStyle w:val="Hyperlink"/>
+          </w:rPr>
+          <w:t xml:space="preserve">schedule their own exams in myAccess</w:t>
+        </w:r>
+      </w:hyperlink>
+      <w:r>
+        <w:t xml:space="preserve"> </w:t>
+      </w:r>
+      <w:r>
+        <w:t xml:space="preserve">or by contacting DAC. Exams should be scheduled with DAC with at least 5 business days’ notice. Please reach out to</w:t>
+      </w:r>
+      <w:r>
+        <w:t xml:space="preserve"> </w:t>
+      </w:r>
+      <w:hyperlink r:id="rId84">
+        <w:r>
+          <w:rPr>
+            <w:rStyle w:val="Hyperlink"/>
+          </w:rPr>
+          <w:t xml:space="preserve">DACtesting@clark.edu</w:t>
+        </w:r>
+      </w:hyperlink>
+      <w:r>
+        <w:t xml:space="preserve"> </w:t>
+      </w:r>
+      <w:r>
+        <w:t xml:space="preserve">if you have any questions about your testing accommodations.</w:t>
       </w:r>
     </w:p>
     <w:p>
@@ -4307,8 +4663,8 @@
         <w:t xml:space="preserve">Once you have established accommodations with Disability Access Center, please contact me as your instructor to discuss your needs in this course.</w:t>
       </w:r>
     </w:p>
-    <w:bookmarkEnd w:id="54"/>
-    <w:bookmarkStart w:id="55" w:name="non-discrimination-policy"/>
+    <w:bookmarkEnd w:id="85"/>
+    <w:bookmarkStart w:id="87" w:name="non-discrimination-policy"/>
     <w:p>
       <w:pPr>
         <w:pStyle w:val="Heading2"/>
@@ -4348,11 +4704,22 @@
         <w:pStyle w:val="BodyText"/>
       </w:pPr>
       <w:r>
-        <w:t xml:space="preserve">Human Resources Department — 1933 Fort Vancouver Way, Baird Hall 133 — Phone: (360) 992-2105 — Email: hr@clark.edu</w:t>
-      </w:r>
-    </w:p>
-    <w:bookmarkEnd w:id="55"/>
-    <w:bookmarkStart w:id="56" w:name="title-ix-and-sexual-misconduct"/>
+        <w:t xml:space="preserve">Human Resources Department — 1933 Fort Vancouver Way, Baird Hall 133 — Phone: (360) 992-2105 — Email:</w:t>
+      </w:r>
+      <w:r>
+        <w:t xml:space="preserve"> </w:t>
+      </w:r>
+      <w:hyperlink r:id="rId86">
+        <w:r>
+          <w:rPr>
+            <w:rStyle w:val="Hyperlink"/>
+          </w:rPr>
+          <w:t xml:space="preserve">hr@clark.edu</w:t>
+        </w:r>
+      </w:hyperlink>
+    </w:p>
+    <w:bookmarkEnd w:id="87"/>
+    <w:bookmarkStart w:id="92" w:name="title-ix-and-sexual-misconduct"/>
     <w:p>
       <w:pPr>
         <w:pStyle w:val="Heading2"/>
@@ -4428,11 +4795,84 @@
         <w:t xml:space="preserve"> </w:t>
       </w:r>
       <w:r>
-        <w:t xml:space="preserve">to do. Learn more about campus and community resources, reporting options, Title IX, personal safety, and how to help a friend who may have experienced sexual misconduct at clark.edu/title-IX. You can also contact the Counseling and Health Center if you would like to pursue counseling.</w:t>
-      </w:r>
-    </w:p>
-    <w:bookmarkEnd w:id="56"/>
-    <w:bookmarkStart w:id="57" w:name="student-rights-and-responsibilities"/>
+        <w:t xml:space="preserve">to do. Learn more about</w:t>
+      </w:r>
+      <w:r>
+        <w:t xml:space="preserve"> </w:t>
+      </w:r>
+      <w:hyperlink r:id="rId88">
+        <w:r>
+          <w:rPr>
+            <w:rStyle w:val="Hyperlink"/>
+          </w:rPr>
+          <w:t xml:space="preserve">campus and community resources</w:t>
+        </w:r>
+      </w:hyperlink>
+      <w:r>
+        <w:t xml:space="preserve">,</w:t>
+      </w:r>
+      <w:r>
+        <w:t xml:space="preserve"> </w:t>
+      </w:r>
+      <w:hyperlink r:id="rId89">
+        <w:r>
+          <w:rPr>
+            <w:rStyle w:val="Hyperlink"/>
+          </w:rPr>
+          <w:t xml:space="preserve">reporting options</w:t>
+        </w:r>
+      </w:hyperlink>
+      <w:r>
+        <w:t xml:space="preserve">,</w:t>
+      </w:r>
+      <w:r>
+        <w:t xml:space="preserve"> </w:t>
+      </w:r>
+      <w:hyperlink r:id="rId90">
+        <w:r>
+          <w:rPr>
+            <w:rStyle w:val="Hyperlink"/>
+          </w:rPr>
+          <w:t xml:space="preserve">Title IX</w:t>
+        </w:r>
+      </w:hyperlink>
+      <w:r>
+        <w:t xml:space="preserve">,</w:t>
+      </w:r>
+      <w:r>
+        <w:t xml:space="preserve"> </w:t>
+      </w:r>
+      <w:hyperlink r:id="rId91">
+        <w:r>
+          <w:rPr>
+            <w:rStyle w:val="Hyperlink"/>
+          </w:rPr>
+          <w:t xml:space="preserve">personal safety</w:t>
+        </w:r>
+      </w:hyperlink>
+      <w:r>
+        <w:t xml:space="preserve">, and how to help a friend who may have experienced sexual misconduct. You can also contact the</w:t>
+      </w:r>
+      <w:r>
+        <w:t xml:space="preserve"> </w:t>
+      </w:r>
+      <w:hyperlink r:id="rId63">
+        <w:r>
+          <w:rPr>
+            <w:rStyle w:val="Hyperlink"/>
+          </w:rPr>
+          <w:t xml:space="preserve">Counseling and Health Center</w:t>
+        </w:r>
+      </w:hyperlink>
+      <w:r>
+        <w:t xml:space="preserve"> </w:t>
+      </w:r>
+      <w:r>
+        <w:t xml:space="preserve">if you would like to pursue counseling.</w:t>
+      </w:r>
+    </w:p>
+    <w:bookmarkEnd w:id="92"/>
+    <w:bookmarkStart w:id="94" w:name="student-rights-and-responsibilities"/>
     <w:p>
       <w:pPr>
         <w:pStyle w:val="Heading2"/>
@@ -4464,11 +4904,25 @@
         <w:pStyle w:val="BodyText"/>
       </w:pPr>
       <w:r>
-        <w:t xml:space="preserve">On Clark’s Student Rights and Responsibilities page, you can find information about freedom of access to education, student absence for reasons of faith or conscience, FERPA, emergency and health information, etc. Please get in touch if you would like to discuss absences for reasons of faith. I am here to support you.</w:t>
-      </w:r>
-    </w:p>
-    <w:bookmarkEnd w:id="57"/>
-    <w:bookmarkEnd w:id="58"/>
+        <w:t xml:space="preserve">On Clark’s</w:t>
+      </w:r>
+      <w:r>
+        <w:t xml:space="preserve"> </w:t>
+      </w:r>
+      <w:hyperlink r:id="rId93">
+        <w:r>
+          <w:rPr>
+            <w:rStyle w:val="Hyperlink"/>
+          </w:rPr>
+          <w:t xml:space="preserve">Student Rights and Responsibilities page</w:t>
+        </w:r>
+      </w:hyperlink>
+      <w:r>
+        <w:t xml:space="preserve">, you can find information about freedom of access to education, student absence for reasons of faith or conscience, FERPA, emergency and health information, etc. Please get in touch if you would like to discuss absences for reasons of faith. I am here to support you.</w:t>
+      </w:r>
+    </w:p>
+    <w:bookmarkEnd w:id="94"/>
+    <w:bookmarkEnd w:id="95"/>
     <w:sectPr/>
   </w:body>
 </w:document>

</xml_diff>

<commit_message>
Restore more missing hyperlinks in resource/policy sections
Course catalog reference, plagiarism guide, Scarpelli Hall map,
Canvas Guides, Virtual Tutoring Center, and PUB 015 map were still
plain text; also corrects the campus maps URL. Regenerated site
content and downloads.

Co-Authored-By: Claude Sonnet 5 <noreply@anthropic.com>
</commit_message>
<xml_diff>
--- a/downloads/CHEM121_Syllabus_Fall2026.docx
+++ b/downloads/CHEM121_Syllabus_Fall2026.docx
@@ -722,7 +722,7 @@
     </w:p>
     <w:bookmarkEnd w:id="22"/>
     <w:bookmarkEnd w:id="23"/>
-    <w:bookmarkStart w:id="25" w:name="course-information"/>
+    <w:bookmarkStart w:id="26" w:name="course-information"/>
     <w:p>
       <w:pPr>
         <w:pStyle w:val="Heading1"/>
@@ -1063,7 +1063,38 @@
                 <w:bCs/>
                 <w:b/>
               </w:rPr>
-              <w:t xml:space="preserve">What the catalog says:</w:t>
+              <w:t xml:space="preserve">What</w:t>
+            </w:r>
+            <w:r>
+              <w:rPr>
+                <w:bCs/>
+                <w:b/>
+              </w:rPr>
+              <w:t xml:space="preserve"> </w:t>
+            </w:r>
+            <w:hyperlink r:id="rId25">
+              <w:r>
+                <w:rPr>
+                  <w:rStyle w:val="Hyperlink"/>
+                  <w:bCs/>
+                  <w:b/>
+                </w:rPr>
+                <w:t xml:space="preserve">Clark’s Course Catalog</w:t>
+              </w:r>
+            </w:hyperlink>
+            <w:r>
+              <w:rPr>
+                <w:bCs/>
+                <w:b/>
+              </w:rPr>
+              <w:t xml:space="preserve"> </w:t>
+            </w:r>
+            <w:r>
+              <w:rPr>
+                <w:bCs/>
+                <w:b/>
+              </w:rPr>
+              <w:t xml:space="preserve">says:</w:t>
             </w:r>
             <w:r>
               <w:t xml:space="preserve"> </w:t>
@@ -1088,8 +1119,8 @@
         </w:tc>
       </w:tr>
     </w:tbl>
-    <w:bookmarkEnd w:id="25"/>
-    <w:bookmarkStart w:id="31" w:name="welcome-to-class"/>
+    <w:bookmarkEnd w:id="26"/>
+    <w:bookmarkStart w:id="32" w:name="welcome-to-class"/>
     <w:p>
       <w:pPr>
         <w:pStyle w:val="Heading1"/>
@@ -1146,7 +1177,7 @@
         <w:t xml:space="preserve">Most students who stick with the weekly rhythm and stay engaged do well. The difference isn’t talent, it’s showing up consistently. Give yourself a fighting chance.</w:t>
       </w:r>
     </w:p>
-    <w:bookmarkStart w:id="26" w:name="Xe66c6beb7eb2ec0e95c71e590f49bdb9df56704"/>
+    <w:bookmarkStart w:id="27" w:name="Xe66c6beb7eb2ec0e95c71e590f49bdb9df56704"/>
     <w:p>
       <w:pPr>
         <w:pStyle w:val="Heading2"/>
@@ -1163,8 +1194,8 @@
         <w:t xml:space="preserve">CHEM is a math class combined with a foreign language course, and we move fast. We use math conversions from day one and keep using them every week, in both discussion and lab. If your math skills need more than a light dusting-off, consider brushing up before or alongside this course — most students taking CHEM&amp;121 find the math the hardest part, not the chemistry itself.</w:t>
       </w:r>
     </w:p>
-    <w:bookmarkEnd w:id="26"/>
-    <w:bookmarkStart w:id="27" w:name="what-can-i-expect-in-class"/>
+    <w:bookmarkEnd w:id="27"/>
+    <w:bookmarkStart w:id="28" w:name="what-can-i-expect-in-class"/>
     <w:p>
       <w:pPr>
         <w:pStyle w:val="Heading2"/>
@@ -1203,8 +1234,8 @@
         <w:t xml:space="preserve">If you’ve taken a science course before, don’t assume this one works the same way: there are no traditional lectures, quizzes happen in person during lab, and labs are real science, not a recipe to follow. More on exactly how below.</w:t>
       </w:r>
     </w:p>
-    <w:bookmarkEnd w:id="27"/>
-    <w:bookmarkStart w:id="29" w:name="what-if-i-need-an-accommodation"/>
+    <w:bookmarkEnd w:id="28"/>
+    <w:bookmarkStart w:id="30" w:name="what-if-i-need-an-accommodation"/>
     <w:p>
       <w:pPr>
         <w:pStyle w:val="Heading2"/>
@@ -1223,7 +1254,7 @@
       <w:r>
         <w:t xml:space="preserve"> </w:t>
       </w:r>
-      <w:hyperlink r:id="rId28">
+      <w:hyperlink r:id="rId29">
         <w:r>
           <w:rPr>
             <w:rStyle w:val="Hyperlink"/>
@@ -1235,8 +1266,8 @@
         <w:t xml:space="preserve">.</w:t>
       </w:r>
     </w:p>
-    <w:bookmarkEnd w:id="29"/>
-    <w:bookmarkStart w:id="30" w:name="weekly-flow"/>
+    <w:bookmarkEnd w:id="30"/>
+    <w:bookmarkStart w:id="31" w:name="weekly-flow"/>
     <w:p>
       <w:pPr>
         <w:pStyle w:val="Heading2"/>
@@ -1506,9 +1537,9 @@
         <w:t xml:space="preserve">Prioritize content learning in your Chemfolio with your team first. Labs are based on the assigned content from the module.</w:t>
       </w:r>
     </w:p>
-    <w:bookmarkEnd w:id="30"/>
     <w:bookmarkEnd w:id="31"/>
-    <w:bookmarkStart w:id="33" w:name="about-your-instructor"/>
+    <w:bookmarkEnd w:id="32"/>
+    <w:bookmarkStart w:id="34" w:name="about-your-instructor"/>
     <w:p>
       <w:pPr>
         <w:pStyle w:val="Heading1"/>
@@ -1729,7 +1760,7 @@
         </w:tc>
       </w:tr>
     </w:tbl>
-    <w:bookmarkStart w:id="32" w:name="what-can-you-expect-from-me"/>
+    <w:bookmarkStart w:id="33" w:name="what-can-you-expect-from-me"/>
     <w:p>
       <w:pPr>
         <w:pStyle w:val="Heading2"/>
@@ -1778,9 +1809,9 @@
         <w:t xml:space="preserve">— Dr. B</w:t>
       </w:r>
     </w:p>
-    <w:bookmarkEnd w:id="32"/>
     <w:bookmarkEnd w:id="33"/>
-    <w:bookmarkStart w:id="36" w:name="what-course-materials-will-i-need"/>
+    <w:bookmarkEnd w:id="34"/>
+    <w:bookmarkStart w:id="37" w:name="what-course-materials-will-i-need"/>
     <w:p>
       <w:pPr>
         <w:pStyle w:val="Heading1"/>
@@ -2056,7 +2087,7 @@
             <w:r>
               <w:t xml:space="preserve"> </w:t>
             </w:r>
-            <w:hyperlink r:id="rId34">
+            <w:hyperlink r:id="rId35">
               <w:r>
                 <w:rPr>
                   <w:rStyle w:val="Hyperlink"/>
@@ -2103,7 +2134,7 @@
             <w:r>
               <w:t xml:space="preserve"> </w:t>
             </w:r>
-            <w:hyperlink r:id="rId34">
+            <w:hyperlink r:id="rId35">
               <w:r>
                 <w:rPr>
                   <w:rStyle w:val="Hyperlink"/>
@@ -2150,7 +2181,7 @@
             <w:r>
               <w:t xml:space="preserve"> </w:t>
             </w:r>
-            <w:hyperlink r:id="rId35">
+            <w:hyperlink r:id="rId36">
               <w:r>
                 <w:rPr>
                   <w:rStyle w:val="Hyperlink"/>
@@ -2168,8 +2199,8 @@
         </w:tc>
       </w:tr>
     </w:tbl>
-    <w:bookmarkEnd w:id="36"/>
-    <w:bookmarkStart w:id="44" w:name="what-are-the-course-agreements"/>
+    <w:bookmarkEnd w:id="37"/>
+    <w:bookmarkStart w:id="46" w:name="what-are-the-course-agreements"/>
     <w:p>
       <w:pPr>
         <w:pStyle w:val="Heading1"/>
@@ -2196,7 +2227,7 @@
         <w:t xml:space="preserve">Message me in Canvas Inbox, cite anything that isn’t yours, never let AI write your discussion posts, and show up ready to work.</w:t>
       </w:r>
     </w:p>
-    <w:bookmarkStart w:id="37" w:name="communication"/>
+    <w:bookmarkStart w:id="38" w:name="communication"/>
     <w:p>
       <w:pPr>
         <w:pStyle w:val="Heading2"/>
@@ -2213,8 +2244,8 @@
         <w:t xml:space="preserve">Canvas Inbox is our channel — for everything. I don’t use email during the term, so if you send a Clark email, expect it to go unanswered; message me through Canvas Inbox instead. I respond within 24 hours on weekdays.</w:t>
       </w:r>
     </w:p>
-    <w:bookmarkEnd w:id="37"/>
-    <w:bookmarkStart w:id="38" w:name="citing-your-sources"/>
+    <w:bookmarkEnd w:id="38"/>
+    <w:bookmarkStart w:id="40" w:name="citing-your-sources"/>
     <w:p>
       <w:pPr>
         <w:pStyle w:val="Heading2"/>
@@ -2228,11 +2259,28 @@
         <w:pStyle w:val="FirstParagraph"/>
       </w:pPr>
       <w:r>
-        <w:t xml:space="preserve">Use a citation to credit ANY source of information used in your work, be it a website, image, or content that YOU did not come up with. Yes, it’s a pain, but it helps when posting content for others who need to trust and rely on it. To avoid plagiarism (when you intentionally or unintentionally present someone else’s work as your own), you will need to signal that you are referencing outside material and give credit. Clark College Libraries’ plagiarism guide is a handy resource for learning about what plagiarism is and how to avoid it. I am here if you have questions about how to correctly cite outside information in your work.</w:t>
-      </w:r>
-    </w:p>
-    <w:bookmarkEnd w:id="38"/>
-    <w:bookmarkStart w:id="42" w:name="X557e592dac108a6d1044d97136f1b079f25201c"/>
+        <w:t xml:space="preserve">Use a citation to credit ANY source of information used in your work, be it a website, image, or content that YOU did not come up with. Yes, it’s a pain, but it helps when posting content for others who need to trust and rely on it. To avoid plagiarism (when you intentionally or unintentionally present someone else’s work as your own), you will need to signal that you are referencing outside material and give credit.</w:t>
+      </w:r>
+      <w:r>
+        <w:t xml:space="preserve"> </w:t>
+      </w:r>
+      <w:hyperlink r:id="rId39">
+        <w:r>
+          <w:rPr>
+            <w:rStyle w:val="Hyperlink"/>
+          </w:rPr>
+          <w:t xml:space="preserve">Clark College Libraries’ plagiarism guide</w:t>
+        </w:r>
+      </w:hyperlink>
+      <w:r>
+        <w:t xml:space="preserve"> </w:t>
+      </w:r>
+      <w:r>
+        <w:t xml:space="preserve">is a handy resource for learning about what plagiarism is and how to avoid it. I am here if you have questions about how to correctly cite outside information in your work.</w:t>
+      </w:r>
+    </w:p>
+    <w:bookmarkEnd w:id="40"/>
+    <w:bookmarkStart w:id="44" w:name="X557e592dac108a6d1044d97136f1b079f25201c"/>
     <w:p>
       <w:pPr>
         <w:pStyle w:val="Heading2"/>
@@ -2285,7 +2333,7 @@
         <w:t xml:space="preserve">The 3-2-1 format, OOL posts, and Team Lead summaries all require your own reasoning, in your own words. AI-generated discussion content will not receive credit, whether declared or not.</w:t>
       </w:r>
     </w:p>
-    <w:bookmarkStart w:id="39" w:name="four-principles"/>
+    <w:bookmarkStart w:id="41" w:name="four-principles"/>
     <w:p>
       <w:pPr>
         <w:pStyle w:val="Heading3"/>
@@ -2400,8 +2448,8 @@
         <w:t xml:space="preserve">at the end of your lab answer or ALEKS work.</w:t>
       </w:r>
     </w:p>
-    <w:bookmarkEnd w:id="39"/>
-    <w:bookmarkStart w:id="40" w:name="by-assignment"/>
+    <w:bookmarkEnd w:id="41"/>
+    <w:bookmarkStart w:id="42" w:name="by-assignment"/>
     <w:p>
       <w:pPr>
         <w:pStyle w:val="Heading3"/>
@@ -2498,8 +2546,8 @@
         <w:t xml:space="preserve">— No AI allowed, at any level.</w:t>
       </w:r>
     </w:p>
-    <w:bookmarkEnd w:id="40"/>
-    <w:bookmarkStart w:id="41" w:name="follow-up"/>
+    <w:bookmarkEnd w:id="42"/>
+    <w:bookmarkStart w:id="43" w:name="follow-up"/>
     <w:p>
       <w:pPr>
         <w:pStyle w:val="Heading3"/>
@@ -2604,9 +2652,9 @@
         <w:t xml:space="preserve">You’re entering health careers where accuracy and integrity matter. AI is here to stay — but how you use it says everything about your professionalism. Own it, declare it, and use it to grow.</w:t>
       </w:r>
     </w:p>
-    <w:bookmarkEnd w:id="41"/>
-    <w:bookmarkEnd w:id="42"/>
-    <w:bookmarkStart w:id="43" w:name="classroom-norms"/>
+    <w:bookmarkEnd w:id="43"/>
+    <w:bookmarkEnd w:id="44"/>
+    <w:bookmarkStart w:id="45" w:name="classroom-norms"/>
     <w:p>
       <w:pPr>
         <w:pStyle w:val="Heading2"/>
@@ -2701,9 +2749,9 @@
         <w:t xml:space="preserve">”</w:t>
       </w:r>
     </w:p>
-    <w:bookmarkEnd w:id="43"/>
-    <w:bookmarkEnd w:id="44"/>
-    <w:bookmarkStart w:id="45" w:name="X762e0c562ca86535819c7c15adbe8dbe270c6b6"/>
+    <w:bookmarkEnd w:id="45"/>
+    <w:bookmarkEnd w:id="46"/>
+    <w:bookmarkStart w:id="47" w:name="X762e0c562ca86535819c7c15adbe8dbe270c6b6"/>
     <w:p>
       <w:pPr>
         <w:pStyle w:val="Heading1"/>
@@ -2824,8 +2872,8 @@
         <w:t xml:space="preserve">These outcomes are measured through your weekly 3-2-1 Team Discussions, lab reports (Results &amp; Analysis and Discussion &amp; Conclusions), in-lab quizzes, and the Final TYC Project. Rubrics for each are posted in the relevant Canvas module.</w:t>
       </w:r>
     </w:p>
-    <w:bookmarkEnd w:id="45"/>
-    <w:bookmarkStart w:id="52" w:name="how-will-i-be-graded-and-why"/>
+    <w:bookmarkEnd w:id="47"/>
+    <w:bookmarkStart w:id="54" w:name="how-will-i-be-graded-and-why"/>
     <w:p>
       <w:pPr>
         <w:pStyle w:val="Heading1"/>
@@ -2872,7 +2920,7 @@
         <w:t xml:space="preserve">)</w:t>
       </w:r>
     </w:p>
-    <w:bookmarkStart w:id="46" w:name="Xdd0719f115f2bfe56e3e892841df085ef5ba506"/>
+    <w:bookmarkStart w:id="48" w:name="Xdd0719f115f2bfe56e3e892841df085ef5ba506"/>
     <w:p>
       <w:pPr>
         <w:pStyle w:val="Heading2"/>
@@ -3133,8 +3181,8 @@
         </w:tc>
       </w:tr>
     </w:tbl>
-    <w:bookmarkEnd w:id="46"/>
-    <w:bookmarkStart w:id="47" w:name="about-the-lab-requirement"/>
+    <w:bookmarkEnd w:id="48"/>
+    <w:bookmarkStart w:id="49" w:name="about-the-lab-requirement"/>
     <w:p>
       <w:pPr>
         <w:pStyle w:val="Heading2"/>
@@ -3205,8 +3253,8 @@
         <w:t xml:space="preserve">toward your credit-hour requirement if you don’t attend/submit it, or if it scores below 60%. You cannot miss more than about two labs and still earn the lab credit for this course.</w:t>
       </w:r>
     </w:p>
-    <w:bookmarkEnd w:id="47"/>
-    <w:bookmarkStart w:id="48" w:name="grading-scale"/>
+    <w:bookmarkEnd w:id="49"/>
+    <w:bookmarkStart w:id="50" w:name="grading-scale"/>
     <w:p>
       <w:pPr>
         <w:pStyle w:val="Heading2"/>
@@ -3538,8 +3586,8 @@
         </w:tc>
       </w:tr>
     </w:tbl>
-    <w:bookmarkEnd w:id="48"/>
-    <w:bookmarkStart w:id="49" w:name="late-work"/>
+    <w:bookmarkEnd w:id="50"/>
+    <w:bookmarkStart w:id="51" w:name="late-work"/>
     <w:p>
       <w:pPr>
         <w:pStyle w:val="Heading2"/>
@@ -3604,8 +3652,8 @@
         <w:t xml:space="preserve">If something requiring a prolonged absence occurs, contact me via Canvas Inbox and let’s see what solutions are possible.</w:t>
       </w:r>
     </w:p>
-    <w:bookmarkEnd w:id="49"/>
-    <w:bookmarkStart w:id="50" w:name="feedback"/>
+    <w:bookmarkEnd w:id="51"/>
+    <w:bookmarkStart w:id="52" w:name="feedback"/>
     <w:p>
       <w:pPr>
         <w:pStyle w:val="Heading2"/>
@@ -3622,8 +3670,8 @@
         <w:t xml:space="preserve">Discussions and other work are graded within 48 hours of each due date.</w:t>
       </w:r>
     </w:p>
-    <w:bookmarkEnd w:id="50"/>
-    <w:bookmarkStart w:id="51" w:name="revision"/>
+    <w:bookmarkEnd w:id="52"/>
+    <w:bookmarkStart w:id="53" w:name="revision"/>
     <w:p>
       <w:pPr>
         <w:pStyle w:val="Heading2"/>
@@ -3640,9 +3688,9 @@
         <w:t xml:space="preserve">There is no separate revision or regrade policy at this time — the late-work window above functions as the built-in opportunity to catch up before work is scored.</w:t>
       </w:r>
     </w:p>
-    <w:bookmarkEnd w:id="51"/>
-    <w:bookmarkEnd w:id="52"/>
-    <w:bookmarkStart w:id="80" w:name="Xc43a7a922298ad0f9db64bde08ef36f42168a56"/>
+    <w:bookmarkEnd w:id="53"/>
+    <w:bookmarkEnd w:id="54"/>
+    <w:bookmarkStart w:id="86" w:name="Xc43a7a922298ad0f9db64bde08ef36f42168a56"/>
     <w:p>
       <w:pPr>
         <w:pStyle w:val="Heading1"/>
@@ -3669,7 +3717,7 @@
         <w:t xml:space="preserve">Tech Hub for Canvas/software problems, Tutoring or Librarians for coursework help, Basic Needs Hub if life is making this term hard.</w:t>
       </w:r>
     </w:p>
-    <w:bookmarkStart w:id="56" w:name="technical-support"/>
+    <w:bookmarkStart w:id="60" w:name="technical-support"/>
     <w:p>
       <w:pPr>
         <w:pStyle w:val="Heading2"/>
@@ -3726,7 +3774,7 @@
               <w:pStyle w:val="Compact"/>
               <w:jc w:val="left"/>
             </w:pPr>
-            <w:hyperlink r:id="rId53">
+            <w:hyperlink r:id="rId55">
               <w:r>
                 <w:rPr>
                   <w:rStyle w:val="Hyperlink"/>
@@ -3746,12 +3794,29 @@
               <w:jc w:val="left"/>
             </w:pPr>
             <w:r>
-              <w:t xml:space="preserve">Canvas, software, or account trouble — Scarpelli Hall 135 ·</w:t>
+              <w:t xml:space="preserve">Canvas, software, or account trouble —</w:t>
             </w:r>
             <w:r>
               <w:t xml:space="preserve"> </w:t>
             </w:r>
-            <w:hyperlink r:id="rId54">
+            <w:hyperlink r:id="rId56">
+              <w:r>
+                <w:rPr>
+                  <w:rStyle w:val="Hyperlink"/>
+                </w:rPr>
+                <w:t xml:space="preserve">Scarpelli Hall 135</w:t>
+              </w:r>
+            </w:hyperlink>
+            <w:r>
+              <w:t xml:space="preserve"> </w:t>
+            </w:r>
+            <w:r>
+              <w:t xml:space="preserve">·</w:t>
+            </w:r>
+            <w:r>
+              <w:t xml:space="preserve"> </w:t>
+            </w:r>
+            <w:hyperlink r:id="rId57">
               <w:r>
                 <w:rPr>
                   <w:rStyle w:val="Hyperlink"/>
@@ -3816,12 +3881,29 @@
             <w:r>
               <w:t xml:space="preserve"> </w:t>
             </w:r>
-            <w:hyperlink r:id="rId55">
+            <w:hyperlink r:id="rId58">
               <w:r>
                 <w:rPr>
                   <w:rStyle w:val="Hyperlink"/>
                 </w:rPr>
-                <w:t xml:space="preserve">Canvas Student Guide</w:t>
+                <w:t xml:space="preserve">Canvas Guides</w:t>
+              </w:r>
+            </w:hyperlink>
+            <w:r>
+              <w:t xml:space="preserve"> </w:t>
+            </w:r>
+            <w:r>
+              <w:t xml:space="preserve">·</w:t>
+            </w:r>
+            <w:r>
+              <w:t xml:space="preserve"> </w:t>
+            </w:r>
+            <w:hyperlink r:id="rId59">
+              <w:r>
+                <w:rPr>
+                  <w:rStyle w:val="Hyperlink"/>
+                </w:rPr>
+                <w:t xml:space="preserve">Student Guide</w:t>
               </w:r>
             </w:hyperlink>
           </w:p>
@@ -3858,8 +3940,8 @@
         </w:tc>
       </w:tr>
     </w:tbl>
-    <w:bookmarkEnd w:id="56"/>
-    <w:bookmarkStart w:id="62" w:name="academic-support"/>
+    <w:bookmarkEnd w:id="60"/>
+    <w:bookmarkStart w:id="67" w:name="academic-support"/>
     <w:p>
       <w:pPr>
         <w:pStyle w:val="Heading2"/>
@@ -3916,7 +3998,7 @@
               <w:pStyle w:val="Compact"/>
               <w:jc w:val="left"/>
             </w:pPr>
-            <w:hyperlink r:id="rId57">
+            <w:hyperlink r:id="rId61">
               <w:r>
                 <w:rPr>
                   <w:rStyle w:val="Hyperlink"/>
@@ -3949,7 +4031,7 @@
               <w:pStyle w:val="Compact"/>
               <w:jc w:val="left"/>
             </w:pPr>
-            <w:hyperlink r:id="rId58">
+            <w:hyperlink r:id="rId62">
               <w:r>
                 <w:rPr>
                   <w:rStyle w:val="Hyperlink"/>
@@ -3969,12 +4051,29 @@
               <w:jc w:val="left"/>
             </w:pPr>
             <w:r>
-              <w:t xml:space="preserve">In-person and virtual tutoring via Zoom;</w:t>
+              <w:t xml:space="preserve">In-person and virtual tutoring via Zoom; see the</w:t>
             </w:r>
             <w:r>
               <w:t xml:space="preserve"> </w:t>
             </w:r>
-            <w:hyperlink r:id="rId59">
+            <w:hyperlink r:id="rId63">
+              <w:r>
+                <w:rPr>
+                  <w:rStyle w:val="Hyperlink"/>
+                </w:rPr>
+                <w:t xml:space="preserve">Virtual Tutoring Center</w:t>
+              </w:r>
+            </w:hyperlink>
+            <w:r>
+              <w:t xml:space="preserve"> </w:t>
+            </w:r>
+            <w:r>
+              <w:t xml:space="preserve">Canvas course;</w:t>
+            </w:r>
+            <w:r>
+              <w:t xml:space="preserve"> </w:t>
+            </w:r>
+            <w:hyperlink r:id="rId64">
               <w:r>
                 <w:rPr>
                   <w:rStyle w:val="Hyperlink"/>
@@ -3999,7 +4098,7 @@
               <w:pStyle w:val="Compact"/>
               <w:jc w:val="left"/>
             </w:pPr>
-            <w:hyperlink r:id="rId60">
+            <w:hyperlink r:id="rId65">
               <w:r>
                 <w:rPr>
                   <w:rStyle w:val="Hyperlink"/>
@@ -4024,7 +4123,7 @@
             <w:r>
               <w:t xml:space="preserve"> </w:t>
             </w:r>
-            <w:hyperlink r:id="rId61">
+            <w:hyperlink r:id="rId66">
               <w:r>
                 <w:rPr>
                   <w:rStyle w:val="Hyperlink"/>
@@ -4039,8 +4138,8 @@
         </w:tc>
       </w:tr>
     </w:tbl>
-    <w:bookmarkEnd w:id="62"/>
-    <w:bookmarkStart w:id="79" w:name="student-support"/>
+    <w:bookmarkEnd w:id="67"/>
+    <w:bookmarkStart w:id="85" w:name="student-support"/>
     <w:p>
       <w:pPr>
         <w:pStyle w:val="Heading2"/>
@@ -4097,7 +4196,7 @@
               <w:pStyle w:val="Compact"/>
               <w:jc w:val="left"/>
             </w:pPr>
-            <w:hyperlink r:id="rId63">
+            <w:hyperlink r:id="rId68">
               <w:r>
                 <w:rPr>
                   <w:rStyle w:val="Hyperlink"/>
@@ -4130,7 +4229,7 @@
               <w:pStyle w:val="Compact"/>
               <w:jc w:val="left"/>
             </w:pPr>
-            <w:hyperlink r:id="rId64">
+            <w:hyperlink r:id="rId69">
               <w:r>
                 <w:rPr>
                   <w:rStyle w:val="Hyperlink"/>
@@ -4155,7 +4254,7 @@
             <w:r>
               <w:t xml:space="preserve"> </w:t>
             </w:r>
-            <w:hyperlink r:id="rId65">
+            <w:hyperlink r:id="rId70">
               <w:r>
                 <w:rPr>
                   <w:rStyle w:val="Hyperlink"/>
@@ -4180,7 +4279,7 @@
               <w:pStyle w:val="Compact"/>
               <w:jc w:val="left"/>
             </w:pPr>
-            <w:hyperlink r:id="rId66">
+            <w:hyperlink r:id="rId71">
               <w:r>
                 <w:rPr>
                   <w:rStyle w:val="Hyperlink"/>
@@ -4202,7 +4301,7 @@
             <w:r>
               <w:t xml:space="preserve">Monthly pre-packaged food boxes. Contact Cath Busha, Dean of Student Engagement (</w:t>
             </w:r>
-            <w:hyperlink r:id="rId67">
+            <w:hyperlink r:id="rId72">
               <w:r>
                 <w:rPr>
                   <w:rStyle w:val="Hyperlink"/>
@@ -4224,7 +4323,7 @@
               <w:pStyle w:val="Compact"/>
               <w:jc w:val="left"/>
             </w:pPr>
-            <w:hyperlink r:id="rId68">
+            <w:hyperlink r:id="rId73">
               <w:r>
                 <w:rPr>
                   <w:rStyle w:val="Hyperlink"/>
@@ -4249,7 +4348,7 @@
             <w:r>
               <w:t xml:space="preserve"> </w:t>
             </w:r>
-            <w:hyperlink r:id="rId69">
+            <w:hyperlink r:id="rId74">
               <w:r>
                 <w:rPr>
                   <w:rStyle w:val="Hyperlink"/>
@@ -4271,7 +4370,7 @@
               <w:pStyle w:val="Compact"/>
               <w:jc w:val="left"/>
             </w:pPr>
-            <w:hyperlink r:id="rId70">
+            <w:hyperlink r:id="rId75">
               <w:r>
                 <w:rPr>
                   <w:rStyle w:val="Hyperlink"/>
@@ -4296,7 +4395,7 @@
             <w:r>
               <w:t xml:space="preserve"> </w:t>
             </w:r>
-            <w:hyperlink r:id="rId71">
+            <w:hyperlink r:id="rId76">
               <w:r>
                 <w:rPr>
                   <w:rStyle w:val="Hyperlink"/>
@@ -4318,7 +4417,7 @@
               <w:pStyle w:val="Compact"/>
               <w:jc w:val="left"/>
             </w:pPr>
-            <w:hyperlink r:id="rId72">
+            <w:hyperlink r:id="rId77">
               <w:r>
                 <w:rPr>
                   <w:rStyle w:val="Hyperlink"/>
@@ -4343,7 +4442,7 @@
             <w:r>
               <w:t xml:space="preserve"> </w:t>
             </w:r>
-            <w:hyperlink r:id="rId73">
+            <w:hyperlink r:id="rId78">
               <w:r>
                 <w:rPr>
                   <w:rStyle w:val="Hyperlink"/>
@@ -4362,7 +4461,7 @@
               <w:pStyle w:val="Compact"/>
               <w:jc w:val="left"/>
             </w:pPr>
-            <w:hyperlink r:id="rId74">
+            <w:hyperlink r:id="rId79">
               <w:r>
                 <w:rPr>
                   <w:rStyle w:val="Hyperlink"/>
@@ -4382,12 +4481,29 @@
               <w:jc w:val="left"/>
             </w:pPr>
             <w:r>
-              <w:t xml:space="preserve">Resources, community, and support for U.S. military service members. PUB 015 · 360-992-2073 ·</w:t>
+              <w:t xml:space="preserve">Resources, community, and support for U.S. military service members.</w:t>
             </w:r>
             <w:r>
               <w:t xml:space="preserve"> </w:t>
             </w:r>
-            <w:hyperlink r:id="rId75">
+            <w:hyperlink r:id="rId80">
+              <w:r>
+                <w:rPr>
+                  <w:rStyle w:val="Hyperlink"/>
+                </w:rPr>
+                <w:t xml:space="preserve">PUB 015</w:t>
+              </w:r>
+            </w:hyperlink>
+            <w:r>
+              <w:t xml:space="preserve"> </w:t>
+            </w:r>
+            <w:r>
+              <w:t xml:space="preserve">· 360-992-2073 ·</w:t>
+            </w:r>
+            <w:r>
+              <w:t xml:space="preserve"> </w:t>
+            </w:r>
+            <w:hyperlink r:id="rId81">
               <w:r>
                 <w:rPr>
                   <w:rStyle w:val="Hyperlink"/>
@@ -4409,7 +4525,7 @@
       <w:r>
         <w:t xml:space="preserve"> </w:t>
       </w:r>
-      <w:hyperlink r:id="rId35">
+      <w:hyperlink r:id="rId36">
         <w:r>
           <w:rPr>
             <w:rStyle w:val="Hyperlink"/>
@@ -4423,7 +4539,7 @@
       <w:r>
         <w:t xml:space="preserve"> </w:t>
       </w:r>
-      <w:hyperlink r:id="rId76">
+      <w:hyperlink r:id="rId82">
         <w:r>
           <w:rPr>
             <w:rStyle w:val="Hyperlink"/>
@@ -4437,7 +4553,7 @@
       <w:r>
         <w:t xml:space="preserve"> </w:t>
       </w:r>
-      <w:hyperlink r:id="rId77">
+      <w:hyperlink r:id="rId83">
         <w:r>
           <w:rPr>
             <w:rStyle w:val="Hyperlink"/>
@@ -4451,7 +4567,7 @@
       <w:r>
         <w:t xml:space="preserve"> </w:t>
       </w:r>
-      <w:hyperlink r:id="rId78">
+      <w:hyperlink r:id="rId84">
         <w:r>
           <w:rPr>
             <w:rStyle w:val="Hyperlink"/>
@@ -4463,9 +4579,9 @@
         <w:t xml:space="preserve">.</w:t>
       </w:r>
     </w:p>
-    <w:bookmarkEnd w:id="79"/>
-    <w:bookmarkEnd w:id="80"/>
-    <w:bookmarkStart w:id="81" w:name="how-should-i-get-started-in-class"/>
+    <w:bookmarkEnd w:id="85"/>
+    <w:bookmarkEnd w:id="86"/>
+    <w:bookmarkStart w:id="87" w:name="how-should-i-get-started-in-class"/>
     <w:p>
       <w:pPr>
         <w:pStyle w:val="Heading1"/>
@@ -4482,8 +4598,8 @@
         <w:t xml:space="preserve">See Your First Week, near the top of this syllabus, for the exact five things to do before anything else.</w:t>
       </w:r>
     </w:p>
-    <w:bookmarkEnd w:id="81"/>
-    <w:bookmarkStart w:id="95" w:name="appendix-official-college-policies"/>
+    <w:bookmarkEnd w:id="87"/>
+    <w:bookmarkStart w:id="101" w:name="appendix-official-college-policies"/>
     <w:p>
       <w:pPr>
         <w:pStyle w:val="Heading1"/>
@@ -4500,7 +4616,7 @@
         <w:t xml:space="preserve">Everything below is required Clark College policy language, included in full because it has to be — not because it’s what this course is about. A TL;DR sits above each one so you can get the gist and move on, or dig into the full text if it applies to you.</w:t>
       </w:r>
     </w:p>
-    <w:bookmarkStart w:id="85" w:name="ada-accommodations"/>
+    <w:bookmarkStart w:id="91" w:name="ada-accommodations"/>
     <w:p>
       <w:pPr>
         <w:pStyle w:val="Heading2"/>
@@ -4537,7 +4653,7 @@
       <w:r>
         <w:t xml:space="preserve"> </w:t>
       </w:r>
-      <w:hyperlink r:id="rId28">
+      <w:hyperlink r:id="rId29">
         <w:r>
           <w:rPr>
             <w:rStyle w:val="Hyperlink"/>
@@ -4575,7 +4691,7 @@
       <w:r>
         <w:t xml:space="preserve"> </w:t>
       </w:r>
-      <w:hyperlink r:id="rId82">
+      <w:hyperlink r:id="rId88">
         <w:r>
           <w:rPr>
             <w:rStyle w:val="Hyperlink"/>
@@ -4609,7 +4725,7 @@
       <w:r>
         <w:t xml:space="preserve"> </w:t>
       </w:r>
-      <w:hyperlink r:id="rId83">
+      <w:hyperlink r:id="rId89">
         <w:r>
           <w:rPr>
             <w:rStyle w:val="Hyperlink"/>
@@ -4623,7 +4739,7 @@
       <w:r>
         <w:t xml:space="preserve"> </w:t>
       </w:r>
-      <w:hyperlink r:id="rId83">
+      <w:hyperlink r:id="rId89">
         <w:r>
           <w:rPr>
             <w:rStyle w:val="Hyperlink"/>
@@ -4640,7 +4756,7 @@
       <w:r>
         <w:t xml:space="preserve"> </w:t>
       </w:r>
-      <w:hyperlink r:id="rId84">
+      <w:hyperlink r:id="rId90">
         <w:r>
           <w:rPr>
             <w:rStyle w:val="Hyperlink"/>
@@ -4663,8 +4779,8 @@
         <w:t xml:space="preserve">Once you have established accommodations with Disability Access Center, please contact me as your instructor to discuss your needs in this course.</w:t>
       </w:r>
     </w:p>
-    <w:bookmarkEnd w:id="85"/>
-    <w:bookmarkStart w:id="87" w:name="non-discrimination-policy"/>
+    <w:bookmarkEnd w:id="91"/>
+    <w:bookmarkStart w:id="93" w:name="non-discrimination-policy"/>
     <w:p>
       <w:pPr>
         <w:pStyle w:val="Heading2"/>
@@ -4709,7 +4825,7 @@
       <w:r>
         <w:t xml:space="preserve"> </w:t>
       </w:r>
-      <w:hyperlink r:id="rId86">
+      <w:hyperlink r:id="rId92">
         <w:r>
           <w:rPr>
             <w:rStyle w:val="Hyperlink"/>
@@ -4718,8 +4834,8 @@
         </w:r>
       </w:hyperlink>
     </w:p>
-    <w:bookmarkEnd w:id="87"/>
-    <w:bookmarkStart w:id="92" w:name="title-ix-and-sexual-misconduct"/>
+    <w:bookmarkEnd w:id="93"/>
+    <w:bookmarkStart w:id="98" w:name="title-ix-and-sexual-misconduct"/>
     <w:p>
       <w:pPr>
         <w:pStyle w:val="Heading2"/>
@@ -4800,7 +4916,7 @@
       <w:r>
         <w:t xml:space="preserve"> </w:t>
       </w:r>
-      <w:hyperlink r:id="rId88">
+      <w:hyperlink r:id="rId94">
         <w:r>
           <w:rPr>
             <w:rStyle w:val="Hyperlink"/>
@@ -4814,7 +4930,7 @@
       <w:r>
         <w:t xml:space="preserve"> </w:t>
       </w:r>
-      <w:hyperlink r:id="rId89">
+      <w:hyperlink r:id="rId95">
         <w:r>
           <w:rPr>
             <w:rStyle w:val="Hyperlink"/>
@@ -4828,7 +4944,7 @@
       <w:r>
         <w:t xml:space="preserve"> </w:t>
       </w:r>
-      <w:hyperlink r:id="rId90">
+      <w:hyperlink r:id="rId96">
         <w:r>
           <w:rPr>
             <w:rStyle w:val="Hyperlink"/>
@@ -4842,7 +4958,7 @@
       <w:r>
         <w:t xml:space="preserve"> </w:t>
       </w:r>
-      <w:hyperlink r:id="rId91">
+      <w:hyperlink r:id="rId97">
         <w:r>
           <w:rPr>
             <w:rStyle w:val="Hyperlink"/>
@@ -4856,7 +4972,7 @@
       <w:r>
         <w:t xml:space="preserve"> </w:t>
       </w:r>
-      <w:hyperlink r:id="rId63">
+      <w:hyperlink r:id="rId68">
         <w:r>
           <w:rPr>
             <w:rStyle w:val="Hyperlink"/>
@@ -4871,8 +4987,8 @@
         <w:t xml:space="preserve">if you would like to pursue counseling.</w:t>
       </w:r>
     </w:p>
-    <w:bookmarkEnd w:id="92"/>
-    <w:bookmarkStart w:id="94" w:name="student-rights-and-responsibilities"/>
+    <w:bookmarkEnd w:id="98"/>
+    <w:bookmarkStart w:id="100" w:name="student-rights-and-responsibilities"/>
     <w:p>
       <w:pPr>
         <w:pStyle w:val="Heading2"/>
@@ -4909,7 +5025,7 @@
       <w:r>
         <w:t xml:space="preserve"> </w:t>
       </w:r>
-      <w:hyperlink r:id="rId93">
+      <w:hyperlink r:id="rId99">
         <w:r>
           <w:rPr>
             <w:rStyle w:val="Hyperlink"/>
@@ -4921,8 +5037,8 @@
         <w:t xml:space="preserve">, you can find information about freedom of access to education, student absence for reasons of faith or conscience, FERPA, emergency and health information, etc. Please get in touch if you would like to discuss absences for reasons of faith. I am here to support you.</w:t>
       </w:r>
     </w:p>
-    <w:bookmarkEnd w:id="94"/>
-    <w:bookmarkEnd w:id="95"/>
+    <w:bookmarkEnd w:id="100"/>
+    <w:bookmarkEnd w:id="101"/>
     <w:sectPr/>
   </w:body>
 </w:document>

</xml_diff>

<commit_message>
Rewrite CHEM131 What's Covered to Fall 2026 week schedule, revise CHEM131 syllabus tone
- content/chem131-whatscovered.md: same module -> Fall 2026 Chemfolio
  week-schedule rewrite already applied to CHEM121
- content/chem131.md: revised hybrid-format TL;DR, welcome message,
  and Dr. B's Note to set clearer expectations for a level-two course;
  course description reframed around building past the CHEM121
  foundation rather than assuming it
- content/chem121.md + chem131.md: merged duplicate privacy/
  accessibility rows into one, tightened DAC accommodations wording
- Regenerated all downloads/ outputs locally

Co-Authored-By: Claude Sonnet 5 <noreply@anthropic.com>
</commit_message>
<xml_diff>
--- a/downloads/CHEM121_Syllabus_Fall2026.docx
+++ b/downloads/CHEM121_Syllabus_Fall2026.docx
@@ -1937,7 +1937,7 @@
                 <w:b/>
                 <w:bCs/>
               </w:rPr>
-              <w:t xml:space="preserve">Privacy related to course tools and materials</w:t>
+              <w:t xml:space="preserve">Privacy &amp; accessibility for course tools and materials</w:t>
             </w:r>
           </w:p>
         </w:tc>
@@ -1966,51 +1966,6 @@
             </w:r>
             <w:r>
               <w:t xml:space="preserve">for Canvas, ALEKS, and other tools used in this course.</w:t>
-            </w:r>
-          </w:p>
-        </w:tc>
-      </w:tr>
-      <w:tr>
-        <w:tc>
-          <w:tcPr/>
-          <w:p>
-            <w:pPr>
-              <w:pStyle w:val="Compact"/>
-            </w:pPr>
-            <w:r>
-              <w:rPr>
-                <w:b/>
-                <w:bCs/>
-              </w:rPr>
-              <w:t xml:space="preserve">Accessibility related to course tools and materials</w:t>
-            </w:r>
-          </w:p>
-        </w:tc>
-        <w:tc>
-          <w:tcPr/>
-          <w:p>
-            <w:pPr>
-              <w:pStyle w:val="Compact"/>
-            </w:pPr>
-            <w:r>
-              <w:t xml:space="preserve">See Clark’s</w:t>
-            </w:r>
-            <w:r>
-              <w:t xml:space="preserve"> </w:t>
-            </w:r>
-            <w:hyperlink r:id="rId24">
-              <w:r>
-                <w:rPr>
-                  <w:rStyle w:val="Hyperlink"/>
-                </w:rPr>
-                <w:t xml:space="preserve">eLearning accessibility and privacy policies page</w:t>
-              </w:r>
-            </w:hyperlink>
-            <w:r>
-              <w:t xml:space="preserve"> </w:t>
-            </w:r>
-            <w:r>
-              <w:t xml:space="preserve">for accessibility statements on Canvas, ALEKS, and other course tools.</w:t>
             </w:r>
           </w:p>
         </w:tc>
@@ -4473,28 +4428,14 @@
           <w:rPr>
             <w:rStyle w:val="Hyperlink"/>
           </w:rPr>
-          <w:t xml:space="preserve">request them every term in myAccess</w:t>
+          <w:t xml:space="preserve">request them every term and schedule your own exams in myAccess</w:t>
         </w:r>
       </w:hyperlink>
       <w:r>
-        <w:t xml:space="preserve">. Students who need to test at DAC also need to</w:t>
-      </w:r>
-      <w:r>
         <w:t xml:space="preserve"> </w:t>
       </w:r>
-      <w:hyperlink r:id="rId78">
-        <w:r>
-          <w:rPr>
-            <w:rStyle w:val="Hyperlink"/>
-          </w:rPr>
-          <w:t xml:space="preserve">schedule their own exams in myAccess</w:t>
-        </w:r>
-      </w:hyperlink>
-      <w:r>
-        <w:t xml:space="preserve"> </w:t>
-      </w:r>
-      <w:r>
-        <w:t xml:space="preserve">or by contacting DAC. Exams should be scheduled with DAC with at least 5 business days’ notice. Please reach out to</w:t>
+      <w:r>
+        <w:t xml:space="preserve">— or by contacting DAC. Exams should be scheduled with DAC with at least 5 business days’ notice. Please reach out to</w:t>
       </w:r>
       <w:r>
         <w:t xml:space="preserve"> </w:t>

</xml_diff>

<commit_message>
Fix Weekly Flow schedule errors caught in review
- Weekly deadline cadence corrected from Tuesday-Sunday to the actual
  Wednesday-Sunday pattern, with due items and point values matched
  to the right day (3-2-1 posts, OOL, lab sections, ALEKS)
- CHEM121 quiz weeks corrected: 2, 5, 7, 9, 11 (was 3, 5, 6, 9, 11)
- CHEM131 quiz weeks corrected: 4, 6, 8, 10 (Week 10 carries both
  Quiz 4 and Quiz 5, the merged final content week) — previously
  incorrectly mirrored CHEM121's schedule
- Added a maintenance comment in both What's Covered files explaining
  why the final unit stays labeled "Week 10" across terms even though
  Fall's calendar merges two weeks into it (Thanksgiving)
- Regenerated all downloads/ outputs locally

Co-Authored-By: Claude Sonnet 5 <noreply@anthropic.com>
</commit_message>
<xml_diff>
--- a/downloads/CHEM121_Syllabus_Fall2026.docx
+++ b/downloads/CHEM121_Syllabus_Fall2026.docx
@@ -188,7 +188,7 @@
               <w:pStyle w:val="Compact"/>
             </w:pPr>
             <w:r>
-              <w:t xml:space="preserve">Tuesday through Sunday each carry something — see Weekly Flow below for the exact rhythm. Once you learn it, it repeats every module.</w:t>
+              <w:t xml:space="preserve">Wednesday through Sunday each carry something — see Weekly Flow below for the exact rhythm. Once you learn it, it repeats every module.</w:t>
             </w:r>
           </w:p>
         </w:tc>
@@ -1209,7 +1209,7 @@
         <w:t xml:space="preserve"> </w:t>
       </w:r>
       <w:r>
-        <w:t xml:space="preserve">Something is due nearly every day, Tuesday through Sunday — same pattern every week once you learn it.</w:t>
+        <w:t xml:space="preserve">Something is due nearly every day, Wednesday through Sunday — same pattern every week once you learn it.</w:t>
       </w:r>
     </w:p>
     <w:p>
@@ -1290,30 +1290,6 @@
               <w:pStyle w:val="Compact"/>
             </w:pPr>
             <w:r>
-              <w:t xml:space="preserve">Tuesday</w:t>
-            </w:r>
-          </w:p>
-        </w:tc>
-        <w:tc>
-          <w:tcPr/>
-          <w:p>
-            <w:pPr>
-              <w:pStyle w:val="Compact"/>
-            </w:pPr>
-            <w:r>
-              <w:t xml:space="preserve">OOL (Outside Of Lecture) discussion post due</w:t>
-            </w:r>
-          </w:p>
-        </w:tc>
-      </w:tr>
-      <w:tr>
-        <w:tc>
-          <w:tcPr/>
-          <w:p>
-            <w:pPr>
-              <w:pStyle w:val="Compact"/>
-            </w:pPr>
-            <w:r>
               <w:t xml:space="preserve">Wednesday</w:t>
             </w:r>
           </w:p>
@@ -1325,7 +1301,7 @@
               <w:pStyle w:val="Compact"/>
             </w:pPr>
             <w:r>
-              <w:t xml:space="preserve">First 3-2-1 Team discussion post due</w:t>
+              <w:t xml:space="preserve">3-2-1 Team post + upload due; OOL discussion post due</w:t>
             </w:r>
           </w:p>
         </w:tc>
@@ -1349,7 +1325,7 @@
               <w:pStyle w:val="Compact"/>
             </w:pPr>
             <w:r>
-              <w:t xml:space="preserve">OOL replies due</w:t>
+              <w:t xml:space="preserve">3-2-1 Team Lead post due</w:t>
             </w:r>
           </w:p>
         </w:tc>
@@ -1373,7 +1349,7 @@
               <w:pStyle w:val="Compact"/>
             </w:pPr>
             <w:r>
-              <w:t xml:space="preserve">Lab Intro upload due</w:t>
+              <w:t xml:space="preserve">OOL replies due; Lab Results (20 pts), Findings (10 pts), and Conclusions (20 pts) due</w:t>
             </w:r>
           </w:p>
         </w:tc>
@@ -1397,7 +1373,7 @@
               <w:pStyle w:val="Compact"/>
             </w:pPr>
             <w:r>
-              <w:t xml:space="preserve">Second 3-2-1 Team post + replies to all 3 teammates, ALEKS homework, OOL template upload, Lab Results &amp; Analysis, and Lab Discussion &amp; Conclusions template upload — all due</w:t>
+              <w:t xml:space="preserve">3-2-1 Team post + replies to all 3 teammates + upload due; ALEKS homework due; Lab Background (10 pts) and Methods (40 pts) due</w:t>
             </w:r>
           </w:p>
         </w:tc>
@@ -1416,7 +1392,7 @@
         <w:pStyle w:val="BodyText"/>
       </w:pPr>
       <w:r>
-        <w:t xml:space="preserve">Quizzes are the one exception to this weekly pattern — they’re in-person during lab, tentatively Weeks 3, 5, 6, 9, and 11 only.</w:t>
+        <w:t xml:space="preserve">Quizzes are the one exception to this weekly pattern — they’re in-person during lab, in Weeks 2, 5, 7, 9, and 11.</w:t>
       </w:r>
     </w:p>
     <w:p>

</xml_diff>

<commit_message>
Fix 65% pass threshold: applies to all six grading categories, not just Labs
The rule was mis-scoped under "About the Lab Requirement" as if it
only applied to the Lab Experiments category. Moved to the Grading
section, right after the category table, and reworded to state it
applies to every one of the six categories individually — falling
below 65% in any one category fails the course even with a passing
overall average.

Co-Authored-By: Claude Sonnet 5 <noreply@anthropic.com>
</commit_message>
<xml_diff>
--- a/downloads/CHEM121_Syllabus_Fall2026.docx
+++ b/downloads/CHEM121_Syllabus_Fall2026.docx
@@ -3034,6 +3034,14 @@
         </w:tc>
       </w:tr>
     </w:tbl>
+    <w:p>
+      <w:pPr>
+        <w:pStyle w:val="BodyText"/>
+      </w:pPr>
+      <w:r>
+        <w:t xml:space="preserve">You must earn at least 65% in every one of the six grading categories above to pass this course — not just an overall passing average. Falling below 65% in any single category, even with a passing overall grade, means you cannot pass.</w:t>
+      </w:r>
+    </w:p>
     <w:bookmarkEnd w:id="34"/>
     <w:bookmarkStart w:id="35" w:name="about-the-lab-requirement"/>
     <w:p>
@@ -3098,18 +3106,6 @@
       </w:pPr>
       <w:r>
         <w:t xml:space="preserve">Missing three weeks of lab, or having two incomplete labs, means you cannot pass the course.</w:t>
-      </w:r>
-    </w:p>
-    <w:p>
-      <w:pPr>
-        <w:pStyle w:val="Compact"/>
-        <w:numPr>
-          <w:ilvl w:val="0"/>
-          <w:numId w:val="1008"/>
-        </w:numPr>
-      </w:pPr>
-      <w:r>
-        <w:t xml:space="preserve">You must earn 65% or greater in the Lab Experiments category to pass this course.</w:t>
       </w:r>
     </w:p>
     <w:bookmarkEnd w:id="35"/>

</xml_diff>

<commit_message>
Rename Module 0 references, escalate AI-violation penalty, add harassment line
- "Module 0" renamed to "Getting Started: Course Orientation" in the
  Start Here checklist, Electronic Resources row, and Tech Hub setup
  help row (both courses)
- AI Agreement penalty changed from a flat F to 20% (a failing score)
  on first violation, escalating to zero for repeated or more serious
  violations
- Classroom Norms: added a sentence stating harassment, bias, hate,
  and discrimination toward a peer or professor will not be tolerated
- Reworded the existing 65% grading-floor sentence to bold the lead
  clause, matching the source patch
- Regenerated all downloads/ outputs locally

Co-Authored-By: Claude Sonnet 5 <noreply@anthropic.com>
</commit_message>
<xml_diff>
--- a/downloads/CHEM121_Syllabus_Fall2026.docx
+++ b/downloads/CHEM121_Syllabus_Fall2026.docx
@@ -625,7 +625,7 @@
         </w:numPr>
       </w:pPr>
       <w:r>
-        <w:t xml:space="preserve">Work through Module 0, including the ALEKS/Office/OneDrive setup guide — both need to be done by the end of your first lab, so budget the time.</w:t>
+        <w:t xml:space="preserve">Work through Getting Started: Course Orientation, including the ALEKS/Office/OneDrive setup guide — both need to be done by the end of your first lab, so budget the time.</w:t>
       </w:r>
     </w:p>
     <w:p>
@@ -1883,7 +1883,7 @@
               <w:t xml:space="preserve">Canvas Learning Management System. You’ll need to scan and upload multi-page PDF files to Canvas — Microsoft OneDrive or Adobe Scan are recommended.</w:t>
             </w:r>
             <w:r>
-              <w:t xml:space="preserve">Follow the directions in the Module 0 Getting Started guide, which include enabling your Clark student email and Clark Labs account to activate your free Microsoft Office 365 account.</w:t>
+              <w:t xml:space="preserve">Follow the directions in the Getting Started: Course Orientation guide, which include enabling your Clark student email and Clark Labs account to activate your free Microsoft Office 365 account.</w:t>
             </w:r>
           </w:p>
         </w:tc>
@@ -2088,7 +2088,7 @@
           <w:i/>
           <w:iCs/>
         </w:rPr>
-        <w:t xml:space="preserve">TL;DR: No AI-generated content anywhere, in anything you submit — discussions, labs, ALEKS, quizzes, the Final Project. No exceptions, no declaring your way around it. Any AI use in a submission gets an F on that assignment.</w:t>
+        <w:t xml:space="preserve">TL;DR: No AI-generated content anywhere, in anything you submit — discussions, labs, ALEKS, quizzes, the Final Project. No exceptions, no declaring your way around it. Any AI use in a submission earns 20% on that assignment — a failing score — with repeated or more serious violations dropping to zero.</w:t>
       </w:r>
     </w:p>
     <w:p>
@@ -2128,7 +2128,7 @@
           <w:b/>
           <w:bCs/>
         </w:rPr>
-        <w:t xml:space="preserve">Assignments with AI will get an F.</w:t>
+        <w:t xml:space="preserve">Assignments with AI-generated or AI-edited content earn 20% — a failing score. Repeated or more serious violations may result in a zero on that assignment.</w:t>
       </w:r>
     </w:p>
     <w:p>
@@ -2368,7 +2368,15 @@
         <w:pStyle w:val="FirstParagraph"/>
       </w:pPr>
       <w:r>
-        <w:t xml:space="preserve">As your professor, I want to make clear my commitment to creating a welcoming and compassionate classroom culture in-person and online that supports a variety of thoughts, perspectives, and lived experiences. Healthcare occupations are founded on ethical and professional standards that are improved through the inclusion of diverse voices and perspectives. To honor these commitments, I expect that everyone — including me — will:</w:t>
+        <w:t xml:space="preserve">As your professor, I want to make clear my commitment to creating a welcoming and compassionate classroom culture in-person and online that supports a variety of thoughts, perspectives, and lived experiences. Healthcare occupations are founded on ethical and professional standards that are improved through the inclusion of diverse voices and perspectives. We value an inclusive environment, and harassment, bias, hate, and discrimination directed at a peer or professor will not be tolerated.</w:t>
+      </w:r>
+    </w:p>
+    <w:p>
+      <w:pPr>
+        <w:pStyle w:val="BodyText"/>
+      </w:pPr>
+      <w:r>
+        <w:t xml:space="preserve">To honor these commitments, I expect that everyone — including me — will:</w:t>
       </w:r>
     </w:p>
     <w:p>
@@ -3039,7 +3047,17 @@
         <w:pStyle w:val="BodyText"/>
       </w:pPr>
       <w:r>
-        <w:t xml:space="preserve">You must earn at least 65% in every one of the six grading categories above to pass this course — not just an overall passing average. Falling below 65% in any single category, even with a passing overall grade, means you cannot pass.</w:t>
+        <w:rPr>
+          <w:b/>
+          <w:bCs/>
+        </w:rPr>
+        <w:t xml:space="preserve">You must earn at least 65% in every one of the six grading categories above to pass this course — not just an overall passing average.</w:t>
+      </w:r>
+      <w:r>
+        <w:t xml:space="preserve"> </w:t>
+      </w:r>
+      <w:r>
+        <w:t xml:space="preserve">Falling below 65% in any single category, even with a passing overall grade, means you cannot pass.</w:t>
       </w:r>
     </w:p>
     <w:bookmarkEnd w:id="34"/>
@@ -3744,7 +3762,7 @@
               <w:pStyle w:val="Compact"/>
             </w:pPr>
             <w:r>
-              <w:t xml:space="preserve">Module 0 has the Office/OneDrive setup guide — this step trips people up, so budget real time and reach out to Tech Hub if you hit an error</w:t>
+              <w:t xml:space="preserve">Getting Started: Course Orientation has the Office/OneDrive setup guide — this step trips people up, so budget real time and reach out to Tech Hub if you hit an error</w:t>
             </w:r>
           </w:p>
         </w:tc>

</xml_diff>

<commit_message>
Add Gen Ed Competencies and CLO-to-Assessment table to both syllabi
- New Gen Ed Competencies list (Critical Thinking 3/4, Problem-Solving
  1, Communication 3, Civic & Global Consciousness 1/3) in the
  Learning Goals section, tying course outcomes to Clark's General
  Education framework
- New CLO-to-Assessment table mapping each CLO to the assignment
  categories that measure it, replacing the prior one-line summary
  sentence
- CHEM131's CLOs expanded from three to four (adding CLO4) and
  reworded to match CHEM121's structure
- Fixed a duplicate section-heading bug present in the source patch
  for chem131.md (patch would have inserted "What Are the Learning
  Goals in This Course?" twice); applied the content changes directly
  instead of via git apply
- Regenerated all downloads/ outputs locally

Co-Authored-By: Claude Sonnet 5 <noreply@anthropic.com>
</commit_message>
<xml_diff>
--- a/downloads/CHEM121_Syllabus_Fall2026.docx
+++ b/downloads/CHEM121_Syllabus_Fall2026.docx
@@ -2623,12 +2623,152 @@
           <w:i/>
           <w:iCs/>
         </w:rPr>
-        <w:t xml:space="preserve">TL;DR: By the end, you can apply chemistry reasoning to real health-career problems — not just recall facts.</w:t>
+        <w:t xml:space="preserve">TL;DR: By the end, you can apply chemistry reasoning to real health-career problems — and these skills tie directly to Clark’s General Education Competencies.</w:t>
       </w:r>
     </w:p>
     <w:p>
       <w:pPr>
         <w:pStyle w:val="BodyText"/>
+      </w:pPr>
+      <w:r>
+        <w:t xml:space="preserve">General Education at Clark College empowers students to become informed, adaptable, and engaged community members who are prepared to contribute to a more just and equitable society. Through the competencies below, students in this class build a foundation of skills and knowledge to achieve their personal and professional goals:</w:t>
+      </w:r>
+    </w:p>
+    <w:p>
+      <w:pPr>
+        <w:pStyle w:val="Compact"/>
+        <w:numPr>
+          <w:ilvl w:val="0"/>
+          <w:numId w:val="1007"/>
+        </w:numPr>
+      </w:pPr>
+      <w:r>
+        <w:rPr>
+          <w:b/>
+          <w:bCs/>
+        </w:rPr>
+        <w:t xml:space="preserve">Critical Thinking 3</w:t>
+      </w:r>
+      <w:r>
+        <w:t xml:space="preserve"> </w:t>
+      </w:r>
+      <w:r>
+        <w:t xml:space="preserve">— Formulate well-reasoned arguments supported by evidence</w:t>
+      </w:r>
+    </w:p>
+    <w:p>
+      <w:pPr>
+        <w:pStyle w:val="Compact"/>
+        <w:numPr>
+          <w:ilvl w:val="0"/>
+          <w:numId w:val="1007"/>
+        </w:numPr>
+      </w:pPr>
+      <w:r>
+        <w:rPr>
+          <w:b/>
+          <w:bCs/>
+        </w:rPr>
+        <w:t xml:space="preserve">Critical Thinking 4</w:t>
+      </w:r>
+      <w:r>
+        <w:t xml:space="preserve"> </w:t>
+      </w:r>
+      <w:r>
+        <w:t xml:space="preserve">— Apply creative thinking skills to generate new ideas and solve problems</w:t>
+      </w:r>
+    </w:p>
+    <w:p>
+      <w:pPr>
+        <w:pStyle w:val="Compact"/>
+        <w:numPr>
+          <w:ilvl w:val="0"/>
+          <w:numId w:val="1007"/>
+        </w:numPr>
+      </w:pPr>
+      <w:r>
+        <w:rPr>
+          <w:b/>
+          <w:bCs/>
+        </w:rPr>
+        <w:t xml:space="preserve">Problem-Solving 1</w:t>
+      </w:r>
+      <w:r>
+        <w:t xml:space="preserve"> </w:t>
+      </w:r>
+      <w:r>
+        <w:t xml:space="preserve">— Accurately define a problem</w:t>
+      </w:r>
+    </w:p>
+    <w:p>
+      <w:pPr>
+        <w:pStyle w:val="Compact"/>
+        <w:numPr>
+          <w:ilvl w:val="0"/>
+          <w:numId w:val="1007"/>
+        </w:numPr>
+      </w:pPr>
+      <w:r>
+        <w:rPr>
+          <w:b/>
+          <w:bCs/>
+        </w:rPr>
+        <w:t xml:space="preserve">Communication 3</w:t>
+      </w:r>
+      <w:r>
+        <w:t xml:space="preserve"> </w:t>
+      </w:r>
+      <w:r>
+        <w:t xml:space="preserve">— Apply communication skills and concepts to real-world situations</w:t>
+      </w:r>
+    </w:p>
+    <w:p>
+      <w:pPr>
+        <w:pStyle w:val="Compact"/>
+        <w:numPr>
+          <w:ilvl w:val="0"/>
+          <w:numId w:val="1007"/>
+        </w:numPr>
+      </w:pPr>
+      <w:r>
+        <w:rPr>
+          <w:b/>
+          <w:bCs/>
+        </w:rPr>
+        <w:t xml:space="preserve">Civic &amp; Global Consciousness 1</w:t>
+      </w:r>
+      <w:r>
+        <w:t xml:space="preserve"> </w:t>
+      </w:r>
+      <w:r>
+        <w:t xml:space="preserve">— Explain global issues, considering various perspectives</w:t>
+      </w:r>
+    </w:p>
+    <w:p>
+      <w:pPr>
+        <w:pStyle w:val="Compact"/>
+        <w:numPr>
+          <w:ilvl w:val="0"/>
+          <w:numId w:val="1007"/>
+        </w:numPr>
+      </w:pPr>
+      <w:r>
+        <w:rPr>
+          <w:b/>
+          <w:bCs/>
+        </w:rPr>
+        <w:t xml:space="preserve">Civic &amp; Global Consciousness 3</w:t>
+      </w:r>
+      <w:r>
+        <w:t xml:space="preserve"> </w:t>
+      </w:r>
+      <w:r>
+        <w:t xml:space="preserve">— Identify the requirements of responsible civic engagement</w:t>
+      </w:r>
+    </w:p>
+    <w:p>
+      <w:pPr>
+        <w:pStyle w:val="FirstParagraph"/>
       </w:pPr>
       <w:r>
         <w:t xml:space="preserve">Student learning outcomes are the skills and abilities that you are working to acquire, practice, and apply in class. They represent the learning goals for the term.</w:t>
@@ -2651,7 +2791,7 @@
         <w:pStyle w:val="Compact"/>
         <w:numPr>
           <w:ilvl w:val="0"/>
-          <w:numId w:val="1007"/>
+          <w:numId w:val="1008"/>
         </w:numPr>
       </w:pPr>
       <w:r>
@@ -2673,7 +2813,7 @@
         <w:pStyle w:val="Compact"/>
         <w:numPr>
           <w:ilvl w:val="0"/>
-          <w:numId w:val="1007"/>
+          <w:numId w:val="1008"/>
         </w:numPr>
       </w:pPr>
       <w:r>
@@ -2695,7 +2835,7 @@
         <w:pStyle w:val="Compact"/>
         <w:numPr>
           <w:ilvl w:val="0"/>
-          <w:numId w:val="1007"/>
+          <w:numId w:val="1008"/>
         </w:numPr>
       </w:pPr>
       <w:r>
@@ -2717,7 +2857,7 @@
         <w:pStyle w:val="Compact"/>
         <w:numPr>
           <w:ilvl w:val="0"/>
-          <w:numId w:val="1007"/>
+          <w:numId w:val="1008"/>
         </w:numPr>
       </w:pPr>
       <w:r>
@@ -2739,9 +2879,144 @@
         <w:pStyle w:val="FirstParagraph"/>
       </w:pPr>
       <w:r>
-        <w:t xml:space="preserve">These outcomes are measured through your weekly 3-2-1 Team Posts and OOL Discussions, ALEKS Problem Sets, Lab Experiments, Quizzes, and the Final TYC Project. Rubrics for each are posted in the relevant Canvas module.</w:t>
-      </w:r>
-    </w:p>
+        <w:t xml:space="preserve">The table below lists the learning outcomes for this course with the corresponding assessments, to support Clark’s General Education Competencies:</w:t>
+      </w:r>
+    </w:p>
+    <w:tbl>
+      <w:tblPr>
+        <w:tblStyle w:val="Table"/>
+        <w:tblW w:type="pct" w:w="5000"/>
+        <w:tblLayout w:type="fixed"/>
+        <w:tblLook w:firstRow="1" w:lastRow="0" w:firstColumn="0" w:lastColumn="0" w:noHBand="0" w:noVBand="0" w:val="0020"/>
+      </w:tblPr>
+      <w:tblGrid>
+        <w:gridCol w:w="3960"/>
+        <w:gridCol w:w="3960"/>
+      </w:tblGrid>
+      <w:tr>
+        <w:trPr>
+          <w:tblHeader w:val="on"/>
+        </w:trPr>
+        <w:tc>
+          <w:tcPr/>
+          <w:p>
+            <w:pPr>
+              <w:pStyle w:val="Compact"/>
+            </w:pPr>
+            <w:r>
+              <w:t xml:space="preserve">Course Outcomes</w:t>
+            </w:r>
+          </w:p>
+        </w:tc>
+        <w:tc>
+          <w:tcPr/>
+          <w:p>
+            <w:pPr>
+              <w:pStyle w:val="Compact"/>
+            </w:pPr>
+            <w:r>
+              <w:t xml:space="preserve">Assessment of Course Outcomes</w:t>
+            </w:r>
+          </w:p>
+        </w:tc>
+      </w:tr>
+      <w:tr>
+        <w:tc>
+          <w:tcPr/>
+          <w:p>
+            <w:pPr>
+              <w:pStyle w:val="Compact"/>
+            </w:pPr>
+            <w:r>
+              <w:t xml:space="preserve">CLO1</w:t>
+            </w:r>
+          </w:p>
+        </w:tc>
+        <w:tc>
+          <w:tcPr/>
+          <w:p>
+            <w:pPr>
+              <w:pStyle w:val="Compact"/>
+            </w:pPr>
+            <w:r>
+              <w:t xml:space="preserve">ALEKS Problem Sets, 3-2-1 Team Posts, Lab Experiments, OOL Discussions, Final TYC Project</w:t>
+            </w:r>
+          </w:p>
+        </w:tc>
+      </w:tr>
+      <w:tr>
+        <w:tc>
+          <w:tcPr/>
+          <w:p>
+            <w:pPr>
+              <w:pStyle w:val="Compact"/>
+            </w:pPr>
+            <w:r>
+              <w:t xml:space="preserve">CLO2</w:t>
+            </w:r>
+          </w:p>
+        </w:tc>
+        <w:tc>
+          <w:tcPr/>
+          <w:p>
+            <w:pPr>
+              <w:pStyle w:val="Compact"/>
+            </w:pPr>
+            <w:r>
+              <w:t xml:space="preserve">Quizzes, ALEKS Problem Sets, 3-2-1 Team Posts, Lab Experiments, Final TYC Project</w:t>
+            </w:r>
+          </w:p>
+        </w:tc>
+      </w:tr>
+      <w:tr>
+        <w:tc>
+          <w:tcPr/>
+          <w:p>
+            <w:pPr>
+              <w:pStyle w:val="Compact"/>
+            </w:pPr>
+            <w:r>
+              <w:t xml:space="preserve">CLO3</w:t>
+            </w:r>
+          </w:p>
+        </w:tc>
+        <w:tc>
+          <w:tcPr/>
+          <w:p>
+            <w:pPr>
+              <w:pStyle w:val="Compact"/>
+            </w:pPr>
+            <w:r>
+              <w:t xml:space="preserve">Quizzes, ALEKS Problem Sets, 3-2-1 Team Posts, Lab Experiments, Final TYC Project</w:t>
+            </w:r>
+          </w:p>
+        </w:tc>
+      </w:tr>
+      <w:tr>
+        <w:tc>
+          <w:tcPr/>
+          <w:p>
+            <w:pPr>
+              <w:pStyle w:val="Compact"/>
+            </w:pPr>
+            <w:r>
+              <w:t xml:space="preserve">CLO4</w:t>
+            </w:r>
+          </w:p>
+        </w:tc>
+        <w:tc>
+          <w:tcPr/>
+          <w:p>
+            <w:pPr>
+              <w:pStyle w:val="Compact"/>
+            </w:pPr>
+            <w:r>
+              <w:t xml:space="preserve">OOL Discussions, Lab Experiments, Final TYC Project</w:t>
+            </w:r>
+          </w:p>
+        </w:tc>
+      </w:tr>
+    </w:tbl>
     <w:bookmarkEnd w:id="33"/>
     <w:bookmarkStart w:id="40" w:name="how-will-i-be-graded-and-why"/>
     <w:p>
@@ -3083,7 +3358,7 @@
         <w:pStyle w:val="Compact"/>
         <w:numPr>
           <w:ilvl w:val="0"/>
-          <w:numId w:val="1008"/>
+          <w:numId w:val="1009"/>
         </w:numPr>
       </w:pPr>
       <w:r>
@@ -3095,7 +3370,7 @@
         <w:pStyle w:val="Compact"/>
         <w:numPr>
           <w:ilvl w:val="0"/>
-          <w:numId w:val="1008"/>
+          <w:numId w:val="1009"/>
         </w:numPr>
       </w:pPr>
       <w:r>
@@ -3107,7 +3382,7 @@
         <w:pStyle w:val="Compact"/>
         <w:numPr>
           <w:ilvl w:val="0"/>
-          <w:numId w:val="1008"/>
+          <w:numId w:val="1009"/>
         </w:numPr>
       </w:pPr>
       <w:r>
@@ -3119,7 +3394,7 @@
         <w:pStyle w:val="Compact"/>
         <w:numPr>
           <w:ilvl w:val="0"/>
-          <w:numId w:val="1008"/>
+          <w:numId w:val="1009"/>
         </w:numPr>
       </w:pPr>
       <w:r>
@@ -3457,7 +3732,7 @@
         <w:pStyle w:val="Compact"/>
         <w:numPr>
           <w:ilvl w:val="0"/>
-          <w:numId w:val="1009"/>
+          <w:numId w:val="1010"/>
         </w:numPr>
       </w:pPr>
       <w:r>
@@ -3469,7 +3744,7 @@
         <w:pStyle w:val="Compact"/>
         <w:numPr>
           <w:ilvl w:val="0"/>
-          <w:numId w:val="1009"/>
+          <w:numId w:val="1010"/>
         </w:numPr>
       </w:pPr>
       <w:r>
@@ -3481,7 +3756,7 @@
         <w:pStyle w:val="Compact"/>
         <w:numPr>
           <w:ilvl w:val="0"/>
-          <w:numId w:val="1009"/>
+          <w:numId w:val="1010"/>
         </w:numPr>
       </w:pPr>
       <w:r>
@@ -3493,7 +3768,7 @@
         <w:pStyle w:val="Compact"/>
         <w:numPr>
           <w:ilvl w:val="0"/>
-          <w:numId w:val="1009"/>
+          <w:numId w:val="1010"/>
         </w:numPr>
       </w:pPr>
       <w:r>
@@ -4429,7 +4704,7 @@
         <w:pStyle w:val="Compact"/>
         <w:numPr>
           <w:ilvl w:val="0"/>
-          <w:numId w:val="1010"/>
+          <w:numId w:val="1011"/>
         </w:numPr>
       </w:pPr>
       <w:r>
@@ -4468,7 +4743,7 @@
         <w:pStyle w:val="Compact"/>
         <w:numPr>
           <w:ilvl w:val="0"/>
-          <w:numId w:val="1010"/>
+          <w:numId w:val="1011"/>
         </w:numPr>
       </w:pPr>
       <w:r>
@@ -4490,7 +4765,7 @@
         <w:pStyle w:val="Compact"/>
         <w:numPr>
           <w:ilvl w:val="0"/>
-          <w:numId w:val="1010"/>
+          <w:numId w:val="1011"/>
         </w:numPr>
       </w:pPr>
       <w:r>
@@ -4512,7 +4787,7 @@
         <w:pStyle w:val="Compact"/>
         <w:numPr>
           <w:ilvl w:val="0"/>
-          <w:numId w:val="1010"/>
+          <w:numId w:val="1011"/>
         </w:numPr>
       </w:pPr>
       <w:r>
@@ -4908,6 +5183,9 @@
     <w:abstractNumId w:val="991"/>
   </w:num>
   <w:num w:numId="1010">
+    <w:abstractNumId w:val="991"/>
+  </w:num>
+  <w:num w:numId="1011">
     <w:abstractNumId w:val="991"/>
   </w:num>
 </w:numbering>

</xml_diff>

<commit_message>
Fix grading scale gap, correct TYC due date, tighten AI wording
- Grading scale: fixed the 76-77% gap between C and C+ (C was 73-76,
  C+ was 77-79) — C is now 73-77, C+ is 77-80, fully contiguous with
  no uncovered percentages
- Final TYC Project due date corrected from Friday 12/11 to Thursday
  12/10 in both What's Covered pages
- "biweekly on-campus lab" -> "twice-weekly on-campus lab" (biweekly
  was ambiguous)
- AI Agreement language tightened: removed the Word/Google Docs
  caveat and the quotation-marks-with-citation allowance for AI
  content — no AI-generated material may be used at all, in any form
- "The two big ones" row now points to the Lab Requirement section
  for what a missed lab means
- Regenerated all downloads/ outputs locally (applied only the
  markdown-source hunks from the patch; the binary PDF/DOCX/ics hunks
  were skipped since local rebuild regenerates them directly)

Co-Authored-By: Claude Sonnet 5 <noreply@anthropic.com>
</commit_message>
<xml_diff>
--- a/downloads/CHEM121_Syllabus_Fall2026.docx
+++ b/downloads/CHEM121_Syllabus_Fall2026.docx
@@ -272,7 +272,7 @@
               <w:pStyle w:val="Compact"/>
             </w:pPr>
             <w:r>
-              <w:t xml:space="preserve">Weekly lab attendance (required every week, no exceptions) and the Final TYC (Teach Your Community) Project — 10% of your grade, in place of a final exam.</w:t>
+              <w:t xml:space="preserve">Weekly lab attendance (required every week — see About the Lab Requirement for how a missed lab is handled) and the Final TYC (Teach Your Community) Project — 10% of your grade, in place of a final exam.</w:t>
             </w:r>
           </w:p>
         </w:tc>
@@ -869,7 +869,7 @@
               <w:pStyle w:val="Compact"/>
             </w:pPr>
             <w:r>
-              <w:t xml:space="preserve">Hybrid — asynchronous online lecture/discussion + biweekly on-campus lab</w:t>
+              <w:t xml:space="preserve">Hybrid — asynchronous online lecture/discussion + twice-weekly on-campus lab</w:t>
             </w:r>
           </w:p>
         </w:tc>
@@ -1998,7 +1998,7 @@
           <w:i/>
           <w:iCs/>
         </w:rPr>
-        <w:t xml:space="preserve">TL;DR: Message me in Canvas Inbox, cite anything that isn’t yours, never let AI write your discussion posts, and show up ready to work.</w:t>
+        <w:t xml:space="preserve">TL;DR: Message me in Canvas Inbox, cite anything that isn’t yours, never use AI to create anything you submit, and show up ready to work.</w:t>
       </w:r>
     </w:p>
     <w:bookmarkStart w:id="27" w:name="communication"/>
@@ -2106,7 +2106,7 @@
         <w:t xml:space="preserve"> </w:t>
       </w:r>
       <w:r>
-        <w:t xml:space="preserve">In this class, I look forward to and am excited to see your original work and perspectives written in your own voice. You are not graded on grammar. Natural language processing (NLP) applications like ChatGPT, OpenAI, xAI, LLMs like DeepSeek, should be used with caution and only if you are documenting your work in Microsoft Word or Google Docs. You should note that the material generated by these programs may be inaccurate, incomplete, biased, or otherwise really crappy. Beware that use WILL stifle your own independent thinking and creativity. You cannot submit any work or even one sentence generated by an AI tool as your own. Even</w:t>
+        <w:t xml:space="preserve">In this class, I look forward to and am excited to see your original work and perspectives written in your own voice. You are not graded on grammar. Natural language processing (NLP) applications like ChatGPT, OpenAI, xAI, and LLMs like DeepSeek may not be used to create any part of the work you submit in this course. You should note that the material generated by these programs may be inaccurate, incomplete, biased, or otherwise really crappy. Beware that use WILL stifle your own independent thinking and creativity. You cannot submit any work or even one sentence generated by an AI tool as your own. That includes</w:t>
       </w:r>
       <w:r>
         <w:t xml:space="preserve"> </w:t>
@@ -2118,7 +2118,7 @@
         <w:t xml:space="preserve"> </w:t>
       </w:r>
       <w:r>
-        <w:t xml:space="preserve">material or ideas generated by AI should be credited instead of you, just like any other reference material.</w:t>
+        <w:t xml:space="preserve">material or ideas — AI cannot brainstorm for you, even if you credit it.</w:t>
       </w:r>
       <w:r>
         <w:t xml:space="preserve"> </w:t>
@@ -2268,7 +2268,7 @@
         </w:numPr>
       </w:pPr>
       <w:r>
-        <w:t xml:space="preserve">You cannot use entire sentences or paragraphs suggested by an app without providing quotation marks and a citation, just as you would any other source (see Citing Your Sources above).</w:t>
+        <w:t xml:space="preserve">You cannot use sentences or paragraphs suggested by an app — not even with quotation marks and a citation.</w:t>
       </w:r>
     </w:p>
     <w:p>
@@ -3556,7 +3556,7 @@
               <w:pStyle w:val="Compact"/>
             </w:pPr>
             <w:r>
-              <w:t xml:space="preserve">73 up to 76</w:t>
+              <w:t xml:space="preserve">73 up to 77</w:t>
             </w:r>
           </w:p>
         </w:tc>
@@ -3670,7 +3670,7 @@
               <w:pStyle w:val="Compact"/>
             </w:pPr>
             <w:r>
-              <w:t xml:space="preserve">77 up to 79</w:t>
+              <w:t xml:space="preserve">77 up to 80</w:t>
             </w:r>
           </w:p>
         </w:tc>

</xml_diff>

<commit_message>
Rework 3-2-1 weekly routine; add "How to Work in This Class"
- Weekly Flow (both courses): in-lab team huddle, then one 3-2-1 post
  due Thursday covering both Activities; Sunday now covers replies to
  two teammates' ONE questions plus both Activity PDF uploads; Team
  Lead post moves to Friday. CHEM121's huddle is its Wednesday lab
  day, CHEM131's is Thursday.
- New "How to Work in This Class" section under Weekly Flow: work each
  Activity before the Video Key, how the THREE/ONE map to the process,
  and when to check in about time or quiz scores
- Start Here / Terms / Your First Week / grading table descriptions
  updated to match; time-to-budget now means hours outside of lab
- Rebuilt PDFs, Word docs, and accessible Word docs from the new source
- LAST_UPDATED set to October 23, 2026

Co-Authored-By: Claude Sonnet 5.5 <noreply@anthropic.com>
</commit_message>
<xml_diff>
--- a/downloads/CHEM121_Syllabus_Fall2026.docx
+++ b/downloads/CHEM121_Syllabus_Fall2026.docx
@@ -216,7 +216,7 @@
               <w:pStyle w:val="Compact"/>
             </w:pPr>
             <w:r>
-              <w:t xml:space="preserve">About 10–12 hours a week — most of it on Canvas, plus your 4-hour on-campus lab.</w:t>
+              <w:t xml:space="preserve">About 10–12 hours a week outside of lab, plus your 4-hour on-campus lab — see How to Work in This Class.</w:t>
             </w:r>
           </w:p>
         </w:tc>
@@ -426,7 +426,7 @@
               <w:pStyle w:val="Compact"/>
             </w:pPr>
             <w:r>
-              <w:t xml:space="preserve">Your weekly Team Discussion format — named for its posting structure (three problem areas, two areas of interest, one insight from the video key).</w:t>
+              <w:t xml:space="preserve">Your weekly Team Discussion format — named for its posting structure (three problem areas, two areas of interest, one triage question you bring to your team’s huddle in lab).</w:t>
             </w:r>
           </w:p>
         </w:tc>
@@ -649,7 +649,7 @@
         </w:numPr>
       </w:pPr>
       <w:r>
-        <w:t xml:space="preserve">Confirm you have both your Chemfolio and lab manual from the Clark Bookstore before class — your first 3-2-1 team post is due that Wednesday.</w:t>
+        <w:t xml:space="preserve">Confirm you have both your Chemfolio and lab manual from the Clark Bookstore before class — your first 3-2-1 team post is due that Thursday, the day after your second lab day.</w:t>
       </w:r>
     </w:p>
     <w:bookmarkEnd w:id="11"/>
@@ -1026,7 +1026,7 @@
       </w:tr>
     </w:tbl>
     <w:bookmarkEnd w:id="15"/>
-    <w:bookmarkStart w:id="21" w:name="welcome-to-class"/>
+    <w:bookmarkStart w:id="22" w:name="welcome-to-class"/>
     <w:p>
       <w:pPr>
         <w:pStyle w:val="Heading1"/>
@@ -1266,18 +1266,18 @@
               <w:pStyle w:val="Compact"/>
             </w:pPr>
             <w:r>
-              <w:t xml:space="preserve">Wednesday</w:t>
-            </w:r>
-          </w:p>
-        </w:tc>
-        <w:tc>
-          <w:tcPr/>
-          <w:p>
-            <w:pPr>
-              <w:pStyle w:val="Compact"/>
-            </w:pPr>
-            <w:r>
-              <w:t xml:space="preserve">3-2-1 Team post + upload due; OOL discussion post due</w:t>
+              <w:t xml:space="preserve">Wednesday (second lab day)</w:t>
+            </w:r>
+          </w:p>
+        </w:tc>
+        <w:tc>
+          <w:tcPr/>
+          <w:p>
+            <w:pPr>
+              <w:pStyle w:val="Compact"/>
+            </w:pPr>
+            <w:r>
+              <w:t xml:space="preserve">Team huddle in lab; OOL discussion post due</w:t>
             </w:r>
           </w:p>
         </w:tc>
@@ -1301,7 +1301,7 @@
               <w:pStyle w:val="Compact"/>
             </w:pPr>
             <w:r>
-              <w:t xml:space="preserve">3-2-1 Team Lead Summary post due (Team Lead only, that week)</w:t>
+              <w:t xml:space="preserve">3-2-1 Team post due, covering both Activities</w:t>
             </w:r>
           </w:p>
         </w:tc>
@@ -1325,7 +1325,7 @@
               <w:pStyle w:val="Compact"/>
             </w:pPr>
             <w:r>
-              <w:t xml:space="preserve">OOL replies due; Lab Results (20 pts), Findings (10 pts), and Conclusions (20 pts) due</w:t>
+              <w:t xml:space="preserve">TEAM LEAD POST due (Team Lead only, that week); OOL replies due; Lab Results (20 pts), Findings (10 pts), and Conclusions (20 pts) due</w:t>
             </w:r>
           </w:p>
         </w:tc>
@@ -1349,7 +1349,7 @@
               <w:pStyle w:val="Compact"/>
             </w:pPr>
             <w:r>
-              <w:t xml:space="preserve">3-2-1 Team post + replies to all 3 teammates + upload due; ALEKS homework due; Lab Background (10 pts) and Methods (40 pts) due</w:t>
+              <w:t xml:space="preserve">3-2-1 replies to two teammates’ ONE questions + both Activity PDF uploads due; ALEKS homework due; Lab Background (10 pts) and Methods (40 pts) due</w:t>
             </w:r>
           </w:p>
         </w:tc>
@@ -1394,8 +1394,210 @@
       </w:r>
     </w:p>
     <w:bookmarkEnd w:id="20"/>
+    <w:bookmarkStart w:id="21" w:name="how-to-work-in-this-class"/>
+    <w:p>
+      <w:pPr>
+        <w:pStyle w:val="Heading2"/>
+      </w:pPr>
+      <w:r>
+        <w:t xml:space="preserve">How to Work in This Class</w:t>
+      </w:r>
+    </w:p>
+    <w:p>
+      <w:pPr>
+        <w:pStyle w:val="FirstParagraph"/>
+      </w:pPr>
+      <w:r>
+        <w:rPr>
+          <w:i/>
+          <w:iCs/>
+        </w:rPr>
+        <w:t xml:space="preserve">TL;DR: Same Activities as the in-person sections, on your schedule. Try each Activity on your own first, then use the Video Key to check and correct your work. Plan on 10–12 hours a week outside of lab. If it’s taking more, or you’re putting in that time and your quiz scores are low, check in with me.</w:t>
+      </w:r>
+    </w:p>
+    <w:p>
+      <w:pPr>
+        <w:pStyle w:val="BodyText"/>
+      </w:pPr>
+      <w:r>
+        <w:rPr>
+          <w:b/>
+          <w:bCs/>
+        </w:rPr>
+        <w:t xml:space="preserve">Same course, your schedule.</w:t>
+      </w:r>
+      <w:r>
+        <w:t xml:space="preserve"> </w:t>
+      </w:r>
+      <w:r>
+        <w:t xml:space="preserve">In-person sections spend 3 hours a week in class working these same Chemfolio Activities together, then finish and review outside class with the Video Keys. You do the same work. The only difference is that you choose when, and how fast.</w:t>
+      </w:r>
+    </w:p>
+    <w:p>
+      <w:pPr>
+        <w:pStyle w:val="BodyText"/>
+      </w:pPr>
+      <w:r>
+        <w:rPr>
+          <w:b/>
+          <w:bCs/>
+        </w:rPr>
+        <w:t xml:space="preserve">How to work an Activity</w:t>
+      </w:r>
+    </w:p>
+    <w:p>
+      <w:pPr>
+        <w:pStyle w:val="Compact"/>
+        <w:numPr>
+          <w:ilvl w:val="0"/>
+          <w:numId w:val="1002"/>
+        </w:numPr>
+      </w:pPr>
+      <w:r>
+        <w:t xml:space="preserve">Read the assigned Smith section.</w:t>
+      </w:r>
+    </w:p>
+    <w:p>
+      <w:pPr>
+        <w:pStyle w:val="Compact"/>
+        <w:numPr>
+          <w:ilvl w:val="0"/>
+          <w:numId w:val="1002"/>
+        </w:numPr>
+      </w:pPr>
+      <w:r>
+        <w:t xml:space="preserve">Work the Activity in your Chemfolio on your own. Don’t start the video yet.</w:t>
+      </w:r>
+    </w:p>
+    <w:p>
+      <w:pPr>
+        <w:pStyle w:val="Compact"/>
+        <w:numPr>
+          <w:ilvl w:val="0"/>
+          <w:numId w:val="1002"/>
+        </w:numPr>
+      </w:pPr>
+      <w:r>
+        <w:t xml:space="preserve">Mark where you got stuck. That’s your THREE.</w:t>
+      </w:r>
+    </w:p>
+    <w:p>
+      <w:pPr>
+        <w:pStyle w:val="Compact"/>
+        <w:numPr>
+          <w:ilvl w:val="0"/>
+          <w:numId w:val="1002"/>
+        </w:numPr>
+      </w:pPr>
+      <w:r>
+        <w:t xml:space="preserve">Watch the Video Key to check and correct your work, and note in your Chemfolio what changed.</w:t>
+      </w:r>
+    </w:p>
+    <w:p>
+      <w:pPr>
+        <w:pStyle w:val="Compact"/>
+        <w:numPr>
+          <w:ilvl w:val="0"/>
+          <w:numId w:val="1002"/>
+        </w:numPr>
+      </w:pPr>
+      <w:r>
+        <w:t xml:space="preserve">Bring what’s still unclear to your team’s huddle. That’s your ONE.</w:t>
+      </w:r>
+    </w:p>
+    <w:p>
+      <w:pPr>
+        <w:pStyle w:val="FirstParagraph"/>
+      </w:pPr>
+      <w:r>
+        <w:rPr>
+          <w:b/>
+          <w:bCs/>
+        </w:rPr>
+        <w:t xml:space="preserve">Why this order matters.</w:t>
+      </w:r>
+      <w:r>
+        <w:t xml:space="preserve"> </w:t>
+      </w:r>
+      <w:r>
+        <w:t xml:space="preserve">Points come from completing the work, but quizzes measure what you learned, and quizzes don’t come with a video. If you can only do a problem while the video is playing, you haven’t learned it yet. Getting stuck first and then fixing it is what makes it stick.</w:t>
+      </w:r>
+    </w:p>
+    <w:p>
+      <w:pPr>
+        <w:pStyle w:val="BodyText"/>
+      </w:pPr>
+      <w:r>
+        <w:rPr>
+          <w:b/>
+          <w:bCs/>
+        </w:rPr>
+        <w:t xml:space="preserve">How much time.</w:t>
+      </w:r>
+      <w:r>
+        <w:t xml:space="preserve"> </w:t>
+      </w:r>
+      <w:r>
+        <w:t xml:space="preserve">Plan on 10–12 hours a week outside of lab. Check in with me if either of these happens:</w:t>
+      </w:r>
+    </w:p>
+    <w:p>
+      <w:pPr>
+        <w:pStyle w:val="Compact"/>
+        <w:numPr>
+          <w:ilvl w:val="0"/>
+          <w:numId w:val="1003"/>
+        </w:numPr>
+      </w:pPr>
+      <w:r>
+        <w:t xml:space="preserve">You’re regularly spending more than 12 hours a week.</w:t>
+      </w:r>
+    </w:p>
+    <w:p>
+      <w:pPr>
+        <w:pStyle w:val="Compact"/>
+        <w:numPr>
+          <w:ilvl w:val="0"/>
+          <w:numId w:val="1003"/>
+        </w:numPr>
+      </w:pPr>
+      <w:r>
+        <w:t xml:space="preserve">You’re putting in 10–12 hours and doing all the work, but your quiz scores are low.</w:t>
+      </w:r>
+    </w:p>
+    <w:p>
+      <w:pPr>
+        <w:pStyle w:val="FirstParagraph"/>
+      </w:pPr>
+      <w:r>
+        <w:t xml:space="preserve">Either one means something about how you’re working needs adjusting, and that’s what Help Hours are for.</w:t>
+      </w:r>
+    </w:p>
+    <w:p>
+      <w:pPr>
+        <w:pStyle w:val="BlockText"/>
+      </w:pPr>
+      <w:r>
+        <w:rPr>
+          <w:b/>
+          <w:bCs/>
+        </w:rPr>
+        <w:t xml:space="preserve">Dr. B’s Note:</w:t>
+      </w:r>
+      <w:r>
+        <w:t xml:space="preserve"> </w:t>
+      </w:r>
+      <w:r>
+        <w:rPr>
+          <w:i/>
+          <w:iCs/>
+        </w:rPr>
+        <w:t xml:space="preserve">Work smarter, not harder. Slow is smooth, and smooth is fast. Put your effort where it pays off most directly in learning: 3-2-1 Team Posts (15%), ALEKS Problem Sets (15%), and Quizzes (20%) together make up 50% of your grade — see How Will I Be Graded below. Lab work and OOL matter too, and both take real writing and analysis. Both will feel slow at first, and you’ll get faster as we go. That’s the point: both are professional expectations in your future career, which is why they’re in this class.</w:t>
+      </w:r>
+    </w:p>
     <w:bookmarkEnd w:id="21"/>
-    <w:bookmarkStart w:id="23" w:name="about-your-instructor"/>
+    <w:bookmarkEnd w:id="22"/>
+    <w:bookmarkStart w:id="24" w:name="about-your-instructor"/>
     <w:p>
       <w:pPr>
         <w:pStyle w:val="Heading1"/>
@@ -1598,7 +1800,7 @@
         </w:tc>
       </w:tr>
     </w:tbl>
-    <w:bookmarkStart w:id="22" w:name="what-can-you-expect-from-me"/>
+    <w:bookmarkStart w:id="23" w:name="what-can-you-expect-from-me"/>
     <w:p>
       <w:pPr>
         <w:pStyle w:val="Heading2"/>
@@ -1633,9 +1835,9 @@
         <w:t xml:space="preserve">— Dr. B</w:t>
       </w:r>
     </w:p>
-    <w:bookmarkEnd w:id="22"/>
     <w:bookmarkEnd w:id="23"/>
-    <w:bookmarkStart w:id="26" w:name="what-course-materials-will-i-need"/>
+    <w:bookmarkEnd w:id="24"/>
+    <w:bookmarkStart w:id="27" w:name="what-course-materials-will-i-need"/>
     <w:p>
       <w:pPr>
         <w:pStyle w:val="Heading1"/>
@@ -1916,7 +2118,7 @@
             <w:r>
               <w:t xml:space="preserve"> </w:t>
             </w:r>
-            <w:hyperlink r:id="rId24">
+            <w:hyperlink r:id="rId25">
               <w:r>
                 <w:rPr>
                   <w:rStyle w:val="Hyperlink"/>
@@ -1961,7 +2163,7 @@
             <w:r>
               <w:t xml:space="preserve"> </w:t>
             </w:r>
-            <w:hyperlink r:id="rId25">
+            <w:hyperlink r:id="rId26">
               <w:r>
                 <w:rPr>
                   <w:rStyle w:val="Hyperlink"/>
@@ -1979,8 +2181,8 @@
         </w:tc>
       </w:tr>
     </w:tbl>
-    <w:bookmarkEnd w:id="26"/>
-    <w:bookmarkStart w:id="32" w:name="what-are-the-course-agreements"/>
+    <w:bookmarkEnd w:id="27"/>
+    <w:bookmarkStart w:id="33" w:name="what-are-the-course-agreements"/>
     <w:p>
       <w:pPr>
         <w:pStyle w:val="Heading1"/>
@@ -2001,7 +2203,7 @@
         <w:t xml:space="preserve">TL;DR: Message me in Canvas Inbox, cite anything that isn’t yours, never use AI to create anything you submit, and show up ready to work.</w:t>
       </w:r>
     </w:p>
-    <w:bookmarkStart w:id="27" w:name="communication"/>
+    <w:bookmarkStart w:id="28" w:name="communication"/>
     <w:p>
       <w:pPr>
         <w:pStyle w:val="Heading2"/>
@@ -2018,8 +2220,8 @@
         <w:t xml:space="preserve">Canvas Inbox is our channel — for everything. I don’t use email during the term, so if you send a Clark email, expect it to go unanswered; message me through Canvas Inbox instead. I respond within 24 hours on weekdays.</w:t>
       </w:r>
     </w:p>
-    <w:bookmarkEnd w:id="27"/>
-    <w:bookmarkStart w:id="29" w:name="citing-your-sources"/>
+    <w:bookmarkEnd w:id="28"/>
+    <w:bookmarkStart w:id="30" w:name="citing-your-sources"/>
     <w:p>
       <w:pPr>
         <w:pStyle w:val="Heading2"/>
@@ -2054,7 +2256,7 @@
       <w:r>
         <w:t xml:space="preserve"> </w:t>
       </w:r>
-      <w:hyperlink r:id="rId28">
+      <w:hyperlink r:id="rId29">
         <w:r>
           <w:rPr>
             <w:rStyle w:val="Hyperlink"/>
@@ -2069,8 +2271,8 @@
         <w:t xml:space="preserve">to learn about what plagiarism is and how to avoid it. It has a tutorial, tips, and style guides for citations. Ask us for help on this - it’s freely given!</w:t>
       </w:r>
     </w:p>
-    <w:bookmarkEnd w:id="29"/>
-    <w:bookmarkStart w:id="30" w:name="X557e592dac108a6d1044d97136f1b079f25201c"/>
+    <w:bookmarkEnd w:id="30"/>
+    <w:bookmarkStart w:id="31" w:name="X557e592dac108a6d1044d97136f1b079f25201c"/>
     <w:p>
       <w:pPr>
         <w:pStyle w:val="Heading2"/>
@@ -2156,7 +2358,7 @@
         <w:pStyle w:val="Compact"/>
         <w:numPr>
           <w:ilvl w:val="0"/>
-          <w:numId w:val="1002"/>
+          <w:numId w:val="1004"/>
         </w:numPr>
       </w:pPr>
       <w:r>
@@ -2172,7 +2374,7 @@
         <w:pStyle w:val="Compact"/>
         <w:numPr>
           <w:ilvl w:val="0"/>
-          <w:numId w:val="1002"/>
+          <w:numId w:val="1004"/>
         </w:numPr>
       </w:pPr>
       <w:r>
@@ -2188,7 +2390,7 @@
         <w:pStyle w:val="Compact"/>
         <w:numPr>
           <w:ilvl w:val="1"/>
-          <w:numId w:val="1003"/>
+          <w:numId w:val="1005"/>
         </w:numPr>
       </w:pPr>
       <w:r>
@@ -2200,7 +2402,7 @@
         <w:pStyle w:val="Compact"/>
         <w:numPr>
           <w:ilvl w:val="1"/>
-          <w:numId w:val="1003"/>
+          <w:numId w:val="1005"/>
         </w:numPr>
       </w:pPr>
       <w:r>
@@ -2212,7 +2414,7 @@
         <w:pStyle w:val="Compact"/>
         <w:numPr>
           <w:ilvl w:val="1"/>
-          <w:numId w:val="1003"/>
+          <w:numId w:val="1005"/>
         </w:numPr>
       </w:pPr>
       <w:r>
@@ -2224,7 +2426,7 @@
         <w:pStyle w:val="Compact"/>
         <w:numPr>
           <w:ilvl w:val="0"/>
-          <w:numId w:val="1002"/>
+          <w:numId w:val="1004"/>
         </w:numPr>
       </w:pPr>
       <w:r>
@@ -2240,7 +2442,7 @@
         <w:pStyle w:val="Compact"/>
         <w:numPr>
           <w:ilvl w:val="1"/>
-          <w:numId w:val="1004"/>
+          <w:numId w:val="1006"/>
         </w:numPr>
       </w:pPr>
       <w:r>
@@ -2252,7 +2454,7 @@
         <w:pStyle w:val="Compact"/>
         <w:numPr>
           <w:ilvl w:val="1"/>
-          <w:numId w:val="1004"/>
+          <w:numId w:val="1006"/>
         </w:numPr>
       </w:pPr>
       <w:r>
@@ -2264,7 +2466,7 @@
         <w:pStyle w:val="Compact"/>
         <w:numPr>
           <w:ilvl w:val="1"/>
-          <w:numId w:val="1004"/>
+          <w:numId w:val="1006"/>
         </w:numPr>
       </w:pPr>
       <w:r>
@@ -2276,7 +2478,7 @@
         <w:pStyle w:val="Compact"/>
         <w:numPr>
           <w:ilvl w:val="1"/>
-          <w:numId w:val="1004"/>
+          <w:numId w:val="1006"/>
         </w:numPr>
       </w:pPr>
       <w:r>
@@ -2298,7 +2500,7 @@
         <w:pStyle w:val="Compact"/>
         <w:numPr>
           <w:ilvl w:val="1"/>
-          <w:numId w:val="1004"/>
+          <w:numId w:val="1006"/>
         </w:numPr>
       </w:pPr>
       <w:r>
@@ -2320,7 +2522,7 @@
         <w:pStyle w:val="Compact"/>
         <w:numPr>
           <w:ilvl w:val="0"/>
-          <w:numId w:val="1002"/>
+          <w:numId w:val="1004"/>
         </w:numPr>
       </w:pPr>
       <w:r>
@@ -2353,8 +2555,8 @@
         <w:t xml:space="preserve">You’re entering health careers where accuracy and integrity matter. This policy isn’t about distrust — it’s about protecting your own growth as a thinker, which is the actual skill you’re here to build.</w:t>
       </w:r>
     </w:p>
-    <w:bookmarkEnd w:id="30"/>
-    <w:bookmarkStart w:id="31" w:name="classroom-norms"/>
+    <w:bookmarkEnd w:id="31"/>
+    <w:bookmarkStart w:id="32" w:name="classroom-norms"/>
     <w:p>
       <w:pPr>
         <w:pStyle w:val="Heading2"/>
@@ -2384,7 +2586,7 @@
         <w:pStyle w:val="Compact"/>
         <w:numPr>
           <w:ilvl w:val="0"/>
-          <w:numId w:val="1005"/>
+          <w:numId w:val="1007"/>
         </w:numPr>
       </w:pPr>
       <w:r>
@@ -2396,7 +2598,7 @@
         <w:pStyle w:val="Compact"/>
         <w:numPr>
           <w:ilvl w:val="0"/>
-          <w:numId w:val="1005"/>
+          <w:numId w:val="1007"/>
         </w:numPr>
       </w:pPr>
       <w:r>
@@ -2408,7 +2610,7 @@
         <w:pStyle w:val="Compact"/>
         <w:numPr>
           <w:ilvl w:val="0"/>
-          <w:numId w:val="1005"/>
+          <w:numId w:val="1007"/>
         </w:numPr>
       </w:pPr>
       <w:r>
@@ -2420,7 +2622,7 @@
         <w:pStyle w:val="Compact"/>
         <w:numPr>
           <w:ilvl w:val="0"/>
-          <w:numId w:val="1005"/>
+          <w:numId w:val="1007"/>
         </w:numPr>
       </w:pPr>
       <w:r>
@@ -2432,7 +2634,7 @@
         <w:pStyle w:val="Compact"/>
         <w:numPr>
           <w:ilvl w:val="0"/>
-          <w:numId w:val="1005"/>
+          <w:numId w:val="1007"/>
         </w:numPr>
       </w:pPr>
       <w:r>
@@ -2444,7 +2646,7 @@
         <w:pStyle w:val="Compact"/>
         <w:numPr>
           <w:ilvl w:val="0"/>
-          <w:numId w:val="1005"/>
+          <w:numId w:val="1007"/>
         </w:numPr>
       </w:pPr>
       <w:r>
@@ -2456,7 +2658,7 @@
         <w:pStyle w:val="Compact"/>
         <w:numPr>
           <w:ilvl w:val="0"/>
-          <w:numId w:val="1005"/>
+          <w:numId w:val="1007"/>
         </w:numPr>
       </w:pPr>
       <w:r>
@@ -2468,7 +2670,7 @@
         <w:pStyle w:val="Compact"/>
         <w:numPr>
           <w:ilvl w:val="0"/>
-          <w:numId w:val="1005"/>
+          <w:numId w:val="1007"/>
         </w:numPr>
       </w:pPr>
       <w:r>
@@ -2480,7 +2682,7 @@
         <w:pStyle w:val="Compact"/>
         <w:numPr>
           <w:ilvl w:val="0"/>
-          <w:numId w:val="1005"/>
+          <w:numId w:val="1007"/>
         </w:numPr>
       </w:pPr>
       <w:r>
@@ -2492,7 +2694,7 @@
         <w:pStyle w:val="Compact"/>
         <w:numPr>
           <w:ilvl w:val="0"/>
-          <w:numId w:val="1005"/>
+          <w:numId w:val="1007"/>
         </w:numPr>
       </w:pPr>
       <w:r>
@@ -2504,7 +2706,7 @@
         <w:pStyle w:val="Compact"/>
         <w:numPr>
           <w:ilvl w:val="0"/>
-          <w:numId w:val="1005"/>
+          <w:numId w:val="1007"/>
         </w:numPr>
       </w:pPr>
       <w:r>
@@ -2516,7 +2718,7 @@
         <w:pStyle w:val="Compact"/>
         <w:numPr>
           <w:ilvl w:val="0"/>
-          <w:numId w:val="1005"/>
+          <w:numId w:val="1007"/>
         </w:numPr>
       </w:pPr>
       <w:r>
@@ -2528,7 +2730,7 @@
         <w:pStyle w:val="Compact"/>
         <w:numPr>
           <w:ilvl w:val="0"/>
-          <w:numId w:val="1005"/>
+          <w:numId w:val="1007"/>
         </w:numPr>
       </w:pPr>
       <w:r>
@@ -2548,7 +2750,7 @@
         <w:pStyle w:val="Compact"/>
         <w:numPr>
           <w:ilvl w:val="0"/>
-          <w:numId w:val="1006"/>
+          <w:numId w:val="1008"/>
         </w:numPr>
       </w:pPr>
       <w:r>
@@ -2560,7 +2762,7 @@
         <w:pStyle w:val="Compact"/>
         <w:numPr>
           <w:ilvl w:val="0"/>
-          <w:numId w:val="1006"/>
+          <w:numId w:val="1008"/>
         </w:numPr>
       </w:pPr>
       <w:r>
@@ -2572,7 +2774,7 @@
         <w:pStyle w:val="Compact"/>
         <w:numPr>
           <w:ilvl w:val="0"/>
-          <w:numId w:val="1006"/>
+          <w:numId w:val="1008"/>
         </w:numPr>
       </w:pPr>
       <w:r>
@@ -2584,7 +2786,7 @@
         <w:pStyle w:val="Compact"/>
         <w:numPr>
           <w:ilvl w:val="0"/>
-          <w:numId w:val="1006"/>
+          <w:numId w:val="1008"/>
         </w:numPr>
       </w:pPr>
       <w:r>
@@ -2603,9 +2805,9 @@
         <w:t xml:space="preserve">“How you do anything is how you do everything.”</w:t>
       </w:r>
     </w:p>
-    <w:bookmarkEnd w:id="31"/>
     <w:bookmarkEnd w:id="32"/>
-    <w:bookmarkStart w:id="33" w:name="X762e0c562ca86535819c7c15adbe8dbe270c6b6"/>
+    <w:bookmarkEnd w:id="33"/>
+    <w:bookmarkStart w:id="34" w:name="X762e0c562ca86535819c7c15adbe8dbe270c6b6"/>
     <w:p>
       <w:pPr>
         <w:pStyle w:val="Heading1"/>
@@ -2639,7 +2841,7 @@
         <w:pStyle w:val="Compact"/>
         <w:numPr>
           <w:ilvl w:val="0"/>
-          <w:numId w:val="1007"/>
+          <w:numId w:val="1009"/>
         </w:numPr>
       </w:pPr>
       <w:r>
@@ -2661,7 +2863,7 @@
         <w:pStyle w:val="Compact"/>
         <w:numPr>
           <w:ilvl w:val="0"/>
-          <w:numId w:val="1007"/>
+          <w:numId w:val="1009"/>
         </w:numPr>
       </w:pPr>
       <w:r>
@@ -2683,7 +2885,7 @@
         <w:pStyle w:val="Compact"/>
         <w:numPr>
           <w:ilvl w:val="0"/>
-          <w:numId w:val="1007"/>
+          <w:numId w:val="1009"/>
         </w:numPr>
       </w:pPr>
       <w:r>
@@ -2705,7 +2907,7 @@
         <w:pStyle w:val="Compact"/>
         <w:numPr>
           <w:ilvl w:val="0"/>
-          <w:numId w:val="1007"/>
+          <w:numId w:val="1009"/>
         </w:numPr>
       </w:pPr>
       <w:r>
@@ -2727,7 +2929,7 @@
         <w:pStyle w:val="Compact"/>
         <w:numPr>
           <w:ilvl w:val="0"/>
-          <w:numId w:val="1007"/>
+          <w:numId w:val="1009"/>
         </w:numPr>
       </w:pPr>
       <w:r>
@@ -2749,7 +2951,7 @@
         <w:pStyle w:val="Compact"/>
         <w:numPr>
           <w:ilvl w:val="0"/>
-          <w:numId w:val="1007"/>
+          <w:numId w:val="1009"/>
         </w:numPr>
       </w:pPr>
       <w:r>
@@ -2791,7 +2993,7 @@
         <w:pStyle w:val="Compact"/>
         <w:numPr>
           <w:ilvl w:val="0"/>
-          <w:numId w:val="1008"/>
+          <w:numId w:val="1010"/>
         </w:numPr>
       </w:pPr>
       <w:r>
@@ -2813,7 +3015,7 @@
         <w:pStyle w:val="Compact"/>
         <w:numPr>
           <w:ilvl w:val="0"/>
-          <w:numId w:val="1008"/>
+          <w:numId w:val="1010"/>
         </w:numPr>
       </w:pPr>
       <w:r>
@@ -2835,7 +3037,7 @@
         <w:pStyle w:val="Compact"/>
         <w:numPr>
           <w:ilvl w:val="0"/>
-          <w:numId w:val="1008"/>
+          <w:numId w:val="1010"/>
         </w:numPr>
       </w:pPr>
       <w:r>
@@ -2857,7 +3059,7 @@
         <w:pStyle w:val="Compact"/>
         <w:numPr>
           <w:ilvl w:val="0"/>
-          <w:numId w:val="1008"/>
+          <w:numId w:val="1010"/>
         </w:numPr>
       </w:pPr>
       <w:r>
@@ -3017,8 +3219,8 @@
         </w:tc>
       </w:tr>
     </w:tbl>
-    <w:bookmarkEnd w:id="33"/>
-    <w:bookmarkStart w:id="40" w:name="how-will-i-be-graded-and-why"/>
+    <w:bookmarkEnd w:id="34"/>
+    <w:bookmarkStart w:id="41" w:name="how-will-i-be-graded-and-why"/>
     <w:p>
       <w:pPr>
         <w:pStyle w:val="Heading1"/>
@@ -3047,7 +3249,7 @@
         <w:t xml:space="preserve">These weights aren’t arbitrary. Lab Experiments carry the most weight because that’s where the real demonstration of your learning happens — applying what you know, not just recognizing it. Quizzes are the next-largest individual measure of your understanding. 3-2-1 Team Posts and OOL Discussions are lighter individually, but combined (30%) they carry as much weight as Labs. ALEKS Problem Sets support your learning but aren’t proof of understanding on their own, which is why they’re weighted below Labs and Quizzes. The Final TYC Project replaces a comprehensive exam because teaching a concept to someone else is a better test of whether you actually understand it than a timed exam is (e.g. “Learn one, do one, teach one.”)</w:t>
       </w:r>
     </w:p>
-    <w:bookmarkStart w:id="34" w:name="Xdd0719f115f2bfe56e3e892841df085ef5ba506"/>
+    <w:bookmarkStart w:id="35" w:name="Xdd0719f115f2bfe56e3e892841df085ef5ba506"/>
     <w:p>
       <w:pPr>
         <w:pStyle w:val="Heading2"/>
@@ -3136,7 +3338,7 @@
               <w:pStyle w:val="Compact"/>
             </w:pPr>
             <w:r>
-              <w:t xml:space="preserve">Weekly 3-2-1 Team Discussions — lecture Activities completed and uploaded, plus your engagement with your team</w:t>
+              <w:t xml:space="preserve">Weekly 3-2-1 Team Discussions — one post Thursday after an in-lab team huddle, two replies answering teammates’ questions, and lecture Activities completed and uploaded</w:t>
             </w:r>
           </w:p>
         </w:tc>
@@ -3335,8 +3537,8 @@
         <w:t xml:space="preserve">Falling below 65% in any single category, even with a passing overall grade, means you cannot pass.</w:t>
       </w:r>
     </w:p>
-    <w:bookmarkEnd w:id="34"/>
-    <w:bookmarkStart w:id="35" w:name="about-the-lab-requirement"/>
+    <w:bookmarkEnd w:id="35"/>
+    <w:bookmarkStart w:id="36" w:name="about-the-lab-requirement"/>
     <w:p>
       <w:pPr>
         <w:pStyle w:val="Heading2"/>
@@ -3358,7 +3560,7 @@
         <w:pStyle w:val="Compact"/>
         <w:numPr>
           <w:ilvl w:val="0"/>
-          <w:numId w:val="1009"/>
+          <w:numId w:val="1011"/>
         </w:numPr>
       </w:pPr>
       <w:r>
@@ -3370,7 +3572,7 @@
         <w:pStyle w:val="Compact"/>
         <w:numPr>
           <w:ilvl w:val="0"/>
-          <w:numId w:val="1009"/>
+          <w:numId w:val="1011"/>
         </w:numPr>
       </w:pPr>
       <w:r>
@@ -3382,7 +3584,7 @@
         <w:pStyle w:val="Compact"/>
         <w:numPr>
           <w:ilvl w:val="0"/>
-          <w:numId w:val="1009"/>
+          <w:numId w:val="1011"/>
         </w:numPr>
       </w:pPr>
       <w:r>
@@ -3394,15 +3596,15 @@
         <w:pStyle w:val="Compact"/>
         <w:numPr>
           <w:ilvl w:val="0"/>
-          <w:numId w:val="1009"/>
+          <w:numId w:val="1011"/>
         </w:numPr>
       </w:pPr>
       <w:r>
         <w:t xml:space="preserve">Missing three weeks of lab, or having two incomplete labs, means you cannot pass the course.</w:t>
       </w:r>
     </w:p>
-    <w:bookmarkEnd w:id="35"/>
-    <w:bookmarkStart w:id="36" w:name="grading-scale"/>
+    <w:bookmarkEnd w:id="36"/>
+    <w:bookmarkStart w:id="37" w:name="grading-scale"/>
     <w:p>
       <w:pPr>
         <w:pStyle w:val="Heading2"/>
@@ -3709,8 +3911,8 @@
         </w:tc>
       </w:tr>
     </w:tbl>
-    <w:bookmarkEnd w:id="36"/>
-    <w:bookmarkStart w:id="37" w:name="late-work"/>
+    <w:bookmarkEnd w:id="37"/>
+    <w:bookmarkStart w:id="38" w:name="late-work"/>
     <w:p>
       <w:pPr>
         <w:pStyle w:val="Heading2"/>
@@ -3732,7 +3934,7 @@
         <w:pStyle w:val="Compact"/>
         <w:numPr>
           <w:ilvl w:val="0"/>
-          <w:numId w:val="1010"/>
+          <w:numId w:val="1012"/>
         </w:numPr>
       </w:pPr>
       <w:r>
@@ -3744,7 +3946,7 @@
         <w:pStyle w:val="Compact"/>
         <w:numPr>
           <w:ilvl w:val="0"/>
-          <w:numId w:val="1010"/>
+          <w:numId w:val="1012"/>
         </w:numPr>
       </w:pPr>
       <w:r>
@@ -3756,7 +3958,7 @@
         <w:pStyle w:val="Compact"/>
         <w:numPr>
           <w:ilvl w:val="0"/>
-          <w:numId w:val="1010"/>
+          <w:numId w:val="1012"/>
         </w:numPr>
       </w:pPr>
       <w:r>
@@ -3768,15 +3970,15 @@
         <w:pStyle w:val="Compact"/>
         <w:numPr>
           <w:ilvl w:val="0"/>
-          <w:numId w:val="1010"/>
+          <w:numId w:val="1012"/>
         </w:numPr>
       </w:pPr>
       <w:r>
         <w:t xml:space="preserve">If something requiring a prolonged absence occurs, contact me via Canvas Inbox and let’s see what solutions are possible.</w:t>
       </w:r>
     </w:p>
-    <w:bookmarkEnd w:id="37"/>
-    <w:bookmarkStart w:id="38" w:name="feedback"/>
+    <w:bookmarkEnd w:id="38"/>
+    <w:bookmarkStart w:id="39" w:name="feedback"/>
     <w:p>
       <w:pPr>
         <w:pStyle w:val="Heading2"/>
@@ -3793,8 +3995,8 @@
         <w:t xml:space="preserve">Discussions and other work are graded within 48 hours of each due date.</w:t>
       </w:r>
     </w:p>
-    <w:bookmarkEnd w:id="38"/>
-    <w:bookmarkStart w:id="39" w:name="revision"/>
+    <w:bookmarkEnd w:id="39"/>
+    <w:bookmarkStart w:id="40" w:name="revision"/>
     <w:p>
       <w:pPr>
         <w:pStyle w:val="Heading2"/>
@@ -3811,9 +4013,9 @@
         <w:t xml:space="preserve">There is no separate revision or regrade policy at this time — the late-work window above functions as the built-in opportunity to catch up before work is scored.</w:t>
       </w:r>
     </w:p>
-    <w:bookmarkEnd w:id="39"/>
     <w:bookmarkEnd w:id="40"/>
-    <w:bookmarkStart w:id="72" w:name="Xc43a7a922298ad0f9db64bde08ef36f42168a56"/>
+    <w:bookmarkEnd w:id="41"/>
+    <w:bookmarkStart w:id="73" w:name="Xc43a7a922298ad0f9db64bde08ef36f42168a56"/>
     <w:p>
       <w:pPr>
         <w:pStyle w:val="Heading1"/>
@@ -3834,7 +4036,7 @@
         <w:t xml:space="preserve">TL;DR: Tech Hub for Canvas/software problems, Tutoring or Librarians for coursework help, Basic Needs Hub if life is making this term hard.</w:t>
       </w:r>
     </w:p>
-    <w:bookmarkStart w:id="46" w:name="technical-support"/>
+    <w:bookmarkStart w:id="47" w:name="technical-support"/>
     <w:p>
       <w:pPr>
         <w:pStyle w:val="Heading2"/>
@@ -3888,7 +4090,7 @@
             <w:pPr>
               <w:pStyle w:val="Compact"/>
             </w:pPr>
-            <w:hyperlink r:id="rId41">
+            <w:hyperlink r:id="rId42">
               <w:r>
                 <w:rPr>
                   <w:rStyle w:val="Hyperlink"/>
@@ -3912,7 +4114,7 @@
             <w:r>
               <w:t xml:space="preserve"> </w:t>
             </w:r>
-            <w:hyperlink r:id="rId42">
+            <w:hyperlink r:id="rId43">
               <w:r>
                 <w:rPr>
                   <w:rStyle w:val="Hyperlink"/>
@@ -3929,7 +4131,7 @@
             <w:r>
               <w:t xml:space="preserve"> </w:t>
             </w:r>
-            <w:hyperlink r:id="rId43">
+            <w:hyperlink r:id="rId44">
               <w:r>
                 <w:rPr>
                   <w:rStyle w:val="Hyperlink"/>
@@ -3986,7 +4188,7 @@
             <w:r>
               <w:t xml:space="preserve"> </w:t>
             </w:r>
-            <w:hyperlink r:id="rId44">
+            <w:hyperlink r:id="rId45">
               <w:r>
                 <w:rPr>
                   <w:rStyle w:val="Hyperlink"/>
@@ -4003,7 +4205,7 @@
             <w:r>
               <w:t xml:space="preserve"> </w:t>
             </w:r>
-            <w:hyperlink r:id="rId45">
+            <w:hyperlink r:id="rId46">
               <w:r>
                 <w:rPr>
                   <w:rStyle w:val="Hyperlink"/>
@@ -4043,8 +4245,8 @@
         </w:tc>
       </w:tr>
     </w:tbl>
-    <w:bookmarkEnd w:id="46"/>
-    <w:bookmarkStart w:id="53" w:name="academic-support"/>
+    <w:bookmarkEnd w:id="47"/>
+    <w:bookmarkStart w:id="54" w:name="academic-support"/>
     <w:p>
       <w:pPr>
         <w:pStyle w:val="Heading2"/>
@@ -4098,7 +4300,7 @@
             <w:pPr>
               <w:pStyle w:val="Compact"/>
             </w:pPr>
-            <w:hyperlink r:id="rId47">
+            <w:hyperlink r:id="rId48">
               <w:r>
                 <w:rPr>
                   <w:rStyle w:val="Hyperlink"/>
@@ -4129,7 +4331,7 @@
             <w:pPr>
               <w:pStyle w:val="Compact"/>
             </w:pPr>
-            <w:hyperlink r:id="rId48">
+            <w:hyperlink r:id="rId49">
               <w:r>
                 <w:rPr>
                   <w:rStyle w:val="Hyperlink"/>
@@ -4153,7 +4355,7 @@
             <w:r>
               <w:t xml:space="preserve"> </w:t>
             </w:r>
-            <w:hyperlink r:id="rId49">
+            <w:hyperlink r:id="rId50">
               <w:r>
                 <w:rPr>
                   <w:rStyle w:val="Hyperlink"/>
@@ -4170,7 +4372,7 @@
             <w:r>
               <w:t xml:space="preserve"> </w:t>
             </w:r>
-            <w:hyperlink r:id="rId50">
+            <w:hyperlink r:id="rId51">
               <w:r>
                 <w:rPr>
                   <w:rStyle w:val="Hyperlink"/>
@@ -4194,7 +4396,7 @@
             <w:pPr>
               <w:pStyle w:val="Compact"/>
             </w:pPr>
-            <w:hyperlink r:id="rId51">
+            <w:hyperlink r:id="rId52">
               <w:r>
                 <w:rPr>
                   <w:rStyle w:val="Hyperlink"/>
@@ -4218,7 +4420,7 @@
             <w:r>
               <w:t xml:space="preserve"> </w:t>
             </w:r>
-            <w:hyperlink r:id="rId52">
+            <w:hyperlink r:id="rId53">
               <w:r>
                 <w:rPr>
                   <w:rStyle w:val="Hyperlink"/>
@@ -4233,8 +4435,8 @@
         </w:tc>
       </w:tr>
     </w:tbl>
-    <w:bookmarkEnd w:id="53"/>
-    <w:bookmarkStart w:id="71" w:name="student-support"/>
+    <w:bookmarkEnd w:id="54"/>
+    <w:bookmarkStart w:id="72" w:name="student-support"/>
     <w:p>
       <w:pPr>
         <w:pStyle w:val="Heading2"/>
@@ -4288,7 +4490,7 @@
             <w:pPr>
               <w:pStyle w:val="Compact"/>
             </w:pPr>
-            <w:hyperlink r:id="rId54">
+            <w:hyperlink r:id="rId55">
               <w:r>
                 <w:rPr>
                   <w:rStyle w:val="Hyperlink"/>
@@ -4319,7 +4521,7 @@
             <w:pPr>
               <w:pStyle w:val="Compact"/>
             </w:pPr>
-            <w:hyperlink r:id="rId55">
+            <w:hyperlink r:id="rId56">
               <w:r>
                 <w:rPr>
                   <w:rStyle w:val="Hyperlink"/>
@@ -4343,7 +4545,7 @@
             <w:r>
               <w:t xml:space="preserve"> </w:t>
             </w:r>
-            <w:hyperlink r:id="rId56">
+            <w:hyperlink r:id="rId57">
               <w:r>
                 <w:rPr>
                   <w:rStyle w:val="Hyperlink"/>
@@ -4367,7 +4569,7 @@
             <w:pPr>
               <w:pStyle w:val="Compact"/>
             </w:pPr>
-            <w:hyperlink r:id="rId57">
+            <w:hyperlink r:id="rId58">
               <w:r>
                 <w:rPr>
                   <w:rStyle w:val="Hyperlink"/>
@@ -4388,7 +4590,7 @@
             <w:r>
               <w:t xml:space="preserve">Monthly pre-packaged food boxes. Contact Cath Busha, Dean of Student Engagement (</w:t>
             </w:r>
-            <w:hyperlink r:id="rId58">
+            <w:hyperlink r:id="rId59">
               <w:r>
                 <w:rPr>
                   <w:rStyle w:val="Hyperlink"/>
@@ -4409,7 +4611,7 @@
             <w:pPr>
               <w:pStyle w:val="Compact"/>
             </w:pPr>
-            <w:hyperlink r:id="rId59">
+            <w:hyperlink r:id="rId60">
               <w:r>
                 <w:rPr>
                   <w:rStyle w:val="Hyperlink"/>
@@ -4433,7 +4635,7 @@
             <w:r>
               <w:t xml:space="preserve"> </w:t>
             </w:r>
-            <w:hyperlink r:id="rId60">
+            <w:hyperlink r:id="rId61">
               <w:r>
                 <w:rPr>
                   <w:rStyle w:val="Hyperlink"/>
@@ -4454,7 +4656,7 @@
             <w:pPr>
               <w:pStyle w:val="Compact"/>
             </w:pPr>
-            <w:hyperlink r:id="rId61">
+            <w:hyperlink r:id="rId62">
               <w:r>
                 <w:rPr>
                   <w:rStyle w:val="Hyperlink"/>
@@ -4478,7 +4680,7 @@
             <w:r>
               <w:t xml:space="preserve"> </w:t>
             </w:r>
-            <w:hyperlink r:id="rId62">
+            <w:hyperlink r:id="rId63">
               <w:r>
                 <w:rPr>
                   <w:rStyle w:val="Hyperlink"/>
@@ -4499,7 +4701,7 @@
             <w:pPr>
               <w:pStyle w:val="Compact"/>
             </w:pPr>
-            <w:hyperlink r:id="rId63">
+            <w:hyperlink r:id="rId64">
               <w:r>
                 <w:rPr>
                   <w:rStyle w:val="Hyperlink"/>
@@ -4523,7 +4725,7 @@
             <w:r>
               <w:t xml:space="preserve"> </w:t>
             </w:r>
-            <w:hyperlink r:id="rId64">
+            <w:hyperlink r:id="rId65">
               <w:r>
                 <w:rPr>
                   <w:rStyle w:val="Hyperlink"/>
@@ -4541,7 +4743,7 @@
             <w:pPr>
               <w:pStyle w:val="Compact"/>
             </w:pPr>
-            <w:hyperlink r:id="rId65">
+            <w:hyperlink r:id="rId66">
               <w:r>
                 <w:rPr>
                   <w:rStyle w:val="Hyperlink"/>
@@ -4565,7 +4767,7 @@
             <w:r>
               <w:t xml:space="preserve"> </w:t>
             </w:r>
-            <w:hyperlink r:id="rId66">
+            <w:hyperlink r:id="rId67">
               <w:r>
                 <w:rPr>
                   <w:rStyle w:val="Hyperlink"/>
@@ -4582,7 +4784,7 @@
             <w:r>
               <w:t xml:space="preserve"> </w:t>
             </w:r>
-            <w:hyperlink r:id="rId67">
+            <w:hyperlink r:id="rId68">
               <w:r>
                 <w:rPr>
                   <w:rStyle w:val="Hyperlink"/>
@@ -4604,7 +4806,7 @@
       <w:r>
         <w:t xml:space="preserve"> </w:t>
       </w:r>
-      <w:hyperlink r:id="rId25">
+      <w:hyperlink r:id="rId26">
         <w:r>
           <w:rPr>
             <w:rStyle w:val="Hyperlink"/>
@@ -4618,7 +4820,7 @@
       <w:r>
         <w:t xml:space="preserve"> </w:t>
       </w:r>
-      <w:hyperlink r:id="rId68">
+      <w:hyperlink r:id="rId69">
         <w:r>
           <w:rPr>
             <w:rStyle w:val="Hyperlink"/>
@@ -4632,7 +4834,7 @@
       <w:r>
         <w:t xml:space="preserve"> </w:t>
       </w:r>
-      <w:hyperlink r:id="rId69">
+      <w:hyperlink r:id="rId70">
         <w:r>
           <w:rPr>
             <w:rStyle w:val="Hyperlink"/>
@@ -4646,7 +4848,7 @@
       <w:r>
         <w:t xml:space="preserve"> </w:t>
       </w:r>
-      <w:hyperlink r:id="rId70">
+      <w:hyperlink r:id="rId71">
         <w:r>
           <w:rPr>
             <w:rStyle w:val="Hyperlink"/>
@@ -4658,9 +4860,9 @@
         <w:t xml:space="preserve">.</w:t>
       </w:r>
     </w:p>
-    <w:bookmarkEnd w:id="71"/>
     <w:bookmarkEnd w:id="72"/>
-    <w:bookmarkStart w:id="73" w:name="how-should-i-get-started-in-class"/>
+    <w:bookmarkEnd w:id="73"/>
+    <w:bookmarkStart w:id="74" w:name="how-should-i-get-started-in-class"/>
     <w:p>
       <w:pPr>
         <w:pStyle w:val="Heading1"/>
@@ -4677,8 +4879,8 @@
         <w:t xml:space="preserve">See Your First Week, near the top of this syllabus, for the exact five things to do before anything else.</w:t>
       </w:r>
     </w:p>
-    <w:bookmarkEnd w:id="73"/>
-    <w:bookmarkStart w:id="75" w:name="appendix-official-college-policies"/>
+    <w:bookmarkEnd w:id="74"/>
+    <w:bookmarkStart w:id="76" w:name="appendix-official-college-policies"/>
     <w:p>
       <w:pPr>
         <w:pStyle w:val="Heading1"/>
@@ -4704,7 +4906,7 @@
         <w:pStyle w:val="Compact"/>
         <w:numPr>
           <w:ilvl w:val="0"/>
-          <w:numId w:val="1011"/>
+          <w:numId w:val="1013"/>
         </w:numPr>
       </w:pPr>
       <w:r>
@@ -4743,7 +4945,7 @@
         <w:pStyle w:val="Compact"/>
         <w:numPr>
           <w:ilvl w:val="0"/>
-          <w:numId w:val="1011"/>
+          <w:numId w:val="1013"/>
         </w:numPr>
       </w:pPr>
       <w:r>
@@ -4765,7 +4967,7 @@
         <w:pStyle w:val="Compact"/>
         <w:numPr>
           <w:ilvl w:val="0"/>
-          <w:numId w:val="1011"/>
+          <w:numId w:val="1013"/>
         </w:numPr>
       </w:pPr>
       <w:r>
@@ -4787,7 +4989,7 @@
         <w:pStyle w:val="Compact"/>
         <w:numPr>
           <w:ilvl w:val="0"/>
-          <w:numId w:val="1011"/>
+          <w:numId w:val="1013"/>
         </w:numPr>
       </w:pPr>
       <w:r>
@@ -4814,7 +5016,7 @@
       <w:r>
         <w:t xml:space="preserve"> </w:t>
       </w:r>
-      <w:hyperlink r:id="rId74">
+      <w:hyperlink r:id="rId75">
         <w:r>
           <w:rPr>
             <w:rStyle w:val="Hyperlink"/>
@@ -4826,7 +5028,7 @@
         <w:t xml:space="preserve">.</w:t>
       </w:r>
     </w:p>
-    <w:bookmarkEnd w:id="75"/>
+    <w:bookmarkEnd w:id="76"/>
     <w:sectPr>
       <w:footnotePr>
         <w:numRestart w:val="eachSect"/>
@@ -5159,7 +5361,34 @@
     </w:lvlOverride>
   </w:num>
   <w:num w:numId="1002">
-    <w:abstractNumId w:val="991"/>
+    <w:abstractNumId w:val="99411"/>
+    <w:lvlOverride w:ilvl="0">
+      <w:startOverride w:val="1"/>
+    </w:lvlOverride>
+    <w:lvlOverride w:ilvl="1">
+      <w:startOverride w:val="1"/>
+    </w:lvlOverride>
+    <w:lvlOverride w:ilvl="2">
+      <w:startOverride w:val="1"/>
+    </w:lvlOverride>
+    <w:lvlOverride w:ilvl="3">
+      <w:startOverride w:val="1"/>
+    </w:lvlOverride>
+    <w:lvlOverride w:ilvl="4">
+      <w:startOverride w:val="1"/>
+    </w:lvlOverride>
+    <w:lvlOverride w:ilvl="5">
+      <w:startOverride w:val="1"/>
+    </w:lvlOverride>
+    <w:lvlOverride w:ilvl="6">
+      <w:startOverride w:val="1"/>
+    </w:lvlOverride>
+    <w:lvlOverride w:ilvl="7">
+      <w:startOverride w:val="1"/>
+    </w:lvlOverride>
+    <w:lvlOverride w:ilvl="8">
+      <w:startOverride w:val="1"/>
+    </w:lvlOverride>
   </w:num>
   <w:num w:numId="1003">
     <w:abstractNumId w:val="991"/>
@@ -5186,6 +5415,12 @@
     <w:abstractNumId w:val="991"/>
   </w:num>
   <w:num w:numId="1011">
+    <w:abstractNumId w:val="991"/>
+  </w:num>
+  <w:num w:numId="1012">
+    <w:abstractNumId w:val="991"/>
+  </w:num>
+  <w:num w:numId="1013">
     <w:abstractNumId w:val="991"/>
   </w:num>
 </w:numbering>

</xml_diff>

<commit_message>
Grading scale: whole-number ranges and rounding note
Replaced the "X up to Y" percent ranges with inclusive whole-number
ranges (A 100-93, A- 92-90, ... D 72-60, F 59-0) and added a note that
final percentages are rounded to the nearest whole number. Cutoffs are
unchanged; the new format has no shared boundary values, so a score
like 87 can no longer read as both a B and a B+. Both courses.
Rebuilt PDFs, Word docs, and accessible Word docs.

Co-Authored-By: Claude Sonnet 5.5 <noreply@anthropic.com>
</commit_message>
<xml_diff>
--- a/downloads/CHEM121_Syllabus_Fall2026.docx
+++ b/downloads/CHEM121_Syllabus_Fall2026.docx
@@ -3618,7 +3618,7 @@
         <w:pStyle w:val="FirstParagraph"/>
       </w:pPr>
       <w:r>
-        <w:t xml:space="preserve">Note: Clark does not award C-, D+, or D- in this course — a C- does not transfer, so grading stops at a clean C, then D, then F.</w:t>
+        <w:t xml:space="preserve">Note: Clark does not award C-, D+, or D- in this course — a C- does not transfer, so grading stops at a clean C, then D, then F. Final percentages are rounded to the nearest whole number.</w:t>
       </w:r>
     </w:p>
     <w:tbl>
@@ -3714,7 +3714,7 @@
               <w:pStyle w:val="Compact"/>
             </w:pPr>
             <w:r>
-              <w:t xml:space="preserve">93 up to 100</w:t>
+              <w:t xml:space="preserve">100–93</w:t>
             </w:r>
           </w:p>
         </w:tc>
@@ -3736,7 +3736,7 @@
               <w:pStyle w:val="Compact"/>
             </w:pPr>
             <w:r>
-              <w:t xml:space="preserve">83 up to 87</w:t>
+              <w:t xml:space="preserve">86–83</w:t>
             </w:r>
           </w:p>
         </w:tc>
@@ -3758,7 +3758,7 @@
               <w:pStyle w:val="Compact"/>
             </w:pPr>
             <w:r>
-              <w:t xml:space="preserve">73 up to 77</w:t>
+              <w:t xml:space="preserve">76–73</w:t>
             </w:r>
           </w:p>
         </w:tc>
@@ -3782,7 +3782,7 @@
               <w:pStyle w:val="Compact"/>
             </w:pPr>
             <w:r>
-              <w:t xml:space="preserve">90 up to 93</w:t>
+              <w:t xml:space="preserve">92–90</w:t>
             </w:r>
           </w:p>
         </w:tc>
@@ -3804,7 +3804,7 @@
               <w:pStyle w:val="Compact"/>
             </w:pPr>
             <w:r>
-              <w:t xml:space="preserve">80 up to 83</w:t>
+              <w:t xml:space="preserve">82–80</w:t>
             </w:r>
           </w:p>
         </w:tc>
@@ -3826,7 +3826,7 @@
               <w:pStyle w:val="Compact"/>
             </w:pPr>
             <w:r>
-              <w:t xml:space="preserve">60 up to 73</w:t>
+              <w:t xml:space="preserve">72–60</w:t>
             </w:r>
           </w:p>
         </w:tc>
@@ -3850,7 +3850,7 @@
               <w:pStyle w:val="Compact"/>
             </w:pPr>
             <w:r>
-              <w:t xml:space="preserve">87 up to 90</w:t>
+              <w:t xml:space="preserve">89–87</w:t>
             </w:r>
           </w:p>
         </w:tc>
@@ -3872,7 +3872,7 @@
               <w:pStyle w:val="Compact"/>
             </w:pPr>
             <w:r>
-              <w:t xml:space="preserve">77 up to 80</w:t>
+              <w:t xml:space="preserve">79–77</w:t>
             </w:r>
           </w:p>
         </w:tc>
@@ -3894,7 +3894,7 @@
               <w:pStyle w:val="Compact"/>
             </w:pPr>
             <w:r>
-              <w:t xml:space="preserve">0 up to 60</w:t>
+              <w:t xml:space="preserve">59–0</w:t>
             </w:r>
           </w:p>
         </w:tc>

</xml_diff>